<commit_message>
Add Shoptalk loyalty and TikTok Shop transcripts; complete fulfillment panel
Co-Authored-By: Claude Opus 5.5 <noreply@anthropic.com>
Claude-Session: https://claude.ai/code/session_01KmRp2ESunoKfn1WQuEFGHQ
</commit_message>
<xml_diff>
--- a/transcripts/Shoptalk_Session_Notes.docx
+++ b/transcripts/Shoptalk_Session_Notes.docx
@@ -348,7 +348,302 @@
                 <w:sz w:val="20"/>
                 <w:szCs w:val="20"/>
               </w:rPr>
-              <w:t xml:space="preserve">Unmatched: Delivery promise and fulfillment network panel</w:t>
+              <w:t xml:space="preserve">Unmatched: Fulfillment and delivery: exceeding customer expectations (panel)</w:t>
+            </w:r>
+          </w:p>
+        </w:tc>
+        <w:tc>
+          <w:tcPr>
+            <w:tcW w:type="dxa" w:w="1400"/>
+            <w:tcBorders>
+              <w:top w:val="single" w:color="BFBFBF" w:sz="4"/>
+              <w:left w:val="single" w:color="BFBFBF" w:sz="4"/>
+              <w:bottom w:val="single" w:color="BFBFBF" w:sz="4"/>
+              <w:right w:val="single" w:color="BFBFBF" w:sz="4"/>
+            </w:tcBorders>
+            <w:tcMar>
+              <w:top w:type="dxa" w:w="80"/>
+              <w:left w:type="dxa" w:w="120"/>
+              <w:bottom w:type="dxa" w:w="80"/>
+              <w:right w:type="dxa" w:w="120"/>
+            </w:tcMar>
+          </w:tcPr>
+          <w:p>
+            <w:r>
+              <w:rPr>
+                <w:b w:val="false"/>
+                <w:bCs w:val="false"/>
+                <w:sz w:val="20"/>
+                <w:szCs w:val="20"/>
+              </w:rPr>
+              <w:t xml:space="preserve">Transcript; session not identified</w:t>
+            </w:r>
+          </w:p>
+        </w:tc>
+      </w:tr>
+      <w:tr>
+        <w:trPr>
+          <w:cantSplit/>
+        </w:trPr>
+        <w:tc>
+          <w:tcPr>
+            <w:tcW w:type="dxa" w:w="1500"/>
+            <w:tcBorders>
+              <w:top w:val="single" w:color="BFBFBF" w:sz="4"/>
+              <w:left w:val="single" w:color="BFBFBF" w:sz="4"/>
+              <w:bottom w:val="single" w:color="BFBFBF" w:sz="4"/>
+              <w:right w:val="single" w:color="BFBFBF" w:sz="4"/>
+            </w:tcBorders>
+            <w:shd w:fill="F2F2F2" w:color="auto" w:val="clear"/>
+            <w:tcMar>
+              <w:top w:type="dxa" w:w="80"/>
+              <w:left w:type="dxa" w:w="120"/>
+              <w:bottom w:type="dxa" w:w="80"/>
+              <w:right w:type="dxa" w:w="120"/>
+            </w:tcMar>
+          </w:tcPr>
+          <w:p>
+            <w:r>
+              <w:rPr>
+                <w:b w:val="false"/>
+                <w:bCs w:val="false"/>
+                <w:sz w:val="20"/>
+                <w:szCs w:val="20"/>
+              </w:rPr>
+              <w:t xml:space="preserve">TBC</w:t>
+            </w:r>
+          </w:p>
+        </w:tc>
+        <w:tc>
+          <w:tcPr>
+            <w:tcW w:type="dxa" w:w="1900"/>
+            <w:tcBorders>
+              <w:top w:val="single" w:color="BFBFBF" w:sz="4"/>
+              <w:left w:val="single" w:color="BFBFBF" w:sz="4"/>
+              <w:bottom w:val="single" w:color="BFBFBF" w:sz="4"/>
+              <w:right w:val="single" w:color="BFBFBF" w:sz="4"/>
+            </w:tcBorders>
+            <w:shd w:fill="F2F2F2" w:color="auto" w:val="clear"/>
+            <w:tcMar>
+              <w:top w:type="dxa" w:w="80"/>
+              <w:left w:type="dxa" w:w="120"/>
+              <w:bottom w:type="dxa" w:w="80"/>
+              <w:right w:type="dxa" w:w="120"/>
+            </w:tcMar>
+          </w:tcPr>
+          <w:p>
+            <w:r>
+              <w:rPr>
+                <w:b w:val="false"/>
+                <w:bCs w:val="false"/>
+                <w:sz w:val="20"/>
+                <w:szCs w:val="20"/>
+              </w:rPr>
+              <w:t xml:space="preserve">TBC</w:t>
+            </w:r>
+          </w:p>
+        </w:tc>
+        <w:tc>
+          <w:tcPr>
+            <w:tcW w:type="dxa" w:w="1500"/>
+            <w:tcBorders>
+              <w:top w:val="single" w:color="BFBFBF" w:sz="4"/>
+              <w:left w:val="single" w:color="BFBFBF" w:sz="4"/>
+              <w:bottom w:val="single" w:color="BFBFBF" w:sz="4"/>
+              <w:right w:val="single" w:color="BFBFBF" w:sz="4"/>
+            </w:tcBorders>
+            <w:shd w:fill="F2F2F2" w:color="auto" w:val="clear"/>
+            <w:tcMar>
+              <w:top w:type="dxa" w:w="80"/>
+              <w:left w:type="dxa" w:w="120"/>
+              <w:bottom w:type="dxa" w:w="80"/>
+              <w:right w:type="dxa" w:w="120"/>
+            </w:tcMar>
+          </w:tcPr>
+          <w:p>
+            <w:r>
+              <w:rPr>
+                <w:b w:val="false"/>
+                <w:bCs w:val="false"/>
+                <w:sz w:val="20"/>
+                <w:szCs w:val="20"/>
+              </w:rPr>
+              <w:t xml:space="preserve">TBC</w:t>
+            </w:r>
+          </w:p>
+        </w:tc>
+        <w:tc>
+          <w:tcPr>
+            <w:tcW w:type="dxa" w:w="3060"/>
+            <w:tcBorders>
+              <w:top w:val="single" w:color="BFBFBF" w:sz="4"/>
+              <w:left w:val="single" w:color="BFBFBF" w:sz="4"/>
+              <w:bottom w:val="single" w:color="BFBFBF" w:sz="4"/>
+              <w:right w:val="single" w:color="BFBFBF" w:sz="4"/>
+            </w:tcBorders>
+            <w:shd w:fill="F2F2F2" w:color="auto" w:val="clear"/>
+            <w:tcMar>
+              <w:top w:type="dxa" w:w="80"/>
+              <w:left w:type="dxa" w:w="120"/>
+              <w:bottom w:type="dxa" w:w="80"/>
+              <w:right w:type="dxa" w:w="120"/>
+            </w:tcMar>
+          </w:tcPr>
+          <w:p>
+            <w:r>
+              <w:rPr>
+                <w:b w:val="false"/>
+                <w:bCs w:val="false"/>
+                <w:sz w:val="20"/>
+                <w:szCs w:val="20"/>
+              </w:rPr>
+              <w:t xml:space="preserve">Unmatched: Loyalty and membership panel</w:t>
+            </w:r>
+          </w:p>
+        </w:tc>
+        <w:tc>
+          <w:tcPr>
+            <w:tcW w:type="dxa" w:w="1400"/>
+            <w:tcBorders>
+              <w:top w:val="single" w:color="BFBFBF" w:sz="4"/>
+              <w:left w:val="single" w:color="BFBFBF" w:sz="4"/>
+              <w:bottom w:val="single" w:color="BFBFBF" w:sz="4"/>
+              <w:right w:val="single" w:color="BFBFBF" w:sz="4"/>
+            </w:tcBorders>
+            <w:shd w:fill="F2F2F2" w:color="auto" w:val="clear"/>
+            <w:tcMar>
+              <w:top w:type="dxa" w:w="80"/>
+              <w:left w:type="dxa" w:w="120"/>
+              <w:bottom w:type="dxa" w:w="80"/>
+              <w:right w:type="dxa" w:w="120"/>
+            </w:tcMar>
+          </w:tcPr>
+          <w:p>
+            <w:r>
+              <w:rPr>
+                <w:b w:val="false"/>
+                <w:bCs w:val="false"/>
+                <w:sz w:val="20"/>
+                <w:szCs w:val="20"/>
+              </w:rPr>
+              <w:t xml:space="preserve">Transcript; session not identified</w:t>
+            </w:r>
+          </w:p>
+        </w:tc>
+      </w:tr>
+      <w:tr>
+        <w:trPr>
+          <w:cantSplit/>
+        </w:trPr>
+        <w:tc>
+          <w:tcPr>
+            <w:tcW w:type="dxa" w:w="1500"/>
+            <w:tcBorders>
+              <w:top w:val="single" w:color="BFBFBF" w:sz="4"/>
+              <w:left w:val="single" w:color="BFBFBF" w:sz="4"/>
+              <w:bottom w:val="single" w:color="BFBFBF" w:sz="4"/>
+              <w:right w:val="single" w:color="BFBFBF" w:sz="4"/>
+            </w:tcBorders>
+            <w:tcMar>
+              <w:top w:type="dxa" w:w="80"/>
+              <w:left w:type="dxa" w:w="120"/>
+              <w:bottom w:type="dxa" w:w="80"/>
+              <w:right w:type="dxa" w:w="120"/>
+            </w:tcMar>
+          </w:tcPr>
+          <w:p>
+            <w:r>
+              <w:rPr>
+                <w:b w:val="false"/>
+                <w:bCs w:val="false"/>
+                <w:sz w:val="20"/>
+                <w:szCs w:val="20"/>
+              </w:rPr>
+              <w:t xml:space="preserve">TBC</w:t>
+            </w:r>
+          </w:p>
+        </w:tc>
+        <w:tc>
+          <w:tcPr>
+            <w:tcW w:type="dxa" w:w="1900"/>
+            <w:tcBorders>
+              <w:top w:val="single" w:color="BFBFBF" w:sz="4"/>
+              <w:left w:val="single" w:color="BFBFBF" w:sz="4"/>
+              <w:bottom w:val="single" w:color="BFBFBF" w:sz="4"/>
+              <w:right w:val="single" w:color="BFBFBF" w:sz="4"/>
+            </w:tcBorders>
+            <w:tcMar>
+              <w:top w:type="dxa" w:w="80"/>
+              <w:left w:type="dxa" w:w="120"/>
+              <w:bottom w:type="dxa" w:w="80"/>
+              <w:right w:type="dxa" w:w="120"/>
+            </w:tcMar>
+          </w:tcPr>
+          <w:p>
+            <w:r>
+              <w:rPr>
+                <w:b w:val="false"/>
+                <w:bCs w:val="false"/>
+                <w:sz w:val="20"/>
+                <w:szCs w:val="20"/>
+              </w:rPr>
+              <w:t xml:space="preserve">TBC</w:t>
+            </w:r>
+          </w:p>
+        </w:tc>
+        <w:tc>
+          <w:tcPr>
+            <w:tcW w:type="dxa" w:w="1500"/>
+            <w:tcBorders>
+              <w:top w:val="single" w:color="BFBFBF" w:sz="4"/>
+              <w:left w:val="single" w:color="BFBFBF" w:sz="4"/>
+              <w:bottom w:val="single" w:color="BFBFBF" w:sz="4"/>
+              <w:right w:val="single" w:color="BFBFBF" w:sz="4"/>
+            </w:tcBorders>
+            <w:tcMar>
+              <w:top w:type="dxa" w:w="80"/>
+              <w:left w:type="dxa" w:w="120"/>
+              <w:bottom w:type="dxa" w:w="80"/>
+              <w:right w:type="dxa" w:w="120"/>
+            </w:tcMar>
+          </w:tcPr>
+          <w:p>
+            <w:r>
+              <w:rPr>
+                <w:b w:val="false"/>
+                <w:bCs w:val="false"/>
+                <w:sz w:val="20"/>
+                <w:szCs w:val="20"/>
+              </w:rPr>
+              <w:t xml:space="preserve">TBC</w:t>
+            </w:r>
+          </w:p>
+        </w:tc>
+        <w:tc>
+          <w:tcPr>
+            <w:tcW w:type="dxa" w:w="3060"/>
+            <w:tcBorders>
+              <w:top w:val="single" w:color="BFBFBF" w:sz="4"/>
+              <w:left w:val="single" w:color="BFBFBF" w:sz="4"/>
+              <w:bottom w:val="single" w:color="BFBFBF" w:sz="4"/>
+              <w:right w:val="single" w:color="BFBFBF" w:sz="4"/>
+            </w:tcBorders>
+            <w:tcMar>
+              <w:top w:type="dxa" w:w="80"/>
+              <w:left w:type="dxa" w:w="120"/>
+              <w:bottom w:type="dxa" w:w="80"/>
+              <w:right w:type="dxa" w:w="120"/>
+            </w:tcMar>
+          </w:tcPr>
+          <w:p>
+            <w:r>
+              <w:rPr>
+                <w:b w:val="false"/>
+                <w:bCs w:val="false"/>
+                <w:sz w:val="20"/>
+                <w:szCs w:val="20"/>
+              </w:rPr>
+              <w:t xml:space="preserve">Unmatched: TikTok Shop session</w:t>
             </w:r>
           </w:p>
         </w:tc>
@@ -427,7 +722,7 @@
         <w:pStyle w:val="Heading1"/>
       </w:pPr>
       <w:r>
-        <w:t xml:space="preserve">Unmatched: Delivery promise and fulfillment network panel</w:t>
+        <w:t xml:space="preserve">Unmatched: Fulfillment and delivery: exceeding customer expectations (panel)</w:t>
       </w:r>
     </w:p>
     <w:tbl>
@@ -815,7 +1110,7 @@
                 <w:sz w:val="20"/>
                 <w:szCs w:val="20"/>
               </w:rPr>
-              <w:t xml:space="preserve">Not yet matched to an agenda session. Panel with a DoorDash executive (mentions launching drone delivery with Lowe's in Charlotte) and the CEO of a direct-to-consumer mattress brand owned by a manufacturer, plus a moderator.</w:t>
+              <w:t xml:space="preserve">Not yet matched to an agenda session. Moderator is a co-founder/CEO of a fulfilment company (name unclear in the recording); guests introduced as Thomas Stevens, General Manager of Retail at DoorDash, and Dylan (surname unclear) of a 180-year-old bedding brand transcribed as “Mansutan”.</w:t>
             </w:r>
           </w:p>
         </w:tc>
@@ -860,7 +1155,7 @@
         <w:spacing w:after="60"/>
       </w:pPr>
       <w:r>
-        <w:t xml:space="preserve">Retailers already stock the best SKUs for their market, so DoorDash puts items in its own fulfilment nodes mainly for late-night demand or fast movers that stores struggle to keep in stock.</w:t>
+        <w:t xml:space="preserve">Moderator's framing: design beats spend; treat inventory placement as a strategy; close the gap between the delivery promise made and what is actually delivered.</w:t>
       </w:r>
     </w:p>
     <w:p>
@@ -873,7 +1168,7 @@
         <w:spacing w:after="60"/>
       </w:pPr>
       <w:r>
-        <w:t xml:space="preserve">The mattress brand plans capacity from 30-day trailing order concentration and saturates target markets (e.g. Phoenix); its oversized boxes make shipping costly, so pricing is built around that.</w:t>
+        <w:t xml:space="preserve">Retailers already stock the best SKUs for their market, so DoorDash puts items in its own fulfilment nodes mainly for late-night demand or fast movers that stores struggle to keep in stock.</w:t>
       </w:r>
     </w:p>
     <w:p>
@@ -886,7 +1181,7 @@
         <w:spacing w:after="60"/>
       </w:pPr>
       <w:r>
-        <w:t xml:space="preserve">Automate only once a process is proven and tied to a real customer problem; go high-touch first to learn where the pain is. DoorDash has launched drone delivery with Lowe's in Charlotte.</w:t>
+        <w:t xml:space="preserve">The bedding brand plans capacity from 30-day trailing order concentration and saturates target markets (e.g. Phoenix); its oversized boxes make shipping costly, so pricing is built around that.</w:t>
       </w:r>
     </w:p>
     <w:p>
@@ -899,7 +1194,7 @@
         <w:spacing w:after="60"/>
       </w:pPr>
       <w:r>
-        <w:t xml:space="preserve">Align marketing promises with actual operations: DoorDash sets advertised delivery times each quarter from real delivery data; the mattress brand uses NPS as its shared north star.</w:t>
+        <w:t xml:space="preserve">Automate only once a process is proven and tied to a real customer problem; go high-touch first to learn where the pain is. DoorDash has launched drone delivery with Lowe's in Charlotte.</w:t>
       </w:r>
     </w:p>
     <w:p>
@@ -912,6 +1207,19 @@
         <w:spacing w:after="60"/>
       </w:pPr>
       <w:r>
+        <w:t xml:space="preserve">Align marketing promises with actual operations: DoorDash sets advertised delivery times each quarter from real delivery data; the bedding brand uses NPS as its shared north star.</w:t>
+      </w:r>
+    </w:p>
+    <w:p>
+      <w:pPr>
+        <w:pStyle w:val="ListParagraph"/>
+        <w:numPr>
+          <w:ilvl w:val="0"/>
+          <w:numId w:val="2"/>
+        </w:numPr>
+        <w:spacing w:after="60"/>
+      </w:pPr>
+      <w:r>
         <w:t xml:space="preserve">Advice: stop copying competitors, and stop communicating with customers the way you used to.</w:t>
       </w:r>
     </w:p>
@@ -950,31 +1258,177 @@
           <w:sz w:val="18"/>
           <w:szCs w:val="18"/>
         </w:rPr>
-        <w:t xml:space="preserve">The recording starts partway through the session. Song lyrics picked up after the session ended were removed.</w:t>
-      </w:r>
-    </w:p>
-    <w:p>
-      <w:pPr>
-        <w:spacing w:after="140" w:line="300"/>
-      </w:pPr>
-      <w:r>
-        <w:rPr>
-          <w:sz w:val="21"/>
-          <w:szCs w:val="21"/>
-        </w:rPr>
-        <w:t xml:space="preserve">The dinner's location, right? Well, you have larger optionality within the retailer option who, and then you have the ones that sit inside your network. How do you make that choice of that density of optionality? Like if you were to give people advice, be like, how do you look at your students in the end go, well, this is what needs to go closer on a hire to put pepper output. It's it's a really interesting question and then one, we actually go back and forth on a lot internally. And one of the Ford, 4 very 4 deployed, the phone nodes. You need a lot of firm books. And one of the things that we found is that retailers are really, really good at already stocking the very best excuse for their market. If I walk into PetSmart today, they already are stalking before you come back with Korea.</w:t>
-      </w:r>
-    </w:p>
-    <w:p>
-      <w:pPr>
-        <w:spacing w:after="140" w:line="300"/>
-      </w:pPr>
-      <w:r>
-        <w:rPr>
-          <w:sz w:val="21"/>
-          <w:szCs w:val="21"/>
-        </w:rPr>
-        <w:t xml:space="preserve">That is there, that is ready to go. And they are making sure that that stays on the shelf as much as possible. And so for us, as we think about, hey, how do we partner with retailers and help them fulfill these SKUs in? The questions are, one, we're seeing a lot of late night command for that type of skill, where this might be beyond your store owners. So that's one reason why we might choose to stock that in store. And then the other is is it a skew that you actually do have trouble keeping stock because it's moving so quickly or because you have so much intradate throughput? And that's a place where cash market performance services is also really helpful. That's fantastic. It's a, I don't think there is a direct answer to this at this point, but it's an answer that we all could probably spend our entire careers exploring to try and find out that right optimization path.</w:t>
+        <w:t xml:space="preserve">Assembled from two pastes: the opening of the session, then a gap, then the remainder. Song lyrics picked up after the session ended were removed.</w:t>
+      </w:r>
+    </w:p>
+    <w:p>
+      <w:pPr>
+        <w:spacing w:after="140" w:line="300"/>
+      </w:pPr>
+      <w:r>
+        <w:rPr>
+          <w:sz w:val="21"/>
+          <w:szCs w:val="21"/>
+        </w:rPr>
+        <w:t xml:space="preserve">So far for me, so we are doing fulfillment and delivery, exceeding customer expectations. Well, First of all, let me introduce myself, and then I have the Charia, one of the co-founders, CEO, I perform in IQ, simply put, everything was split. So once you say orders placed, everything that needs to happen from operations, technology to execution is where you kind of play, but this is not about me. I have 2 phenomenal guests for this conversation. I'm really looking forward to it. I'll be doing a shorter production for them because they come on the stage shortly. What we are going to be doing today is I want to ask a different question rather than, you know, watch something. Every 3 customers to expect something of operating models, there is designed to do. And the reason why I asked that is I've been doing this for almost 20 years, working in warehousing, operation, supply chain, work design, et cetera.</w:t>
+      </w:r>
+    </w:p>
+    <w:p>
+      <w:pPr>
+        <w:spacing w:after="140" w:line="300"/>
+      </w:pPr>
+      <w:r>
+        <w:rPr>
+          <w:sz w:val="21"/>
+          <w:szCs w:val="21"/>
+        </w:rPr>
+        <w:t xml:space="preserve">And I've seen the scaling that has ended up happening with a standard delivery promise was a pile day. Five day was okay. Even 10 days were okay. The customer expectation moved, because of Amazon, let's call the lab. And I'll tell you, this is the exact same question that we have been asking for at least the last 10 years. It almost feels like every single show, this is a question, how do you exceed customer expectation? And I think we are kind of settled and this is kind of a discovery of what we are doing here. So we are going to be focusing on operational design principles, right? So what happens when somebody raises the bar, does everybody else has to raise that bar to that false expectation? And that is a fundamental question that we need to answer as well. And I think with the guests that we have today, those are the answers that we are going to be seeking.</w:t>
+      </w:r>
+    </w:p>
+    <w:p>
+      <w:pPr>
+        <w:spacing w:after="140" w:line="300"/>
+      </w:pPr>
+      <w:r>
+        <w:rPr>
+          <w:sz w:val="21"/>
+          <w:szCs w:val="21"/>
+        </w:rPr>
+        <w:t xml:space="preserve">The next questions around network optimization. Well, if you aren't designed to do quick commerce, maybe you aren't designed to do quick commerce in that network, more optimization sounds pretty basic. How do you design that? What's that hostile delivery per unit, a calculation from a network standpoint, how do you take that into consideration? And then the last one, the marketing off alignment, one of the biggest challenges that I've seen in my life is I've spent majority of the time inside the warehouses, and what ends up happening is we don't even know, and there is a new delivery mode or a new customer expectation that's been promised that the operations now needs to execute them. And how do you get that alignment between operations and the marketing option? When I say operations, I usually mean logistics operation, that's a question. So those are the areas that we are touching and what's interesting about this session is we have 2 really distinct industries.</w:t>
+      </w:r>
+    </w:p>
+    <w:p>
+      <w:pPr>
+        <w:spacing w:after="140" w:line="300"/>
+      </w:pPr>
+      <w:r>
+        <w:rPr>
+          <w:sz w:val="21"/>
+          <w:szCs w:val="21"/>
+        </w:rPr>
+        <w:t xml:space="preserve">One is on demand, retail marketplace and scale. So we have DoorDash here talking about, you know, that quick commerce, something that I need, you know, foundational question I asked previously was like, does anyone require a comforter in 17 minutes? Right? So you have that as a spacist. Then you have the other side of the equation, which is a hometext island wedding. And how do you go about scaling an industry of that nature from a customer education? What is that? And we are going to be discovering that as we go through. So what we'll be validating today is most retailers are trying to solve a customer experience problem by increasing logistics. That's what it seems like. And it's an optimization game as well at the same time. So let's dig into some of this question and what I would like to do. is make sure that these are the 3 key takeaways that you guys walk away from.</w:t>
+      </w:r>
+    </w:p>
+    <w:p>
+      <w:pPr>
+        <w:spacing w:after="140" w:line="300"/>
+      </w:pPr>
+      <w:r>
+        <w:rPr>
+          <w:sz w:val="21"/>
+          <w:szCs w:val="21"/>
+        </w:rPr>
+        <w:t xml:space="preserve">At the end of this 36 minutes that are left is the design beats the spin. And so let's make sure that the pix was labeled logistics budget. It's the design itself. And so how do you actually design for where you are going? Treat placement was a strategy, not a warehouse, by warehouse, default, and, you know, it could be a warehouse or it could be a node, it would be wherever your inventory is coming from. could be a partner. and close the promise gap. And I am big on promise, promise that has to be integrated both horizontally and vertically. When you actually make that promise, how are you measuring promise? What was the commitment and how it actually delivered on that particular promise? As a registician, that is a hyperfocus of ours, would love to kind of dig into that. So I would like to introduce 2 guests that will help introduce Thomas with DoorDash and Dylan Piglow with Mansutan.</w:t>
+      </w:r>
+    </w:p>
+    <w:p>
+      <w:pPr>
+        <w:spacing w:after="140" w:line="300"/>
+      </w:pPr>
+      <w:r>
+        <w:rPr>
+          <w:sz w:val="21"/>
+          <w:szCs w:val="21"/>
+        </w:rPr>
+        <w:t xml:space="preserve">Well, welcome, nice. Thanks for having us. Thank you, thank you. Well, how about this? Let's start with their own introductions in their own words, because I can tell you their backgrounds are fantastic. I was having a, you know, pre-meeting chat with them, and, you know, I think I could not do just this song, and I let Thomas, if you want to start with just a little bit on your background, the very experience that you have. Absolutely. Thanks for having me on. Thomas Stevens, term manager of retail at DoorDash. Uh, and the DoorDash since 2016, uh, launching markets originally, including launching our 1st markets outside North America, to Australia and to Japan. Um, but I confidently say that being a retail business is, has been most contentary. Yeah, that's some serious feeling on the DoorDash side. You've been there for a very long time and seen pretty much the entire Rotok this industry.</w:t>
+      </w:r>
+    </w:p>
+    <w:p>
+      <w:pPr>
+        <w:spacing w:after="140" w:line="300"/>
+      </w:pPr>
+      <w:r>
+        <w:rPr>
+          <w:sz w:val="21"/>
+          <w:szCs w:val="21"/>
+        </w:rPr>
+        <w:t xml:space="preserve">It's been an incredible journey and in just in the last 2 years, seeing the way our retail marketplace and both the number of retailers, that have designed it, this was the right thing for them, as well as the number of customers who, where this has become your real part of their, their everyday habit, which has been incredible. Amazing. The other one which you're going to do, I'm still, it was the year one set, started my career in an e-commerce operations position at a little company called Venumos. So I've grown up in e-commerce. Since then, spent my career trying to build scalable foundations for the fast growing direct consumer, where I'm super happy to be with you guys. Fantastic. How about let's dive right into it. Thomas, 1st question for you, just a dialogue of discussion. You know, when that near instant delivery starts becoming table stakes, and it doesn't matter the segment he industries, but it starts becoming, I know, a table steak.</w:t>
+      </w:r>
+    </w:p>
+    <w:p>
+      <w:pPr>
+        <w:spacing w:after="140" w:line="300"/>
+      </w:pPr>
+      <w:r>
+        <w:rPr>
+          <w:sz w:val="21"/>
+          <w:szCs w:val="21"/>
+        </w:rPr>
+        <w:t xml:space="preserve">What's left to differentiate a new sense of the last 2 years because if you would have asked me 2 years ago, I'm like, we are done, right? Like, this is the fastest we needed to be. How do you kind of push that boundary? I think one of the one of the real challenges with being really, really fast is the reliability in the operations, get all that more intense, right? And, you know, this is so well from a hilarious world as well. But in the store world, You know, there's customers going through the store. There's a lot happening. you know, things have been moved on off the shelf. It's a very different environment. Right? Take a dash for walking down Home Depot, for example. There's 50,000 items in a Home Depot. There are 100,000 square feet. There are 40 aisles at least to navigate. And so one of the investments that we've made is when a dasher walks in, we equip them with the information by partnering Home Depot, here's exactly where to go.</w:t>
+      </w:r>
+    </w:p>
+    <w:p>
+      <w:pPr>
+        <w:spacing w:after="140" w:line="300"/>
+      </w:pPr>
+      <w:r>
+        <w:rPr>
+          <w:sz w:val="21"/>
+          <w:szCs w:val="21"/>
+        </w:rPr>
+        <w:t xml:space="preserve">Go up the escalator, take a right, walk down this aisle, and find a 6 pack of flight bulbs. that the customer ordered. Dashers love it because they can end it out store quickly. Customers love it because they actually get the item they ordered. you know, despite all the chaos of a store in the in-store environment, an emergence loan as well because, hey, they get to focus on customers in store. And then the other part that's really, really important and differentiate on is when a customer's getting something, wants something fast, usually there's a really intense need. And you have to lower the consequences for forgetting that knee wrong so that the customer can just solve their problem in the no time. And that's one of the reasons why we've invested a lot of returns as well. And making a seamless returns experience, then as soon as I get my order, I can, I'll give you actually an example from the other weekend.</w:t>
+      </w:r>
+    </w:p>
+    <w:p>
+      <w:pPr>
+        <w:spacing w:after="140" w:line="300"/>
+      </w:pPr>
+      <w:r>
+        <w:rPr>
+          <w:sz w:val="21"/>
+          <w:szCs w:val="21"/>
+        </w:rPr>
+        <w:t xml:space="preserve">I went to a wedding. It was Western theme on Friday night. I didn't go a Western Church. I was able to go to Naira public, order an L and an Excel as somebody who's constantly between sizes and just send back the one I didn't order. And just like being able to solve my problem, without worrying about the consequences, is just one more way to differentiate. In the balance between speed and reliability, because speed does bring its challenges on the reliability, and specifically with your business, where there is, you are depending on the nationals. They are doing their best. But how do you kind of measure that? Is there a way to kind of manage the, how do you keep the speed while ensuring? So your example of getting the large and extra large, as an example, a medium word. What do you do when one of them is not available?</w:t>
+      </w:r>
+    </w:p>
+    <w:p>
+      <w:pPr>
+        <w:spacing w:after="140" w:line="300"/>
+      </w:pPr>
+      <w:r>
+        <w:rPr>
+          <w:sz w:val="21"/>
+          <w:szCs w:val="21"/>
+        </w:rPr>
+        <w:t xml:space="preserve">Because that stockout condition challenges that actually does occur. Totally. And this is where it comes down to not only do you need to set the dasher up for as much success as possible for finding that exact item. And that's something that we measure, we call it, original item received. It's a number we're looking at every single day. But the other really important job is understanding what is the customer's actual intent of this delivery? And for example, I needed athletic shorts for a PT appointment. And I've got a 3 PM appointment, but I get those at 305. They're totally worthless. At the end of the day, I don't eat those shorts. I just need shorts that I don't walk into this appointment engineers. And so understanding that aspect and giving them a substitute that, you know, they might have picked themselves and they were in the store, is a really important aspect of this as well.</w:t>
+      </w:r>
+    </w:p>
+    <w:p>
+      <w:pPr>
+        <w:spacing w:after="140" w:line="300"/>
+      </w:pPr>
+      <w:r>
+        <w:rPr>
+          <w:sz w:val="21"/>
+          <w:szCs w:val="21"/>
+        </w:rPr>
+        <w:t xml:space="preserve">That's fantastic. And, Dylan, do you buy this premise? So that question that I asked for the audience was, Does anyone need a computer in 20 minutes? And I know I asked that question back to you as well, the answer was, well, you'll be surprised. I want to know from you, like, is faster and we're getting any better? It's it's not from my perspective. I think as a business, we choose to invest where the customer tells us to invest, we don't have to guess. I think we keep our ears open and that's systematized throughout the business to ensure that we know what the customer wants and when they want it. And we're in a different scenario. We're in 180 year old brands. So if you could all take a 2nd to imagine this, that means that the name one set has been stitched into sheets since before the invention of the telephone, right?</w:t>
+      </w:r>
+    </w:p>
+    <w:p>
+      <w:pPr>
+        <w:spacing w:after="140" w:line="300"/>
+      </w:pPr>
+      <w:r>
+        <w:rPr>
+          <w:sz w:val="21"/>
+          <w:szCs w:val="21"/>
+        </w:rPr>
+        <w:t xml:space="preserve">So I don't I don't consider myself just the CEO. I consider myself the next
+[Gap in the recording]
+The dinner's location, right? Well, you have larger optionality within the retailer option who, and then you have the ones that sit inside your network. How do you make that choice of that density of optionality? Like if you were to give people advice, be like, how do you look at your students in the end go, well, this is what needs to go closer on a hire to put pepper output. It's it's a really interesting question and then one, we actually go back and forth on a lot internally. And one of the Ford, 4 very 4 deployed, the phone nodes. You need a lot of firm books. And one of the things that we found is that retailers are really, really good at already stocking the very best excuse for their market.</w:t>
+      </w:r>
+    </w:p>
+    <w:p>
+      <w:pPr>
+        <w:spacing w:after="140" w:line="300"/>
+      </w:pPr>
+      <w:r>
+        <w:rPr>
+          <w:sz w:val="21"/>
+          <w:szCs w:val="21"/>
+        </w:rPr>
+        <w:t xml:space="preserve">If I walk into PetSmart today, they already are stalking before you come back with Korea. That is there, that is ready to go. And they are making sure that that stays on the shelf as much as possible. And so for us, as we think about, hey, how do we partner with retailers and help them fulfill these SKUs in? The questions are, one, we're seeing a lot of late night command for that type of skill, where this might be beyond your store owners. So that's one reason why we might choose to stock that in store. And then the other is is it a skew that you actually do have trouble keeping stock because it's moving so quickly or because you have so much intradate throughput? And that's a place where cash market performance services is also really helpful. That's fantastic. It's a, I don't think there is a direct answer to this at this point, but it's an answer that we all could probably spend our entire careers exploring to try and find out that right optimization path.</w:t>
       </w:r>
     </w:p>
     <w:p>
@@ -1251,6 +1705,1881 @@
           <w:szCs w:val="21"/>
         </w:rPr>
         <w:t xml:space="preserve">Thank you very much, guests. Hope everyone enjoys the next 15 minutes until the show flows open. My name is again, in Ataria. One round of applause for the, I mean, I think, influencing, efficiency. Thank you.</w:t>
+      </w:r>
+    </w:p>
+    <w:p>
+      <w:pPr>
+        <w:pageBreakBefore/>
+        <w:spacing w:after="60"/>
+      </w:pPr>
+      <w:r>
+        <w:rPr>
+          <w:b/>
+          <w:bCs/>
+          <w:color w:val="7F7F7F"/>
+          <w:spacing w:val="40"/>
+          <w:sz w:val="18"/>
+          <w:szCs w:val="18"/>
+        </w:rPr>
+        <w:t xml:space="preserve">SESSION 2</w:t>
+      </w:r>
+    </w:p>
+    <w:p>
+      <w:pPr>
+        <w:pStyle w:val="Heading1"/>
+      </w:pPr>
+      <w:r>
+        <w:t xml:space="preserve">Unmatched: Loyalty and membership panel</w:t>
+      </w:r>
+    </w:p>
+    <w:tbl>
+      <w:tblPr>
+        <w:tblW w:type="dxa" w:w="9360"/>
+        <w:tblBorders>
+          <w:top w:val="single" w:color="auto" w:sz="4"/>
+          <w:left w:val="single" w:color="auto" w:sz="4"/>
+          <w:bottom w:val="single" w:color="auto" w:sz="4"/>
+          <w:right w:val="single" w:color="auto" w:sz="4"/>
+          <w:insideH w:val="single" w:color="auto" w:sz="4"/>
+          <w:insideV w:val="single" w:color="auto" w:sz="4"/>
+        </w:tblBorders>
+      </w:tblPr>
+      <w:tblGrid>
+        <w:gridCol w:w="2200"/>
+        <w:gridCol w:w="7160"/>
+      </w:tblGrid>
+      <w:tr>
+        <w:trPr>
+          <w:tblHeader/>
+        </w:trPr>
+        <w:tc>
+          <w:tcPr>
+            <w:tcW w:type="dxa" w:w="2200"/>
+            <w:tcBorders>
+              <w:top w:val="single" w:color="BFBFBF" w:sz="4"/>
+              <w:left w:val="single" w:color="BFBFBF" w:sz="4"/>
+              <w:bottom w:val="single" w:color="BFBFBF" w:sz="4"/>
+              <w:right w:val="single" w:color="BFBFBF" w:sz="4"/>
+            </w:tcBorders>
+            <w:shd w:fill="1F4E79" w:color="auto" w:val="clear"/>
+            <w:tcMar>
+              <w:top w:type="dxa" w:w="80"/>
+              <w:left w:type="dxa" w:w="120"/>
+              <w:bottom w:type="dxa" w:w="80"/>
+              <w:right w:type="dxa" w:w="120"/>
+            </w:tcMar>
+          </w:tcPr>
+          <w:p>
+            <w:r>
+              <w:rPr>
+                <w:b/>
+                <w:bCs/>
+                <w:color w:val="FFFFFF"/>
+                <w:sz w:val="20"/>
+                <w:szCs w:val="20"/>
+              </w:rPr>
+              <w:t xml:space="preserve">Session Details</w:t>
+            </w:r>
+          </w:p>
+        </w:tc>
+        <w:tc>
+          <w:tcPr>
+            <w:tcW w:type="dxa" w:w="7160"/>
+            <w:tcBorders>
+              <w:top w:val="single" w:color="BFBFBF" w:sz="4"/>
+              <w:left w:val="single" w:color="BFBFBF" w:sz="4"/>
+              <w:bottom w:val="single" w:color="BFBFBF" w:sz="4"/>
+              <w:right w:val="single" w:color="BFBFBF" w:sz="4"/>
+            </w:tcBorders>
+            <w:shd w:fill="1F4E79" w:color="auto" w:val="clear"/>
+            <w:tcMar>
+              <w:top w:type="dxa" w:w="80"/>
+              <w:left w:type="dxa" w:w="120"/>
+              <w:bottom w:type="dxa" w:w="80"/>
+              <w:right w:type="dxa" w:w="120"/>
+            </w:tcMar>
+          </w:tcPr>
+          <w:p>
+            <w:r>
+              <w:rPr>
+                <w:b/>
+                <w:bCs/>
+                <w:color w:val="FFFFFF"/>
+                <w:sz w:val="20"/>
+                <w:szCs w:val="20"/>
+              </w:rPr>
+              <w:t xml:space="preserve"/>
+            </w:r>
+          </w:p>
+        </w:tc>
+      </w:tr>
+      <w:tr>
+        <w:trPr>
+          <w:cantSplit/>
+        </w:trPr>
+        <w:tc>
+          <w:tcPr>
+            <w:tcW w:type="dxa" w:w="2200"/>
+            <w:tcBorders>
+              <w:top w:val="single" w:color="BFBFBF" w:sz="4"/>
+              <w:left w:val="single" w:color="BFBFBF" w:sz="4"/>
+              <w:bottom w:val="single" w:color="BFBFBF" w:sz="4"/>
+              <w:right w:val="single" w:color="BFBFBF" w:sz="4"/>
+            </w:tcBorders>
+            <w:tcMar>
+              <w:top w:type="dxa" w:w="80"/>
+              <w:left w:type="dxa" w:w="120"/>
+              <w:bottom w:type="dxa" w:w="80"/>
+              <w:right w:type="dxa" w:w="120"/>
+            </w:tcMar>
+          </w:tcPr>
+          <w:p>
+            <w:r>
+              <w:rPr>
+                <w:b/>
+                <w:bCs/>
+                <w:sz w:val="20"/>
+                <w:szCs w:val="20"/>
+              </w:rPr>
+              <w:t xml:space="preserve">Date</w:t>
+            </w:r>
+          </w:p>
+        </w:tc>
+        <w:tc>
+          <w:tcPr>
+            <w:tcW w:type="dxa" w:w="7160"/>
+            <w:tcBorders>
+              <w:top w:val="single" w:color="BFBFBF" w:sz="4"/>
+              <w:left w:val="single" w:color="BFBFBF" w:sz="4"/>
+              <w:bottom w:val="single" w:color="BFBFBF" w:sz="4"/>
+              <w:right w:val="single" w:color="BFBFBF" w:sz="4"/>
+            </w:tcBorders>
+            <w:tcMar>
+              <w:top w:type="dxa" w:w="80"/>
+              <w:left w:type="dxa" w:w="120"/>
+              <w:bottom w:type="dxa" w:w="80"/>
+              <w:right w:type="dxa" w:w="120"/>
+            </w:tcMar>
+          </w:tcPr>
+          <w:p>
+            <w:r>
+              <w:rPr>
+                <w:b w:val="false"/>
+                <w:bCs w:val="false"/>
+                <w:sz w:val="20"/>
+                <w:szCs w:val="20"/>
+              </w:rPr>
+              <w:t xml:space="preserve">TBC</w:t>
+            </w:r>
+          </w:p>
+        </w:tc>
+      </w:tr>
+      <w:tr>
+        <w:trPr>
+          <w:cantSplit/>
+        </w:trPr>
+        <w:tc>
+          <w:tcPr>
+            <w:tcW w:type="dxa" w:w="2200"/>
+            <w:tcBorders>
+              <w:top w:val="single" w:color="BFBFBF" w:sz="4"/>
+              <w:left w:val="single" w:color="BFBFBF" w:sz="4"/>
+              <w:bottom w:val="single" w:color="BFBFBF" w:sz="4"/>
+              <w:right w:val="single" w:color="BFBFBF" w:sz="4"/>
+            </w:tcBorders>
+            <w:shd w:fill="F2F2F2" w:color="auto" w:val="clear"/>
+            <w:tcMar>
+              <w:top w:type="dxa" w:w="80"/>
+              <w:left w:type="dxa" w:w="120"/>
+              <w:bottom w:type="dxa" w:w="80"/>
+              <w:right w:type="dxa" w:w="120"/>
+            </w:tcMar>
+          </w:tcPr>
+          <w:p>
+            <w:r>
+              <w:rPr>
+                <w:b/>
+                <w:bCs/>
+                <w:sz w:val="20"/>
+                <w:szCs w:val="20"/>
+              </w:rPr>
+              <w:t xml:space="preserve">Time</w:t>
+            </w:r>
+          </w:p>
+        </w:tc>
+        <w:tc>
+          <w:tcPr>
+            <w:tcW w:type="dxa" w:w="7160"/>
+            <w:tcBorders>
+              <w:top w:val="single" w:color="BFBFBF" w:sz="4"/>
+              <w:left w:val="single" w:color="BFBFBF" w:sz="4"/>
+              <w:bottom w:val="single" w:color="BFBFBF" w:sz="4"/>
+              <w:right w:val="single" w:color="BFBFBF" w:sz="4"/>
+            </w:tcBorders>
+            <w:shd w:fill="F2F2F2" w:color="auto" w:val="clear"/>
+            <w:tcMar>
+              <w:top w:type="dxa" w:w="80"/>
+              <w:left w:type="dxa" w:w="120"/>
+              <w:bottom w:type="dxa" w:w="80"/>
+              <w:right w:type="dxa" w:w="120"/>
+            </w:tcMar>
+          </w:tcPr>
+          <w:p>
+            <w:r>
+              <w:rPr>
+                <w:b w:val="false"/>
+                <w:bCs w:val="false"/>
+                <w:sz w:val="20"/>
+                <w:szCs w:val="20"/>
+              </w:rPr>
+              <w:t xml:space="preserve">TBC</w:t>
+            </w:r>
+          </w:p>
+        </w:tc>
+      </w:tr>
+      <w:tr>
+        <w:trPr>
+          <w:cantSplit/>
+        </w:trPr>
+        <w:tc>
+          <w:tcPr>
+            <w:tcW w:type="dxa" w:w="2200"/>
+            <w:tcBorders>
+              <w:top w:val="single" w:color="BFBFBF" w:sz="4"/>
+              <w:left w:val="single" w:color="BFBFBF" w:sz="4"/>
+              <w:bottom w:val="single" w:color="BFBFBF" w:sz="4"/>
+              <w:right w:val="single" w:color="BFBFBF" w:sz="4"/>
+            </w:tcBorders>
+            <w:tcMar>
+              <w:top w:type="dxa" w:w="80"/>
+              <w:left w:type="dxa" w:w="120"/>
+              <w:bottom w:type="dxa" w:w="80"/>
+              <w:right w:type="dxa" w:w="120"/>
+            </w:tcMar>
+          </w:tcPr>
+          <w:p>
+            <w:r>
+              <w:rPr>
+                <w:b/>
+                <w:bCs/>
+                <w:sz w:val="20"/>
+                <w:szCs w:val="20"/>
+              </w:rPr>
+              <w:t xml:space="preserve">Stage</w:t>
+            </w:r>
+          </w:p>
+        </w:tc>
+        <w:tc>
+          <w:tcPr>
+            <w:tcW w:type="dxa" w:w="7160"/>
+            <w:tcBorders>
+              <w:top w:val="single" w:color="BFBFBF" w:sz="4"/>
+              <w:left w:val="single" w:color="BFBFBF" w:sz="4"/>
+              <w:bottom w:val="single" w:color="BFBFBF" w:sz="4"/>
+              <w:right w:val="single" w:color="BFBFBF" w:sz="4"/>
+            </w:tcBorders>
+            <w:tcMar>
+              <w:top w:type="dxa" w:w="80"/>
+              <w:left w:type="dxa" w:w="120"/>
+              <w:bottom w:type="dxa" w:w="80"/>
+              <w:right w:type="dxa" w:w="120"/>
+            </w:tcMar>
+          </w:tcPr>
+          <w:p>
+            <w:r>
+              <w:rPr>
+                <w:b w:val="false"/>
+                <w:bCs w:val="false"/>
+                <w:sz w:val="20"/>
+                <w:szCs w:val="20"/>
+              </w:rPr>
+              <w:t xml:space="preserve">TBC</w:t>
+            </w:r>
+          </w:p>
+        </w:tc>
+      </w:tr>
+      <w:tr>
+        <w:trPr>
+          <w:cantSplit/>
+        </w:trPr>
+        <w:tc>
+          <w:tcPr>
+            <w:tcW w:type="dxa" w:w="2200"/>
+            <w:tcBorders>
+              <w:top w:val="single" w:color="BFBFBF" w:sz="4"/>
+              <w:left w:val="single" w:color="BFBFBF" w:sz="4"/>
+              <w:bottom w:val="single" w:color="BFBFBF" w:sz="4"/>
+              <w:right w:val="single" w:color="BFBFBF" w:sz="4"/>
+            </w:tcBorders>
+            <w:shd w:fill="F2F2F2" w:color="auto" w:val="clear"/>
+            <w:tcMar>
+              <w:top w:type="dxa" w:w="80"/>
+              <w:left w:type="dxa" w:w="120"/>
+              <w:bottom w:type="dxa" w:w="80"/>
+              <w:right w:type="dxa" w:w="120"/>
+            </w:tcMar>
+          </w:tcPr>
+          <w:p>
+            <w:r>
+              <w:rPr>
+                <w:b/>
+                <w:bCs/>
+                <w:sz w:val="20"/>
+                <w:szCs w:val="20"/>
+              </w:rPr>
+              <w:t xml:space="preserve">Notes</w:t>
+            </w:r>
+          </w:p>
+        </w:tc>
+        <w:tc>
+          <w:tcPr>
+            <w:tcW w:type="dxa" w:w="7160"/>
+            <w:tcBorders>
+              <w:top w:val="single" w:color="BFBFBF" w:sz="4"/>
+              <w:left w:val="single" w:color="BFBFBF" w:sz="4"/>
+              <w:bottom w:val="single" w:color="BFBFBF" w:sz="4"/>
+              <w:right w:val="single" w:color="BFBFBF" w:sz="4"/>
+            </w:tcBorders>
+            <w:shd w:fill="F2F2F2" w:color="auto" w:val="clear"/>
+            <w:tcMar>
+              <w:top w:type="dxa" w:w="80"/>
+              <w:left w:type="dxa" w:w="120"/>
+              <w:bottom w:type="dxa" w:w="80"/>
+              <w:right w:type="dxa" w:w="120"/>
+            </w:tcMar>
+          </w:tcPr>
+          <w:p>
+            <w:r>
+              <w:rPr>
+                <w:b w:val="false"/>
+                <w:bCs w:val="false"/>
+                <w:sz w:val="20"/>
+                <w:szCs w:val="20"/>
+              </w:rPr>
+              <w:t xml:space="preserve">Transcript; session not identified</w:t>
+            </w:r>
+          </w:p>
+        </w:tc>
+      </w:tr>
+      <w:tr>
+        <w:trPr>
+          <w:cantSplit/>
+        </w:trPr>
+        <w:tc>
+          <w:tcPr>
+            <w:tcW w:type="dxa" w:w="2200"/>
+            <w:tcBorders>
+              <w:top w:val="single" w:color="BFBFBF" w:sz="4"/>
+              <w:left w:val="single" w:color="BFBFBF" w:sz="4"/>
+              <w:bottom w:val="single" w:color="BFBFBF" w:sz="4"/>
+              <w:right w:val="single" w:color="BFBFBF" w:sz="4"/>
+            </w:tcBorders>
+            <w:tcMar>
+              <w:top w:type="dxa" w:w="80"/>
+              <w:left w:type="dxa" w:w="120"/>
+              <w:bottom w:type="dxa" w:w="80"/>
+              <w:right w:type="dxa" w:w="120"/>
+            </w:tcMar>
+          </w:tcPr>
+          <w:p>
+            <w:r>
+              <w:rPr>
+                <w:b/>
+                <w:bCs/>
+                <w:sz w:val="20"/>
+                <w:szCs w:val="20"/>
+              </w:rPr>
+              <w:t xml:space="preserve">Title</w:t>
+            </w:r>
+          </w:p>
+        </w:tc>
+        <w:tc>
+          <w:tcPr>
+            <w:tcW w:type="dxa" w:w="7160"/>
+            <w:tcBorders>
+              <w:top w:val="single" w:color="BFBFBF" w:sz="4"/>
+              <w:left w:val="single" w:color="BFBFBF" w:sz="4"/>
+              <w:bottom w:val="single" w:color="BFBFBF" w:sz="4"/>
+              <w:right w:val="single" w:color="BFBFBF" w:sz="4"/>
+            </w:tcBorders>
+            <w:tcMar>
+              <w:top w:type="dxa" w:w="80"/>
+              <w:left w:type="dxa" w:w="120"/>
+              <w:bottom w:type="dxa" w:w="80"/>
+              <w:right w:type="dxa" w:w="120"/>
+            </w:tcMar>
+          </w:tcPr>
+          <w:p>
+            <w:r>
+              <w:rPr>
+                <w:b w:val="false"/>
+                <w:bCs w:val="false"/>
+                <w:sz w:val="20"/>
+                <w:szCs w:val="20"/>
+              </w:rPr>
+              <w:t xml:space="preserve">Not yet matched to an agenda session. Panelists include the General Manager of Walmart+ (first name transcribed as Deepak) and the President of The UPS Store (first name Brad), plus a third panelist whose name and company are unclear (discusses pros vs DIY customers), with a female moderator.</w:t>
+            </w:r>
+          </w:p>
+        </w:tc>
+      </w:tr>
+    </w:tbl>
+    <w:p>
+      <w:pPr>
+        <w:pStyle w:val="Heading2"/>
+      </w:pPr>
+      <w:r>
+        <w:t xml:space="preserve">Speakers</w:t>
+      </w:r>
+    </w:p>
+    <w:p>
+      <w:pPr>
+        <w:spacing w:after="120"/>
+      </w:pPr>
+      <w:r>
+        <w:rPr>
+          <w:i/>
+          <w:iCs/>
+          <w:color w:val="7F7F7F"/>
+        </w:rPr>
+        <w:t xml:space="preserve">Speakers TBC.</w:t>
+      </w:r>
+    </w:p>
+    <w:p>
+      <w:pPr>
+        <w:pStyle w:val="Heading2"/>
+      </w:pPr>
+      <w:r>
+        <w:t xml:space="preserve">Key Takeaways</w:t>
+      </w:r>
+    </w:p>
+    <w:p>
+      <w:pPr>
+        <w:pStyle w:val="ListParagraph"/>
+        <w:numPr>
+          <w:ilvl w:val="0"/>
+          <w:numId w:val="2"/>
+        </w:numPr>
+        <w:spacing w:after="60"/>
+      </w:pPr>
+      <w:r>
+        <w:t xml:space="preserve">Loyalty programs are getting more spend but less engagement: about half of points are never redeemed and many members want to leave; experiences now beat financial rewards as the reason to join.</w:t>
+      </w:r>
+    </w:p>
+    <w:p>
+      <w:pPr>
+        <w:pStyle w:val="ListParagraph"/>
+        <w:numPr>
+          <w:ilvl w:val="0"/>
+          <w:numId w:val="2"/>
+        </w:numPr>
+        <w:spacing w:after="60"/>
+      </w:pPr>
+      <w:r>
+        <w:t xml:space="preserve">Walmart+ ($98/year, over a dozen benefits) aims to be an “essential membership” rather than a points program; members shop 3x more often and spend 4x more than non-members.</w:t>
+      </w:r>
+    </w:p>
+    <w:p>
+      <w:pPr>
+        <w:pStyle w:val="ListParagraph"/>
+        <w:numPr>
+          <w:ilvl w:val="0"/>
+          <w:numId w:val="2"/>
+        </w:numPr>
+        <w:spacing w:after="60"/>
+      </w:pPr>
+      <w:r>
+        <w:t xml:space="preserve">Walmart+ prioritises high-uncertainty, high-reward experiments and uses early proxy metrics (benefit activation, using several benefits early) to predict retention.</w:t>
+      </w:r>
+    </w:p>
+    <w:p>
+      <w:pPr>
+        <w:pStyle w:val="ListParagraph"/>
+        <w:numPr>
+          <w:ilvl w:val="0"/>
+          <w:numId w:val="2"/>
+        </w:numPr>
+        <w:spacing w:after="60"/>
+      </w:pPr>
+      <w:r>
+        <w:t xml:space="preserve">The UPS Store: customer experience never exceeds that of the people delivering it; RFID tracking was rolled out to remove friction, not to chase technology.</w:t>
+      </w:r>
+    </w:p>
+    <w:p>
+      <w:pPr>
+        <w:pStyle w:val="ListParagraph"/>
+        <w:numPr>
+          <w:ilvl w:val="0"/>
+          <w:numId w:val="2"/>
+        </w:numPr>
+        <w:spacing w:after="60"/>
+      </w:pPr>
+      <w:r>
+        <w:t xml:space="preserve">Use counter-metrics so optimising one KPI doesn't damage the wider experience.</w:t>
+      </w:r>
+    </w:p>
+    <w:p>
+      <w:pPr>
+        <w:pStyle w:val="Heading2"/>
+      </w:pPr>
+      <w:r>
+        <w:t xml:space="preserve">Transcript</w:t>
+      </w:r>
+    </w:p>
+    <w:p>
+      <w:pPr>
+        <w:spacing w:after="120"/>
+      </w:pPr>
+      <w:r>
+        <w:rPr>
+          <w:i/>
+          <w:iCs/>
+          <w:color w:val="595959"/>
+          <w:sz w:val="18"/>
+          <w:szCs w:val="18"/>
+        </w:rPr>
+        <w:t xml:space="preserve">Automatic speech-to-text output, kept word for word; not split by speaker.</w:t>
+      </w:r>
+    </w:p>
+    <w:p>
+      <w:pPr>
+        <w:spacing w:after="120"/>
+      </w:pPr>
+      <w:r>
+        <w:rPr>
+          <w:i/>
+          <w:iCs/>
+          <w:color w:val="595959"/>
+          <w:sz w:val="18"/>
+          <w:szCs w:val="18"/>
+        </w:rPr>
+        <w:t xml:space="preserve">Audio for parts of the third panelist's answers is unclear.</w:t>
+      </w:r>
+    </w:p>
+    <w:p>
+      <w:pPr>
+        <w:spacing w:after="140" w:line="300"/>
+      </w:pPr>
+      <w:r>
+        <w:rPr>
+          <w:sz w:val="21"/>
+          <w:szCs w:val="21"/>
+        </w:rPr>
+        <w:t xml:space="preserve">We're gonna talk a little bit about the loads of hair box, and then I'll bring the speakers on the stage. So I'm not going to tell you a little bit about me. Um, see if I can pay attention. I was definitely gonna be a dad nerd, a fashionista, and corporate girly. And what I learned from working for all these brands at the bottom of the slide is that royalty is so much more important. It's really about relationships and building trust with your customers. So we'll talk a little bit about some of the things that we're finding. We're fine right now is brands are studying more money on loyalty than ever before. CMOs are spending 40% more to invest in loyalty programs. People are in Lloyd's, I'm sure you all are in 4 or 5 books, just yourselves. But what would remind me is that the hip hop is low to programs by national.</w:t>
+      </w:r>
+    </w:p>
+    <w:p>
+      <w:pPr>
+        <w:spacing w:after="140" w:line="300"/>
+      </w:pPr>
+      <w:r>
+        <w:rPr>
+          <w:sz w:val="21"/>
+          <w:szCs w:val="21"/>
+        </w:rPr>
+        <w:t xml:space="preserve">They're spending more in day works. 15% of executives are increasing their own loyalty, and then 25% of brands are actually getting your worst customer experience, created by Forester. So the engagement gap continues, and this is the part that we want to speak. talk about. So when you look at, um, what's happening, 50% of people say, they're animal loyalty program, but it doesn't make them feel more passionate about the brand. It doesn't invoke any type of connection with the brand. Um, and then 18% of people actually engage more to learn that they're participating in. That's a lot of work for low engagement. And then another statistic is that 50% of all points are actually never redeemed. So if any of you are running a loyalty program, I would also like my output to have both inputs. Inputs to be having pick outputs. So this is a consistent that's concerning.</w:t>
+      </w:r>
+    </w:p>
+    <w:p>
+      <w:pPr>
+        <w:spacing w:after="140" w:line="300"/>
+      </w:pPr>
+      <w:r>
+        <w:rPr>
+          <w:sz w:val="21"/>
+          <w:szCs w:val="21"/>
+        </w:rPr>
+        <w:t xml:space="preserve">And then this one, I think, is also really interesting too. Most people are in a loyalty program, about half those people say, I'm going to get out of that program as soon as I can. And we'll be diving into the 18th by 24, 34 year old group, into the demographic technology party right now, it's really hot, so it's about half a percent. 50% of well. So let's talk about what's actually working. So what is working is there's a really statistic that the, for the 1st time, we're seeing that experience without pacing why people are excited about it, why to program that over a financial reward. So what is amazing about if you get the ones you write, 76% of customers? You keep doing business with that brand? Eight, besides customers, we spend more of that, right? And 87% of those are recommendations. I'm sure all of you would love to have that in your...</w:t>
+      </w:r>
+    </w:p>
+    <w:p>
+      <w:pPr>
+        <w:spacing w:after="140" w:line="300"/>
+      </w:pPr>
+      <w:r>
+        <w:rPr>
+          <w:sz w:val="21"/>
+          <w:szCs w:val="21"/>
+        </w:rPr>
+        <w:t xml:space="preserve">So what it really is to me is loyalty and evolved from just a marketing tactic, controlling an operational discipline. And so that's what we're going to talk about today. So I'm learning on stage, really perilous. There are two these really big brands. They're looking at it from a bullet standpoint. So when you come out? Oh, and then really quickly, you get a chance and they come on stage. I do write a white paper about the loyalty business. You can send it to your code if you want to check that out. So come on stage, I was born, I was on stage. It's an energy. for today. Welcome, welcome. Thank you all. So I'd love to just take it off. We all, I'm just kind of gonna a quick introduction of who you are and a little bit of background about your individual individual programs. So start with me a lot.</w:t>
+      </w:r>
+    </w:p>
+    <w:p>
+      <w:pPr>
+        <w:spacing w:after="140" w:line="300"/>
+      </w:pPr>
+      <w:r>
+        <w:rPr>
+          <w:sz w:val="21"/>
+          <w:szCs w:val="21"/>
+        </w:rPr>
+        <w:t xml:space="preserve">Um, Deepak Mary's, uh, general manager of Walmart Plus. Wall Plus is a team membership program at Walmart where you for $98 a year, you get a suite of benefits, essentially, helping customers save time and lift time. I'm just saying about you, you have technology on the marketing, right? And, uh, we get information shows, uh, this is having to do with loyalty. Mata, as well as having it. Hey everybody, I'm Brad Mattis. I had the absolute privilege of being the PS store. And the UPS store, if you haven't seen or heard us, which I'm sure you have. We are a network of 5600, independently owned, and operate in small businesses across the US. And what sets us apart. I think it's our secret sauce, is that we're small business owners serving small business owners and communities where they work. I love it. Okay, so let's start with...</w:t>
+      </w:r>
+    </w:p>
+    <w:p>
+      <w:pPr>
+        <w:spacing w:after="140" w:line="300"/>
+      </w:pPr>
+      <w:r>
+        <w:rPr>
+          <w:sz w:val="21"/>
+          <w:szCs w:val="21"/>
+        </w:rPr>
+        <w:t xml:space="preserve">So at Walmart Plus, you have a $98 price point for that local program, but every year you're adding new services. How do you do that? And looking for a new billionaire? Yes. So I wanted to start buying frame on Walmart Bless Coast. We talk about that we're not a traditional loyalty program. We're not focused on optimizing transactions. We're focused on becoming an internal part of our customers every day looking. That means we're every day thinking about how we can help our members save time, save mine, and make their life a little bit easier. And its simplest, Wall Place is designed to solve customers, everyday problems, and deliver value and convenience across moments that matter most in their life. Essentially, combines a set of benefits. So you can get a little bit in store, shipping, discounts, fuel stations, producing choice, as well as other benefits, or one low price of $98 a car.</w:t>
+      </w:r>
+    </w:p>
+    <w:p>
+      <w:pPr>
+        <w:spacing w:after="140" w:line="300"/>
+      </w:pPr>
+      <w:r>
+        <w:rPr>
+          <w:sz w:val="21"/>
+          <w:szCs w:val="21"/>
+        </w:rPr>
+        <w:t xml:space="preserve">And our focus is, our vision, what we're given by, that we want to be accustomed to, like, the most essential membership for our customers. Something that people can rely on every day. This is not about something that one of things that people would use. So that's the vision, that's how we're thinking about this. So we launched with 3 benefits 6 years ago, and as you mentioned, we have grown to over a dozen benefits now. So as we think about new benefits to add to this program, we're thinking about the real problem that our customers face every day. And how can we solve those problems? Can we improve the experience? Is there sequence you built in? Because we want our customers to come back, engage with us in a D percent. Because when engaged in defense, it strengthens the overall for the broader Walmart ecosystem, including for suppliers, through stronger customer connections and in sites that we can deliver through our programs such as Walmart Connect, and watch the Walmart data interventions.</w:t>
+      </w:r>
+    </w:p>
+    <w:p>
+      <w:pPr>
+        <w:spacing w:after="140" w:line="300"/>
+      </w:pPr>
+      <w:r>
+        <w:rPr>
+          <w:sz w:val="21"/>
+          <w:szCs w:val="21"/>
+        </w:rPr>
+        <w:t xml:space="preserve">Right, I'm going to ask you, because we talked about some of the positive signs we've seen at the loyalty right now, and you have won, or even a DPS stores in, like, the past few years, no Hawaii customer service. So what is it that's the secret sauce is coming in that, or when? Yeah, I would say this. There's something on our over 30 plus years. The operations, large scale operations, as well as customer service teams in the US and Canada. That simple, powerful truth is that the customer occurs would never exceed that of the people that are delivering it. And so in my world, that means it's all about taking care of our franchisees and our associates so that they can take care of the customers. And we're really proud of it. We're really, really proud of that forms, best customer service because it really is not necessarily one thing, but it's a lot of little things, things like assuring that our franchisees and their associates have the very best for the very best field support.</w:t>
+      </w:r>
+    </w:p>
+    <w:p>
+      <w:pPr>
+        <w:spacing w:after="140" w:line="300"/>
+      </w:pPr>
+      <w:r>
+        <w:rPr>
+          <w:sz w:val="21"/>
+          <w:szCs w:val="21"/>
+        </w:rPr>
+        <w:t xml:space="preserve">Very nice system as a technology and innovation so that they can take care of the customers. One of the things we really focus on is how do we ensure that we are identifying and removing friction from a customer experience and from the franchisee experience? And when we do that, it enables those that are on front lines to be able to really, really deliver and invest. And surely the customer has an exceptional experience. Look at that. So you have a BV, BC customers concerned about, and then when we talk about those, your program is looking at pros as well as DLI users. What is outside of these are similar in both those customers? That's the thing that's different they have to consider. So when you look at how a pro behaves versus a yellow, which is very... From a here, my perspective, they want to make sure the transactions, the way they shop with us.</w:t>
+      </w:r>
+    </w:p>
+    <w:p>
+      <w:pPr>
+        <w:spacing w:after="140" w:line="300"/>
+      </w:pPr>
+      <w:r>
+        <w:rPr>
+          <w:sz w:val="21"/>
+          <w:szCs w:val="21"/>
+        </w:rPr>
+        <w:t xml:space="preserve">So, maybe some common winner, especially. And it has to be seamless, on a customer, stream standpoint, and it has to be on point with the project that we have in mind. So you take them out there, you are essentially trying to fulfill a dream whether you are. That's what we have asked. It's not true perspective, the easy new business can be given. If you're a small medium crew or a large crew, the wheel, your place, maybe just can. So from a loyalty standpoint, the way you re-points on the flexibility has to be different. If you're a pro, you would want to control, then you want to convert points into actual dollars. Whereas a VII, they want it more effectively and simple. Right. So while the foundations of both the programs are similar, the way it has to operate and in service of the customer, they're interested in unique and something.</w:t>
+      </w:r>
+    </w:p>
+    <w:p>
+      <w:pPr>
+        <w:spacing w:after="140" w:line="300"/>
+      </w:pPr>
+      <w:r>
+        <w:rPr>
+          <w:sz w:val="21"/>
+          <w:szCs w:val="21"/>
+        </w:rPr>
+        <w:t xml:space="preserve">So that's where the result comes from. So, earlier to talk that you don't really consider, you're loyal to programs more than words, you don't really call it that. So what do you really consider that program overall? Like So what we're trying to do is not win the next transaction. Our focus is to build a long-term relationship. We want to be, our focus is to be an embedded system of value for our members. So that when we are trusted enough, relevant enough and useful enough, then choosing us 1st is no longer a decision. It's a habit. And that's our hope. We want to be a part of our customers day-to-day life. So look at our pursuit of benefits. If you want groceries deliberately for you for free, we can do that. On your trip to work, if you want, if you love at one of the 17,000 participants stations where you can get ¢10 off of gas, you can do that.</w:t>
+      </w:r>
+    </w:p>
+    <w:p>
+      <w:pPr>
+        <w:spacing w:after="140" w:line="300"/>
+      </w:pPr>
+      <w:r>
+        <w:rPr>
+          <w:sz w:val="21"/>
+          <w:szCs w:val="21"/>
+        </w:rPr>
+        <w:t xml:space="preserve">We offer video streaming choice. So you can choose between Panama and Plus or Peacock and switch every night it is. We offer 5% cash back with one big cash work for our members. So these are use cases. These are things that people use every day, every week. So we're the business of building a long-term relationship with our members. And for that, we look for how we can continue to add bandage so that they pay us $90 a year and they get value back for spending their knowledge of us. Amazing. So I have a follow-up question for you. So we've talked about there's a lot of innovation that's happening here. You're always adding music. So, and then Walmart, it has a really big reputation. I'll always achieve time involved. How does that culture impact? How do you figure out what to design and what to change in a program like this?</w:t>
+      </w:r>
+    </w:p>
+    <w:p>
+      <w:pPr>
+        <w:spacing w:after="140" w:line="300"/>
+      </w:pPr>
+      <w:r>
+        <w:rPr>
+          <w:sz w:val="21"/>
+          <w:szCs w:val="21"/>
+        </w:rPr>
+        <w:t xml:space="preserve">Yeah, I think that we talked about it with my team is that membership growth is not magic. It is a scientific reader. So for us, experimentation is super important. So we think in terms of whether some we experiment evidence, so whether it's messaging, whether it's new value composition, whether it's onboarding journeys, we study points of fiction, drop off moments, Our goal is to get our members to rely value as quickly as possible. And we know the quicker it is, the better they're hit. So we have a framework that I think about, which is we're in business of learning new information. We think of experimentation on a 2 by 2 grade. On one side is the certainty or uncertainty in trying something new. On the other side is the reward, potentially the reward of getting it right. We focus on things that are highly uncertain, but have a high potential reward if they work.</w:t>
+      </w:r>
+    </w:p>
+    <w:p>
+      <w:pPr>
+        <w:spacing w:after="140" w:line="300"/>
+      </w:pPr>
+      <w:r>
+        <w:rPr>
+          <w:sz w:val="21"/>
+          <w:szCs w:val="21"/>
+        </w:rPr>
+        <w:t xml:space="preserve">Those are the ones, those are the experiments we try to prioritize first. But it also means we don't experiment many. There are times when uncertainty is low, then we just launch those things. But if the provincial report is low as wealth, then we just move on. We pass on those opportunities. So where all this thinking, we're all just thinking, asking ourselves, how can we be? an internal part of the rhythm of life for our customers? And what else can we do? So that doesn't mean to keep on adding new things. So we are high barn. We want to be the most essential membership for our customers. So you're on the innovation front. You've had some recent AI waves, right? Tell your audience a little bit about some of those. Sure. So then it comes to customer, I think, that perspective, right? So really... And if you, if you think about the different start points and how resource them, it's no longer a challenge in getting to the game, but what becomes difficult is if you want to make an action.</w:t>
+      </w:r>
+    </w:p>
+    <w:p>
+      <w:pPr>
+        <w:spacing w:after="140" w:line="300"/>
+      </w:pPr>
+      <w:r>
+        <w:rPr>
+          <w:sz w:val="21"/>
+          <w:szCs w:val="21"/>
+        </w:rPr>
+        <w:t xml:space="preserve">So when dealing with data at large, what we did, essentially, would be the role level of data, that allows our amount to gain, we will access action related, and make more contextual and elevative for activating on the data, in your time as well. So, if you think about historically, you know, it will be, you will have to have a well understanding of all signals that are going in the system. the data structure in the living around it. But with this, we translate a natural line of intent, upper market here, into 2 audience accurations. So, making data accessible, it becomes super, super important in time fact. That's what we do. And then, how are you validating what's a real AI when? And you talked a little about using calometrics to validate things. Can you tell us a little bit more about that? Sure. So, when you talk about compliment, it goes beyond the act, right?</w:t>
+      </w:r>
+    </w:p>
+    <w:p>
+      <w:pPr>
+        <w:spacing w:after="140" w:line="300"/>
+      </w:pPr>
+      <w:r>
+        <w:rPr>
+          <w:sz w:val="21"/>
+          <w:szCs w:val="21"/>
+        </w:rPr>
+        <w:t xml:space="preserve">If you recollect from a good arts law, then Netflix becomes a measure. is no longer a metric, right? And there's something that we do with any goal or any API, we also make sure we are measuring that with account. So let's say it's not about optimizing for transactions. It's not about just using a single method. You need to look at the full fiction and for that, it means the right balance, you need to look at any unperceived consequences for that awareness. That's where a compliment comes in. And if you take that from right from engineering disciplines to any business area, this is valid. Yeah, yeah. Awesome. So Brad, I have a question for you. So for granted, there's been winning in a lot of categories, how are you deciding sort of innovation? We've talked mostly about RDF idea. I think that'd be really interested in being a little bit about.</w:t>
+      </w:r>
+    </w:p>
+    <w:p>
+      <w:pPr>
+        <w:spacing w:after="140" w:line="300"/>
+      </w:pPr>
+      <w:r>
+        <w:rPr>
+          <w:sz w:val="21"/>
+          <w:szCs w:val="21"/>
+        </w:rPr>
+        <w:t xml:space="preserve">Um, and just how are you doing? Yeah. Innovation for us is, and I start by saying this to everybody sitting out here. The customer experience and the expectations that you've seen over your careers has changed dramatically from where you started, to where it is today. Same thing for us. There's customer expectation is constantly shifting. It's constantly evolving. We're in a state of more teams today in disruption than ever before. So for us at the EPS store, what we really look at is, where is their friction in the experience for each of the customer or the franchisee or their associates? And what we work on is identifying how do we remove that friction and innovation is a way to do that. It's not what we chase after. We don't chase technology, we use technology and innovation to help us solve problems and accelerate great experiences for customers.</w:t>
+      </w:r>
+    </w:p>
+    <w:p>
+      <w:pPr>
+        <w:spacing w:after="140" w:line="300"/>
+      </w:pPr>
+      <w:r>
+        <w:rPr>
+          <w:sz w:val="21"/>
+          <w:szCs w:val="21"/>
+        </w:rPr>
+        <w:t xml:space="preserve">So RFID is a great example. It is, we are the EPS is the 1st commercial carrier to really implement RFID across the board. We made a decision at the UPS store to implement and lay up, as I said, RFIDs, last P season. So we're not even on full year yet with RFIB in our stores. But what's super exciting and why we chose to do that at our busiest time of year, was because there was such demand and need from our customers. There was such demand and excitement for our franchisees, and the Enterprises, yes, was able to get so much valuable data by having RFID. And the way I describe RFIB for customers is that it's like having an air tag on your package. right? And everybody in this room, I'm sure, has shipped the package. And when you ship the package, there's something important in that package.</w:t>
+      </w:r>
+    </w:p>
+    <w:p>
+      <w:pPr>
+        <w:spacing w:after="140" w:line="300"/>
+      </w:pPr>
+      <w:r>
+        <w:rPr>
+          <w:sz w:val="21"/>
+          <w:szCs w:val="21"/>
+        </w:rPr>
+        <w:t xml:space="preserve">for the recipient. And what RFID has enabled us to do is view from what we call a scanning environment, where packages are scanned along the way to a sensitive environment, where we know and customer knows, most importantly, customer knows exactly where that package is, not where it was, but where it is. And most importantly, from an enterprise perspective, it allows us, UPS, to flex and be able to adapt and move resources to where the volume is going, not where it's going. So we're really excited because it solves a customer, needs tape, and it creates trust and differentiation for us. And we're the largest channel with our FIV, now for UPS, applying 150000000 labels a day. So, the taco experience, it's whose experience comes 1st, you know, so, like, the brain type of, or the English. It's such a great question. And I would say it this way, they're not mutually exclusive.</w:t>
+      </w:r>
+    </w:p>
+    <w:p>
+      <w:pPr>
+        <w:spacing w:after="140" w:line="300"/>
+      </w:pPr>
+      <w:r>
+        <w:rPr>
+          <w:sz w:val="21"/>
+          <w:szCs w:val="21"/>
+        </w:rPr>
+        <w:t xml:space="preserve">They are connected deeply connected. What I just know to be true is that, and I've seen this time and time again and ultimate business environments, you know, you got to take care of the people who are taking care of the customer. And that includes the support teams that includes the people working across the counter. And so, in my mind, it's not us and or it's kind of more situation for a man situation than for us. We have to ensure our franchisees have the tools resources, support necessary, so that they can read, take care of the customers. And when they do, the customer events. And so I would say it's your sequencing, then which is more important. Because we just feel like, and I feel like if we take care of those franchisees and associates the customer's role, I think we all experience that in your own businesses as well.</w:t>
+      </w:r>
+    </w:p>
+    <w:p>
+      <w:pPr>
+        <w:spacing w:after="140" w:line="300"/>
+      </w:pPr>
+      <w:r>
+        <w:rPr>
+          <w:sz w:val="21"/>
+          <w:szCs w:val="21"/>
+        </w:rPr>
+        <w:t xml:space="preserve">So do you probably English with you? So in terms of, you know, starving, most essential membership, um, and you built the frequency and routine. So what's the benefit of doing them and choosing now for yourself? Have so many... Let me not talk about things that we have passed on, but let me talk a little bit about how we say, a little bit more deeply of when we say essential. I think frequencies keep, for example. We're looking for things that are solving real life problems. We are adding tendable, evident value. And they either have an already of frequency built in, like customers already, you know, use, or they, it will result in improvement in frequency as they engage with us. And then finally, what value members put on that? Like, is there principal value that we'll put on that? So we are always thinking of start small, measure, experiment, and then keep on looking for these signals.</w:t>
+      </w:r>
+    </w:p>
+    <w:p>
+      <w:pPr>
+        <w:spacing w:after="140" w:line="300"/>
+      </w:pPr>
+      <w:r>
+        <w:rPr>
+          <w:sz w:val="21"/>
+          <w:szCs w:val="21"/>
+        </w:rPr>
+        <w:t xml:space="preserve">Are they following, is there a frequency equation? How are this benefit or this new thing that we're launching, bringing people into our membership program? How does it impact our retention or engagement? So we're looking at the overall ecosystem experience. And that's important to us because unlike other retailers, we can do things very differently. So because of our physical footprint, we have, for example, 4700 stores, we provide this unique experience and we can stitch together these experiences. So they'll give you an example. Like people want to walk into a store, our members are walk into a store because there's a need or they have the preference for that, they can do that. If they want us to, they want to do website pickup, we can do that. In a moment if they want something delivered same day, we can do that. They wanted something fast delivered to them.</w:t>
+      </w:r>
+    </w:p>
+    <w:p>
+      <w:pPr>
+        <w:spacing w:after="140" w:line="300"/>
+      </w:pPr>
+      <w:r>
+        <w:rPr>
+          <w:sz w:val="21"/>
+          <w:szCs w:val="21"/>
+        </w:rPr>
+        <w:t xml:space="preserve">We can do that. And if they're part of our in-home experience, we can even come and put the place in the groceries inside their fridge or they're panting. So that connecting all those things is the way we're thinking about it. right? Adding this, we have also services. So recently, we announced that we now members get free photo prints through our photo services benefit, and free money transfer transactions. We also have all of care benefits associated with membership. So we have these services that go along with the retail benefits. And last year we launched pharmacy benefits. So you can get pharmacy delivered to you for free as well. Holistically, when you look at this, that's the goal. That's how we're thinking about it. This is an ecosystem, and how do we connect stores, shopping, e-commerce, pharmacy, fuel, streaming, and all these other things that people rely on on a day-to-day basis to offer this great experience where everything works seemlessly.</w:t>
+      </w:r>
+    </w:p>
+    <w:p>
+      <w:pPr>
+        <w:spacing w:after="140" w:line="300"/>
+      </w:pPr>
+      <w:r>
+        <w:rPr>
+          <w:sz w:val="21"/>
+          <w:szCs w:val="21"/>
+        </w:rPr>
+        <w:t xml:space="preserve">So how do you better success? Because that is a lot of moving parts all at once. Yeah. Yeah. So let me talk a little bit about convenience and from there I'll build. So I just said for me, convenience is about choice. It's of course about saving people time and helping them save money. But convenience is also a hard choice. And I gave you an example of how customers want to shop with us, to give them multitude of choice. And that, and denying that, we know that when that happens, frequency improves. We know that members shall 3 times as more frequently as non-members, and spend 4 times as much as non-members, but 7 times more e-commerce players. So that's what we see. We see that when we deliver on the promise of being an essential part of their life, they engage with us more. And as a result, they've been the shock with us more.</w:t>
+      </w:r>
+    </w:p>
+    <w:p>
+      <w:pPr>
+        <w:spacing w:after="140" w:line="300"/>
+      </w:pPr>
+      <w:r>
+        <w:rPr>
+          <w:sz w:val="21"/>
+          <w:szCs w:val="21"/>
+        </w:rPr>
+        <w:t xml:space="preserve">So, ancient body ancients, except for those. So, when you look at the, for people mentioned, there's a little bit, the meals, uh, we are also looking at me, because we said it was a customer. And that, our vision, our vision, our vision, in this case, like, is something small, people... So for us, again, we also have significant fish in the stores. The LPR is sick, right? Um, if you look at reference, um, people can, well, each of the senses might as well. We do index a moment, so... Because we are in a business of studying, I'm just selling it in all sorts. Our customer, the kind of cooking, the kind of computer design. Wow. They are servicing other customers support. And if we do not do a good job in making sure, we fulfill what they're from, it wouldn't be enough. Okay. So for us, measuring our your time, and then I.E.</w:t>
+      </w:r>
+    </w:p>
+    <w:p>
+      <w:pPr>
+        <w:spacing w:after="140" w:line="300"/>
+      </w:pPr>
+      <w:r>
+        <w:rPr>
+          <w:sz w:val="21"/>
+          <w:szCs w:val="21"/>
+        </w:rPr>
+        <w:t xml:space="preserve">with the service of asking about the woman. And looking back the comics, it's a combination of color. There's no single method. Yeah, so anything you might have? You like your success? I'd say it this way. Success is ultimately the customer experience, right? And, um, we we all have my church in translation, like revenue, and even all those things, like businesses have. But ultimately, you know, when you take care of the customer, all of those other things start to follow my body here. So measuring success for us is ultimately customer experience. We go at that by way of showing the franchisees and associates that are with they need to deliver it. And I would also say, you know, success is really, you know, how are our field teams going to set up your success to be able to support our franchisees as well? So there's a lot of pieces to it.</w:t>
+      </w:r>
+    </w:p>
+    <w:p>
+      <w:pPr>
+        <w:spacing w:after="140" w:line="300"/>
+      </w:pPr>
+      <w:r>
+        <w:rPr>
+          <w:sz w:val="21"/>
+          <w:szCs w:val="21"/>
+        </w:rPr>
+        <w:t xml:space="preserve">We have the same old metrics as everybody else. We're in the metric, every company, we're also API ribbon. But, you know, I would say the ultimate success is, you know, when you walk into an UPS store, you need having experience with a local woman, and you feel connected to that store because it's part of your community. And you feel like you have, that's what's successful. It's like, you know, really... So, actually, we talked a little bit about... Dad, I actually know what success looks like. You also have a modern data points with your... Plus, yeah, I was just... Being real-time diet now. So what are you doing with those types of signals? So it's. What is most important is how fast we come into Japan? I was important there. I'm using the light signal for making that it's used for the rest of Apple. All of us talk about Christmas, movies, and fiction.</w:t>
+      </w:r>
+    </w:p>
+    <w:p>
+      <w:pPr>
+        <w:spacing w:after="140" w:line="300"/>
+      </w:pPr>
+      <w:r>
+        <w:rPr>
+          <w:sz w:val="21"/>
+          <w:szCs w:val="21"/>
+        </w:rPr>
+        <w:t xml:space="preserve">And that fiction reduces, really, in the conversation, you have to think, situation, you have to come next to another, that might have a signal in the us. You have to look that more with Naran. and create that art that is good for us. Whether you in the store, or on the website, or you... So that's what is made. Yeah. And it has that 1st improvement made, changes, eyes, or operate, or design. But since that's exciting, you're overnight? Yeah, so we can do action at least. That's also really, like, experience of the personalized. Communications are prescribed. any touch point in the person? So now, imagine this, right? You are in the store, having the information of where your product is, which might have already, if you're approved, you're all you want. And it's important to make sure that product interests on time is a job site or you're picking it up.</w:t>
+      </w:r>
+    </w:p>
+    <w:p>
+      <w:pPr>
+        <w:spacing w:after="140" w:line="300"/>
+      </w:pPr>
+      <w:r>
+        <w:rPr>
+          <w:sz w:val="21"/>
+          <w:szCs w:val="21"/>
+        </w:rPr>
+        <w:t xml:space="preserve">At the same time, if you are on the website, you're trying to leave fine products, whether you are in Baiu or the UR, the right time browsing through everything, right? Understanding the not the intent, you need to super important, right? Imagine this, like within a home, you can have unexual hobbies of want. Yeah, you're trying to do something in your fiction or your bathroom or your room. So having access to that information? super relevant. And that actually, uh, has changed how we contextualize experiences and also, uh, action, like, well, very, very much. Like, I'm so proud. And let me tell you, this political is where we don't own the customer contact. Did you have franchise, marketplace, resellers? What advice would you give them about how do we focus on that technology, touch the customer, but then also build on a reality? Great question. And, you know, we operated a traditional sort of forth in order environment where, you know, you have people across the counter.</w:t>
+      </w:r>
+    </w:p>
+    <w:p>
+      <w:pPr>
+        <w:spacing w:after="140" w:line="300"/>
+      </w:pPr>
+      <w:r>
+        <w:rPr>
+          <w:sz w:val="21"/>
+          <w:szCs w:val="21"/>
+        </w:rPr>
+        <w:t xml:space="preserve">Some of you may not. And what I would say is, regardless of what your business or industry is, you have somebody or something interacting with professor food, right? I think. So what I would do before launching any technology, this is something we do all the time, is we look at the process, the experience that the customers have in. And then what friction or problems we want to solve for that to make it better? So I would start with the foundational thing. The things you've heard me talk about are really about customer 1st approach. It's about enabling and equipping, uh, team that is delivering service to a customer to be able to do that. You know, that's that's engagement and that's operation life. But then where I believe innovation and technology plays in it, is that those things are enablers and accelerators are free enough. And so if you don't have a solid foundation, of the experience and operational excellence, whatever that process is for you, then I would start to raise your foundation on law.</w:t>
+      </w:r>
+    </w:p>
+    <w:p>
+      <w:pPr>
+        <w:spacing w:after="140" w:line="300"/>
+      </w:pPr>
+      <w:r>
+        <w:rPr>
+          <w:sz w:val="21"/>
+          <w:szCs w:val="21"/>
+        </w:rPr>
+        <w:t xml:space="preserve">And then you had the innovation to be able to say, how do I accelerate this? How do I make this even better for the customer? But we don't chase technology now. You know, I'm not the typical technology speaker up here. You know, we have technology, deep technology, but we don't chase we chase solutions for columns for customers. We have problems for our franchises and associates. And that's that's the advice I would get, is look at where customize the air experience and identify what to do. So do you have a question? Did you have some audience who was hearing, like, how to pack the woods? This has to really have. Like they feel a little behind. Like, where we can advise at the start to make a difference? A couple places. So one is how we use and think about data. I think. So we all collect a lot of data.</w:t>
+      </w:r>
+    </w:p>
+    <w:p>
+      <w:pPr>
+        <w:spacing w:after="140" w:line="300"/>
+      </w:pPr>
+      <w:r>
+        <w:rPr>
+          <w:sz w:val="21"/>
+          <w:szCs w:val="21"/>
+        </w:rPr>
+        <w:t xml:space="preserve">I'm sorry, talk about it too and analyze data. There's a lot of data science today. But I think there is this aspect of How quickly can you see if something is going to happen? Like this predictive nature of data, there's a way we think about it, which is proxy metrics. So let me talk a little bit about that. So we know for our business, retention is key. We, as I said, we're in the visions of building a long-term relationship with our customers. So if we want to make sure that they get good value as quickly as possible. So how do we know that? If we waited for too long, we would not know, or the opportunity would have passed. So we think in terms of proxy metrics, essentially, there are three activators of a good proxy vector. It is something that you can measure early.</w:t>
+      </w:r>
+    </w:p>
+    <w:p>
+      <w:pPr>
+        <w:spacing w:after="140" w:line="300"/>
+      </w:pPr>
+      <w:r>
+        <w:rPr>
+          <w:sz w:val="21"/>
+          <w:szCs w:val="21"/>
+        </w:rPr>
+        <w:t xml:space="preserve">It is something that moves quickly, and it is something that is predicted on long-term behavior. So we think of the real model to think of what would be by looking at data and saying, people who detain and people who don't retain, what is the difference in terms of how they behave, especially early on? And so, for example, we look at if somebody came in for a certain benefit, did they activate that benefit? Not quickly, the deactive it. Another thing is, multi-use or benefits. Like, are they using multiple benefits early? And we know that when members engage in multiple benefits early, that's a good predictor of how things, how they want their relationships going to fit on. But that's another thing is that not everything, not all data is people. I think in terms of what data, especially small amount of things, you can call them lodestar metric you can call them something else.</w:t>
+      </w:r>
+    </w:p>
+    <w:p>
+      <w:pPr>
+        <w:spacing w:after="140" w:line="300"/>
+      </w:pPr>
+      <w:r>
+        <w:rPr>
+          <w:sz w:val="21"/>
+          <w:szCs w:val="21"/>
+        </w:rPr>
+        <w:t xml:space="preserve">How are you focused on those things because they have more predictive power than elephants? They'll be filming those as 2 center programs that merge a tank, or I'm going to do it. Okay. So, the most important thing is, like, long, weather, exclusive, large, compass, and... connected, you know, with family, uh... So, if you've come in the study now, they're looking at all the slides it is, right? The key is a problem. We found it. I mean, are you too old? that proress I to focus on custom experiments and fiction. The immediate news could be great. I hope the projects was beautiful. The foundations are likely access to data, right? And understanding the proximity is, what you put mentioned, and understanding your brain criterion, that you need to do a few cases. Thanks, love, for people who take away. I'd want to give it to you, but it's all very distinctive backgrounds, and if you want to know really about, like some people know, what Instagrams you have previously, just kind of led you to this role, if you were saying, so you have a very kind of backed out, and you can come from Starbucks, and I got free time, so like, how do your passes turn to set you up for what you're doing now?</w:t>
+      </w:r>
+    </w:p>
+    <w:p>
+      <w:pPr>
+        <w:spacing w:after="140" w:line="300"/>
+      </w:pPr>
+      <w:r>
+        <w:rPr>
+          <w:sz w:val="21"/>
+          <w:szCs w:val="21"/>
+        </w:rPr>
+        <w:t xml:space="preserve">So I, I just had the privilege of settings, the president role here, and prior to that, I had the opportunity and privilege for the operations, for me. So that was the foundation, if you will. But, like you said, Anglo, I spent a little more of a 2 decades at Starbucks coffee company and a lot of different roles. In the US, I think, that both, maybe support center, as well as out in the field. leading large teams and company operated stores. And I would say, you know, it comes back to sort of what I've been saying along, the thread that I use is that, you know, that customer experience is never going to exceed that of the people that are delivering them. You know? The other common thread is, if you if you really identify problems well, and you 1st start with friction that is either out there for those delivering services, those that are gained, so yes.</w:t>
+      </w:r>
+    </w:p>
+    <w:p>
+      <w:pPr>
+        <w:spacing w:after="140" w:line="300"/>
+      </w:pPr>
+      <w:r>
+        <w:rPr>
+          <w:sz w:val="21"/>
+          <w:szCs w:val="21"/>
+        </w:rPr>
+        <w:t xml:space="preserve">Then you can start to really need an operational license. We got to have the right people. Like, you know, and that is a minimum requirement in stable stakes in my mind. You know, that's that's why I think culture is so important and valuable. And, you know, in this journey, that we've been on here, yes, or for the last 4 years, it's really all been about driving culture. I think we won the example, you know, for 40 plus years, our headquarters had been called HU. And when I got here, I was like, oh, wow. How would that send a message to our franchisees? They were sending orders. Like that's a military term, right? And, you know, it works. It did what it did, but we changed the name of our headquarters to the solutions and support plans. That may sound sort of trivial, but it meant a lot.</w:t>
+      </w:r>
+    </w:p>
+    <w:p>
+      <w:pPr>
+        <w:spacing w:after="140" w:line="300"/>
+      </w:pPr>
+      <w:r>
+        <w:rPr>
+          <w:sz w:val="21"/>
+          <w:szCs w:val="21"/>
+        </w:rPr>
+        <w:t xml:space="preserve">It meant a lot to our franchise owners. It has a lot to our good team members because we're in the business of delivering solutions is cool. And that's what we do. And we created a culture around that. But those experiences that I draw on from being in a service business, you know, 30 plus years, really costing those simple truths. And, you know, they don't change over time with things over it. a little bit about it? Yeah, yeah. So one of the girls in my career, I've had that opportunity for an Indian person, a Chinese person. I mean, it was services, I've been on the sat side of the sense, I've been a media company, but now... But that allowed me to do, essentially, out of a perspective. within, within lose, I don't know, an opportunity to work in different groups, right? From, like, nothing lecture, platform and clearing, the school stick, and now I'm not.</w:t>
+      </w:r>
+    </w:p>
+    <w:p>
+      <w:pPr>
+        <w:spacing w:after="140" w:line="300"/>
+      </w:pPr>
+      <w:r>
+        <w:rPr>
+          <w:sz w:val="21"/>
+          <w:szCs w:val="21"/>
+        </w:rPr>
+        <w:t xml:space="preserve">So, I think it's home to be back in London, but the law has helped me so far. essentially always have the ability to dream, you know? You have that mindset of making sure they understand the space of that, whether it is a touching, whether it is a business, but whether it is the essentially cooking in the, in the half time. He didn't take the money, nothing interesting was like. Like, I've seen labs and clues what has happened with where what happened in the past, like, so this happened on the data side, like, significant changes. And that, too, has allowed me to have this entire vision of where we are added for my parents. So we are the most important pieces, like when spanning the pizza, understanding the attention. And people give me like, wow. And making sure you are operating on 1st principles, like 3 changes, how you?</w:t>
+      </w:r>
+    </w:p>
+    <w:p>
+      <w:pPr>
+        <w:spacing w:after="140" w:line="300"/>
+      </w:pPr>
+      <w:r>
+        <w:rPr>
+          <w:sz w:val="21"/>
+          <w:szCs w:val="21"/>
+        </w:rPr>
+        <w:t xml:space="preserve">So that's that's been the key thing. It's amazing. Keep it short. I've always worked with the intersection of business, technology, and customer experience. So that's something that I've been doing. And then when I work today with Walmart, I think that the mission, the purpose of helping customers save money and live better. I think that's key. He has been key to me of all the things that I've done. And I want to just 2nd what Fred said is to take care of your customers and your associates, people who are helping customers, but everything else takes care of itself. So we focus. I can focus on those inputs. And that's been my, you know, career. Take care of the inputs and outputs will take care of itself. Okay, so one of our key things away from this event is, um, these discussion, I should say, is nurse systems optimize for engagement.</w:t>
+      </w:r>
+    </w:p>
+    <w:p>
+      <w:pPr>
+        <w:spacing w:after="140" w:line="300"/>
+      </w:pPr>
+      <w:r>
+        <w:rPr>
+          <w:sz w:val="21"/>
+          <w:szCs w:val="21"/>
+        </w:rPr>
+        <w:t xml:space="preserve">So we're really looking at, like, how you're building a tax taxi from really optimized your experience. Redirect. So your budget to test experimental exclusiveness, like that's something I was going to talk about from that. I don't underestimate the impact of service in the brands, a differentiator. Even if the brand's like, well, I work for it, I'm going before, that service element really embedded customers into the experience of the brand. But they carry on. Thank you.</w:t>
+      </w:r>
+    </w:p>
+    <w:p>
+      <w:pPr>
+        <w:pageBreakBefore/>
+        <w:spacing w:after="60"/>
+      </w:pPr>
+      <w:r>
+        <w:rPr>
+          <w:b/>
+          <w:bCs/>
+          <w:color w:val="7F7F7F"/>
+          <w:spacing w:val="40"/>
+          <w:sz w:val="18"/>
+          <w:szCs w:val="18"/>
+        </w:rPr>
+        <w:t xml:space="preserve">SESSION 3</w:t>
+      </w:r>
+    </w:p>
+    <w:p>
+      <w:pPr>
+        <w:pStyle w:val="Heading1"/>
+      </w:pPr>
+      <w:r>
+        <w:t xml:space="preserve">Unmatched: TikTok Shop session</w:t>
+      </w:r>
+    </w:p>
+    <w:tbl>
+      <w:tblPr>
+        <w:tblW w:type="dxa" w:w="9360"/>
+        <w:tblBorders>
+          <w:top w:val="single" w:color="auto" w:sz="4"/>
+          <w:left w:val="single" w:color="auto" w:sz="4"/>
+          <w:bottom w:val="single" w:color="auto" w:sz="4"/>
+          <w:right w:val="single" w:color="auto" w:sz="4"/>
+          <w:insideH w:val="single" w:color="auto" w:sz="4"/>
+          <w:insideV w:val="single" w:color="auto" w:sz="4"/>
+        </w:tblBorders>
+      </w:tblPr>
+      <w:tblGrid>
+        <w:gridCol w:w="2200"/>
+        <w:gridCol w:w="7160"/>
+      </w:tblGrid>
+      <w:tr>
+        <w:trPr>
+          <w:tblHeader/>
+        </w:trPr>
+        <w:tc>
+          <w:tcPr>
+            <w:tcW w:type="dxa" w:w="2200"/>
+            <w:tcBorders>
+              <w:top w:val="single" w:color="BFBFBF" w:sz="4"/>
+              <w:left w:val="single" w:color="BFBFBF" w:sz="4"/>
+              <w:bottom w:val="single" w:color="BFBFBF" w:sz="4"/>
+              <w:right w:val="single" w:color="BFBFBF" w:sz="4"/>
+            </w:tcBorders>
+            <w:shd w:fill="1F4E79" w:color="auto" w:val="clear"/>
+            <w:tcMar>
+              <w:top w:type="dxa" w:w="80"/>
+              <w:left w:type="dxa" w:w="120"/>
+              <w:bottom w:type="dxa" w:w="80"/>
+              <w:right w:type="dxa" w:w="120"/>
+            </w:tcMar>
+          </w:tcPr>
+          <w:p>
+            <w:r>
+              <w:rPr>
+                <w:b/>
+                <w:bCs/>
+                <w:color w:val="FFFFFF"/>
+                <w:sz w:val="20"/>
+                <w:szCs w:val="20"/>
+              </w:rPr>
+              <w:t xml:space="preserve">Session Details</w:t>
+            </w:r>
+          </w:p>
+        </w:tc>
+        <w:tc>
+          <w:tcPr>
+            <w:tcW w:type="dxa" w:w="7160"/>
+            <w:tcBorders>
+              <w:top w:val="single" w:color="BFBFBF" w:sz="4"/>
+              <w:left w:val="single" w:color="BFBFBF" w:sz="4"/>
+              <w:bottom w:val="single" w:color="BFBFBF" w:sz="4"/>
+              <w:right w:val="single" w:color="BFBFBF" w:sz="4"/>
+            </w:tcBorders>
+            <w:shd w:fill="1F4E79" w:color="auto" w:val="clear"/>
+            <w:tcMar>
+              <w:top w:type="dxa" w:w="80"/>
+              <w:left w:type="dxa" w:w="120"/>
+              <w:bottom w:type="dxa" w:w="80"/>
+              <w:right w:type="dxa" w:w="120"/>
+            </w:tcMar>
+          </w:tcPr>
+          <w:p>
+            <w:r>
+              <w:rPr>
+                <w:b/>
+                <w:bCs/>
+                <w:color w:val="FFFFFF"/>
+                <w:sz w:val="20"/>
+                <w:szCs w:val="20"/>
+              </w:rPr>
+              <w:t xml:space="preserve"/>
+            </w:r>
+          </w:p>
+        </w:tc>
+      </w:tr>
+      <w:tr>
+        <w:trPr>
+          <w:cantSplit/>
+        </w:trPr>
+        <w:tc>
+          <w:tcPr>
+            <w:tcW w:type="dxa" w:w="2200"/>
+            <w:tcBorders>
+              <w:top w:val="single" w:color="BFBFBF" w:sz="4"/>
+              <w:left w:val="single" w:color="BFBFBF" w:sz="4"/>
+              <w:bottom w:val="single" w:color="BFBFBF" w:sz="4"/>
+              <w:right w:val="single" w:color="BFBFBF" w:sz="4"/>
+            </w:tcBorders>
+            <w:tcMar>
+              <w:top w:type="dxa" w:w="80"/>
+              <w:left w:type="dxa" w:w="120"/>
+              <w:bottom w:type="dxa" w:w="80"/>
+              <w:right w:type="dxa" w:w="120"/>
+            </w:tcMar>
+          </w:tcPr>
+          <w:p>
+            <w:r>
+              <w:rPr>
+                <w:b/>
+                <w:bCs/>
+                <w:sz w:val="20"/>
+                <w:szCs w:val="20"/>
+              </w:rPr>
+              <w:t xml:space="preserve">Date</w:t>
+            </w:r>
+          </w:p>
+        </w:tc>
+        <w:tc>
+          <w:tcPr>
+            <w:tcW w:type="dxa" w:w="7160"/>
+            <w:tcBorders>
+              <w:top w:val="single" w:color="BFBFBF" w:sz="4"/>
+              <w:left w:val="single" w:color="BFBFBF" w:sz="4"/>
+              <w:bottom w:val="single" w:color="BFBFBF" w:sz="4"/>
+              <w:right w:val="single" w:color="BFBFBF" w:sz="4"/>
+            </w:tcBorders>
+            <w:tcMar>
+              <w:top w:type="dxa" w:w="80"/>
+              <w:left w:type="dxa" w:w="120"/>
+              <w:bottom w:type="dxa" w:w="80"/>
+              <w:right w:type="dxa" w:w="120"/>
+            </w:tcMar>
+          </w:tcPr>
+          <w:p>
+            <w:r>
+              <w:rPr>
+                <w:b w:val="false"/>
+                <w:bCs w:val="false"/>
+                <w:sz w:val="20"/>
+                <w:szCs w:val="20"/>
+              </w:rPr>
+              <w:t xml:space="preserve">TBC</w:t>
+            </w:r>
+          </w:p>
+        </w:tc>
+      </w:tr>
+      <w:tr>
+        <w:trPr>
+          <w:cantSplit/>
+        </w:trPr>
+        <w:tc>
+          <w:tcPr>
+            <w:tcW w:type="dxa" w:w="2200"/>
+            <w:tcBorders>
+              <w:top w:val="single" w:color="BFBFBF" w:sz="4"/>
+              <w:left w:val="single" w:color="BFBFBF" w:sz="4"/>
+              <w:bottom w:val="single" w:color="BFBFBF" w:sz="4"/>
+              <w:right w:val="single" w:color="BFBFBF" w:sz="4"/>
+            </w:tcBorders>
+            <w:shd w:fill="F2F2F2" w:color="auto" w:val="clear"/>
+            <w:tcMar>
+              <w:top w:type="dxa" w:w="80"/>
+              <w:left w:type="dxa" w:w="120"/>
+              <w:bottom w:type="dxa" w:w="80"/>
+              <w:right w:type="dxa" w:w="120"/>
+            </w:tcMar>
+          </w:tcPr>
+          <w:p>
+            <w:r>
+              <w:rPr>
+                <w:b/>
+                <w:bCs/>
+                <w:sz w:val="20"/>
+                <w:szCs w:val="20"/>
+              </w:rPr>
+              <w:t xml:space="preserve">Time</w:t>
+            </w:r>
+          </w:p>
+        </w:tc>
+        <w:tc>
+          <w:tcPr>
+            <w:tcW w:type="dxa" w:w="7160"/>
+            <w:tcBorders>
+              <w:top w:val="single" w:color="BFBFBF" w:sz="4"/>
+              <w:left w:val="single" w:color="BFBFBF" w:sz="4"/>
+              <w:bottom w:val="single" w:color="BFBFBF" w:sz="4"/>
+              <w:right w:val="single" w:color="BFBFBF" w:sz="4"/>
+            </w:tcBorders>
+            <w:shd w:fill="F2F2F2" w:color="auto" w:val="clear"/>
+            <w:tcMar>
+              <w:top w:type="dxa" w:w="80"/>
+              <w:left w:type="dxa" w:w="120"/>
+              <w:bottom w:type="dxa" w:w="80"/>
+              <w:right w:type="dxa" w:w="120"/>
+            </w:tcMar>
+          </w:tcPr>
+          <w:p>
+            <w:r>
+              <w:rPr>
+                <w:b w:val="false"/>
+                <w:bCs w:val="false"/>
+                <w:sz w:val="20"/>
+                <w:szCs w:val="20"/>
+              </w:rPr>
+              <w:t xml:space="preserve">TBC</w:t>
+            </w:r>
+          </w:p>
+        </w:tc>
+      </w:tr>
+      <w:tr>
+        <w:trPr>
+          <w:cantSplit/>
+        </w:trPr>
+        <w:tc>
+          <w:tcPr>
+            <w:tcW w:type="dxa" w:w="2200"/>
+            <w:tcBorders>
+              <w:top w:val="single" w:color="BFBFBF" w:sz="4"/>
+              <w:left w:val="single" w:color="BFBFBF" w:sz="4"/>
+              <w:bottom w:val="single" w:color="BFBFBF" w:sz="4"/>
+              <w:right w:val="single" w:color="BFBFBF" w:sz="4"/>
+            </w:tcBorders>
+            <w:tcMar>
+              <w:top w:type="dxa" w:w="80"/>
+              <w:left w:type="dxa" w:w="120"/>
+              <w:bottom w:type="dxa" w:w="80"/>
+              <w:right w:type="dxa" w:w="120"/>
+            </w:tcMar>
+          </w:tcPr>
+          <w:p>
+            <w:r>
+              <w:rPr>
+                <w:b/>
+                <w:bCs/>
+                <w:sz w:val="20"/>
+                <w:szCs w:val="20"/>
+              </w:rPr>
+              <w:t xml:space="preserve">Stage</w:t>
+            </w:r>
+          </w:p>
+        </w:tc>
+        <w:tc>
+          <w:tcPr>
+            <w:tcW w:type="dxa" w:w="7160"/>
+            <w:tcBorders>
+              <w:top w:val="single" w:color="BFBFBF" w:sz="4"/>
+              <w:left w:val="single" w:color="BFBFBF" w:sz="4"/>
+              <w:bottom w:val="single" w:color="BFBFBF" w:sz="4"/>
+              <w:right w:val="single" w:color="BFBFBF" w:sz="4"/>
+            </w:tcBorders>
+            <w:tcMar>
+              <w:top w:type="dxa" w:w="80"/>
+              <w:left w:type="dxa" w:w="120"/>
+              <w:bottom w:type="dxa" w:w="80"/>
+              <w:right w:type="dxa" w:w="120"/>
+            </w:tcMar>
+          </w:tcPr>
+          <w:p>
+            <w:r>
+              <w:rPr>
+                <w:b w:val="false"/>
+                <w:bCs w:val="false"/>
+                <w:sz w:val="20"/>
+                <w:szCs w:val="20"/>
+              </w:rPr>
+              <w:t xml:space="preserve">TBC</w:t>
+            </w:r>
+          </w:p>
+        </w:tc>
+      </w:tr>
+      <w:tr>
+        <w:trPr>
+          <w:cantSplit/>
+        </w:trPr>
+        <w:tc>
+          <w:tcPr>
+            <w:tcW w:type="dxa" w:w="2200"/>
+            <w:tcBorders>
+              <w:top w:val="single" w:color="BFBFBF" w:sz="4"/>
+              <w:left w:val="single" w:color="BFBFBF" w:sz="4"/>
+              <w:bottom w:val="single" w:color="BFBFBF" w:sz="4"/>
+              <w:right w:val="single" w:color="BFBFBF" w:sz="4"/>
+            </w:tcBorders>
+            <w:shd w:fill="F2F2F2" w:color="auto" w:val="clear"/>
+            <w:tcMar>
+              <w:top w:type="dxa" w:w="80"/>
+              <w:left w:type="dxa" w:w="120"/>
+              <w:bottom w:type="dxa" w:w="80"/>
+              <w:right w:type="dxa" w:w="120"/>
+            </w:tcMar>
+          </w:tcPr>
+          <w:p>
+            <w:r>
+              <w:rPr>
+                <w:b/>
+                <w:bCs/>
+                <w:sz w:val="20"/>
+                <w:szCs w:val="20"/>
+              </w:rPr>
+              <w:t xml:space="preserve">Notes</w:t>
+            </w:r>
+          </w:p>
+        </w:tc>
+        <w:tc>
+          <w:tcPr>
+            <w:tcW w:type="dxa" w:w="7160"/>
+            <w:tcBorders>
+              <w:top w:val="single" w:color="BFBFBF" w:sz="4"/>
+              <w:left w:val="single" w:color="BFBFBF" w:sz="4"/>
+              <w:bottom w:val="single" w:color="BFBFBF" w:sz="4"/>
+              <w:right w:val="single" w:color="BFBFBF" w:sz="4"/>
+            </w:tcBorders>
+            <w:shd w:fill="F2F2F2" w:color="auto" w:val="clear"/>
+            <w:tcMar>
+              <w:top w:type="dxa" w:w="80"/>
+              <w:left w:type="dxa" w:w="120"/>
+              <w:bottom w:type="dxa" w:w="80"/>
+              <w:right w:type="dxa" w:w="120"/>
+            </w:tcMar>
+          </w:tcPr>
+          <w:p>
+            <w:r>
+              <w:rPr>
+                <w:b w:val="false"/>
+                <w:bCs w:val="false"/>
+                <w:sz w:val="20"/>
+                <w:szCs w:val="20"/>
+              </w:rPr>
+              <w:t xml:space="preserve">Transcript; session not identified</w:t>
+            </w:r>
+          </w:p>
+        </w:tc>
+      </w:tr>
+      <w:tr>
+        <w:trPr>
+          <w:cantSplit/>
+        </w:trPr>
+        <w:tc>
+          <w:tcPr>
+            <w:tcW w:type="dxa" w:w="2200"/>
+            <w:tcBorders>
+              <w:top w:val="single" w:color="BFBFBF" w:sz="4"/>
+              <w:left w:val="single" w:color="BFBFBF" w:sz="4"/>
+              <w:bottom w:val="single" w:color="BFBFBF" w:sz="4"/>
+              <w:right w:val="single" w:color="BFBFBF" w:sz="4"/>
+            </w:tcBorders>
+            <w:tcMar>
+              <w:top w:type="dxa" w:w="80"/>
+              <w:left w:type="dxa" w:w="120"/>
+              <w:bottom w:type="dxa" w:w="80"/>
+              <w:right w:type="dxa" w:w="120"/>
+            </w:tcMar>
+          </w:tcPr>
+          <w:p>
+            <w:r>
+              <w:rPr>
+                <w:b/>
+                <w:bCs/>
+                <w:sz w:val="20"/>
+                <w:szCs w:val="20"/>
+              </w:rPr>
+              <w:t xml:space="preserve">Title</w:t>
+            </w:r>
+          </w:p>
+        </w:tc>
+        <w:tc>
+          <w:tcPr>
+            <w:tcW w:type="dxa" w:w="7160"/>
+            <w:tcBorders>
+              <w:top w:val="single" w:color="BFBFBF" w:sz="4"/>
+              <w:left w:val="single" w:color="BFBFBF" w:sz="4"/>
+              <w:bottom w:val="single" w:color="BFBFBF" w:sz="4"/>
+              <w:right w:val="single" w:color="BFBFBF" w:sz="4"/>
+            </w:tcBorders>
+            <w:tcMar>
+              <w:top w:type="dxa" w:w="80"/>
+              <w:left w:type="dxa" w:w="120"/>
+              <w:bottom w:type="dxa" w:w="80"/>
+              <w:right w:type="dxa" w:w="120"/>
+            </w:tcMar>
+          </w:tcPr>
+          <w:p>
+            <w:r>
+              <w:rPr>
+                <w:b w:val="false"/>
+                <w:bCs w:val="false"/>
+                <w:sz w:val="20"/>
+                <w:szCs w:val="20"/>
+              </w:rPr>
+              <w:t xml:space="preserve">Not yet matched to an agenda session. Moderator Neil; speakers Patrick (TikTok Shop) and Sarah, founder of Beachwaver (surnames not clear in the recording).</w:t>
+            </w:r>
+          </w:p>
+        </w:tc>
+      </w:tr>
+    </w:tbl>
+    <w:p>
+      <w:pPr>
+        <w:pStyle w:val="Heading2"/>
+      </w:pPr>
+      <w:r>
+        <w:t xml:space="preserve">Speakers</w:t>
+      </w:r>
+    </w:p>
+    <w:p>
+      <w:pPr>
+        <w:spacing w:after="120"/>
+      </w:pPr>
+      <w:r>
+        <w:rPr>
+          <w:i/>
+          <w:iCs/>
+          <w:color w:val="7F7F7F"/>
+        </w:rPr>
+        <w:t xml:space="preserve">Speakers TBC.</w:t>
+      </w:r>
+    </w:p>
+    <w:p>
+      <w:pPr>
+        <w:pStyle w:val="Heading2"/>
+      </w:pPr>
+      <w:r>
+        <w:t xml:space="preserve">Key Takeaways</w:t>
+      </w:r>
+    </w:p>
+    <w:p>
+      <w:pPr>
+        <w:pStyle w:val="ListParagraph"/>
+        <w:numPr>
+          <w:ilvl w:val="0"/>
+          <w:numId w:val="2"/>
+        </w:numPr>
+        <w:spacing w:after="60"/>
+      </w:pPr>
+      <w:r>
+        <w:t xml:space="preserve">TikTok Shop launched in the US three years ago; shopping starts with discovery rather than search, though there were over 100 billion shopping-intent searches last year. Best Buy is launching soon with 10,000+ products.</w:t>
+      </w:r>
+    </w:p>
+    <w:p>
+      <w:pPr>
+        <w:pStyle w:val="ListParagraph"/>
+        <w:numPr>
+          <w:ilvl w:val="0"/>
+          <w:numId w:val="2"/>
+        </w:numPr>
+        <w:spacing w:after="60"/>
+      </w:pPr>
+      <w:r>
+        <w:t xml:space="preserve">Live selling has no time limit (unlike a 10-minute QVC slot), so founders can educate and entertain; Beachwaver has run 465 live streams since January 2024.</w:t>
+      </w:r>
+    </w:p>
+    <w:p>
+      <w:pPr>
+        <w:pStyle w:val="ListParagraph"/>
+        <w:numPr>
+          <w:ilvl w:val="0"/>
+          <w:numId w:val="2"/>
+        </w:numPr>
+        <w:spacing w:after="60"/>
+      </w:pPr>
+      <w:r>
+        <w:t xml:space="preserve">Community drives repeat purchase and product ideas: hundreds of Beachwaver customers have ordered 30+ times, and a cow-print design requested by the community was its fastest sellout.</w:t>
+      </w:r>
+    </w:p>
+    <w:p>
+      <w:pPr>
+        <w:pStyle w:val="ListParagraph"/>
+        <w:numPr>
+          <w:ilvl w:val="0"/>
+          <w:numId w:val="2"/>
+        </w:numPr>
+        <w:spacing w:after="60"/>
+      </w:pPr>
+      <w:r>
+        <w:t xml:space="preserve">Advice: big brands should keep brand principles but be flexible in execution and give creators freedom; be consistent, since TikTok Shop is an always-on channel, not a one-off viral moment.</w:t>
+      </w:r>
+    </w:p>
+    <w:p>
+      <w:pPr>
+        <w:pStyle w:val="Heading2"/>
+      </w:pPr>
+      <w:r>
+        <w:t xml:space="preserve">Transcript</w:t>
+      </w:r>
+    </w:p>
+    <w:p>
+      <w:pPr>
+        <w:spacing w:after="120"/>
+      </w:pPr>
+      <w:r>
+        <w:rPr>
+          <w:i/>
+          <w:iCs/>
+          <w:color w:val="595959"/>
+          <w:sz w:val="18"/>
+          <w:szCs w:val="18"/>
+        </w:rPr>
+        <w:t xml:space="preserve">Automatic speech-to-text output, kept word for word; not split by speaker.</w:t>
+      </w:r>
+    </w:p>
+    <w:p>
+      <w:pPr>
+        <w:spacing w:after="120"/>
+      </w:pPr>
+      <w:r>
+        <w:rPr>
+          <w:i/>
+          <w:iCs/>
+          <w:color w:val="595959"/>
+          <w:sz w:val="18"/>
+          <w:szCs w:val="18"/>
+        </w:rPr>
+        <w:t xml:space="preserve">The recording starts partway through the moderator's introduction.</w:t>
+      </w:r>
+    </w:p>
+    <w:p>
+      <w:pPr>
+        <w:spacing w:after="140" w:line="300"/>
+      </w:pPr>
+      <w:r>
+        <w:rPr>
+          <w:sz w:val="21"/>
+          <w:szCs w:val="21"/>
+        </w:rPr>
+        <w:t xml:space="preserve">really disruptive and has been extremely fast growing is TikTok sharp. And I want to really get under the skin of what makes TikTok shop take. And so maybe starting with you, Patrick, you know, if you've been on a journey, TikTok shoppers come from being virtually nothing to a major channel. And it's a disruptive channel. So I'm just wondering if you can unpack a little bit for us. What makes TikTok shop different? Yeah, thanks, Neil, and thanks for the shot talk team that having us here. So exciting to be in Nashville and hope everyone's having a lot of fun. So TikTok shop watched in the US market 3 years ago in September. So we've been here for 3 years, and it's been so incredible to see the momentum of the platform over those 3 years. Hundreds of thousands of small and medium-sized businesses, reaching new customers, reaching new revenue heights, and increasingly, lots of major brands joining the platform as well.</w:t>
+      </w:r>
+    </w:p>
+    <w:p>
+      <w:pPr>
+        <w:spacing w:after="140" w:line="300"/>
+      </w:pPr>
+      <w:r>
+        <w:rPr>
+          <w:sz w:val="21"/>
+          <w:szCs w:val="21"/>
+        </w:rPr>
+        <w:t xml:space="preserve">Retailers like Sephora, retailers like Best Buy, just announce the launching soon with over 10,000 products. So it's been really exciting to see to see that journey. Traditional e-commerce, really over the years, has been very search based, right? Users know what it is they're looking for. They go to their favorite platform or website. They search for it, they compare the options, they buy, they transact. It's very efficient, but it sort of lost the joy of shopping. And I think TikTok Shop really brings that joy back. And so fundamentally, the big difference to TikTok shop is how users even start, right? They don't start necessarily by searching. They start by discovering. So, um, what that looks like is they might be watching a cooking tutorial video, right? And the creator is using, uh, some pots and pans or really cool, you know, uh, scratchula or cooking equipment.</w:t>
+      </w:r>
+    </w:p>
+    <w:p>
+      <w:pPr>
+        <w:spacing w:after="140" w:line="300"/>
+      </w:pPr>
+      <w:r>
+        <w:rPr>
+          <w:sz w:val="21"/>
+          <w:szCs w:val="21"/>
+        </w:rPr>
+        <w:t xml:space="preserve">And then they find the brand that is selling those products and that might be a brand or that might be a product that they never even heard about before. And so it's really revolutionized how users discover these products and also how brands connect with an audience at scale. But the last thing I'll say here is, it's not to say search has gone away. In fact, on TikTok shop last year, just in the US, we had over 100 billion e-commerce intent searches, which, you know, is something like 3000 a second, right? Of users looking for stuff to buy. And so we've really moved beyond experimental into a must have e-commerce destination for a lot of brands. Yeah, great. Thank you. Thank you, Patrick. Now, Sarah, you're very interesting because you're the living example of what you can do on TikTok. But before we get into your questions, I want to show a quick video about your journey and your brand and what you felt.</w:t>
+      </w:r>
+    </w:p>
+    <w:p>
+      <w:pPr>
+        <w:spacing w:after="140" w:line="300"/>
+      </w:pPr>
+      <w:r>
+        <w:rPr>
+          <w:sz w:val="21"/>
+          <w:szCs w:val="21"/>
+        </w:rPr>
+        <w:t xml:space="preserve">Celebrity here said that Sarah Patempa invented the beach river in 2010 because curling your hair at home wasn't easy. So she created a better way, a curling iron that their rotates for you. 12 patents, 21 trademarks, 75 innovation awards. Then came TikTok. Beach River showed up early, teaching women everywhere how to curl their hair, and building a community along the way. Since January 2024, 465 live streams, over 1400 hours in 780 million lives. NASAR has taken that spirit of innovation into each river hair hair, education, entertainment, community. The next chapter starts here. Now, Sarah, I think what's really interesting is this is parts of Yogen. It's been a really important part, but you've kind of done everything, because you've saw it on QVC, you've done Amazon, you were PNG, so you were on the corporate side before this. So you have a really interesting perspective in terms of how TikTok shop is different, and what perhaps it does, that other channels can't.</w:t>
+      </w:r>
+    </w:p>
+    <w:p>
+      <w:pPr>
+        <w:spacing w:after="140" w:line="300"/>
+      </w:pPr>
+      <w:r>
+        <w:rPr>
+          <w:sz w:val="21"/>
+          <w:szCs w:val="21"/>
+        </w:rPr>
+        <w:t xml:space="preserve">Yes. It's wild. So I have a question 1st for you guys. Who in here has gone live on TikTok? Can you guys stand up? Is everyone that's been live on TikTok themselves? Mikey, stand up. Are you the only one? They may be shy. If you're shy, then raise your hand. Okay. So this is new, then, to a lot of you guys. So what's wild about TikTok shop, live streaming, live selling, is that it is completely different than any other channel. So I launched my curling iron on QVC, January 21st of 2021. Uh, 2012. Oh, my gosh, that's over 15 years. You guys, it's like 2012. And I was on for 8 years. And what's different about going on KVC, I loved it so much. I love my models, I love my moment, but I was given 10 minutes. They were like, You have 10 minutes on national TV.</w:t>
+      </w:r>
+    </w:p>
+    <w:p>
+      <w:pPr>
+        <w:spacing w:after="140" w:line="300"/>
+      </w:pPr>
+      <w:r>
+        <w:rPr>
+          <w:sz w:val="21"/>
+          <w:szCs w:val="21"/>
+        </w:rPr>
+        <w:t xml:space="preserve">Good luck. You know, and I had to learn from my friends, like, Maureen from Tard, and Maui, and Josie. They were like, You gotta get to the point. Like, let's go 10 minutes, you're done. And I did that for many years. Maybe I got an hour, maybe, you know, did one TSV, I got the whole 24 hours, and it was amazing, and I really, like, loved that 10 minutes. Well, when, when, like, live selling started, I did that immediately on our website. When Amazon started, we were the 1st one to be on the Amazon live page, right? But then when TikTok shop came around, I was like, oh, I can go live anytime, forever. Like, for as long as I want, and I have an audience who's just watching me. So as a founder, as an inventor, someone who's creating formulas and ingredients, I want to tell that story.</w:t>
+      </w:r>
+    </w:p>
+    <w:p>
+      <w:pPr>
+        <w:spacing w:after="140" w:line="300"/>
+      </w:pPr>
+      <w:r>
+        <w:rPr>
+          <w:sz w:val="21"/>
+          <w:szCs w:val="21"/>
+        </w:rPr>
+        <w:t xml:space="preserve">I'm like, I want an audience to listen to me. I want to be like, I have a hydrogen, like, alpha bond multiplier, and then I don't have to, like, end my thought. So with TikTok shop, I can go live for 10 minutes. For an hour, for 10 hours. And we did one of our 1st 24 hour lives. I slept on the couch when my sisters went by. They talked about cats and dogs. I was like, himself, sell it. They're like, I know, the people I'm talking about their pets. And I was like, okay. Um, so TikTok shop is completely different because you're focused on the community, right? So 1st you're getting all the time in the world that you want. And if anyone on here wants to try it, turn on TikTok and just press play. Just go live, see who joins. Just try it.</w:t>
+      </w:r>
+    </w:p>
+    <w:p>
+      <w:pPr>
+        <w:spacing w:after="140" w:line="300"/>
+      </w:pPr>
+      <w:r>
+        <w:rPr>
+          <w:sz w:val="21"/>
+          <w:szCs w:val="21"/>
+        </w:rPr>
+        <w:t xml:space="preserve">Even if you're working at a company, employee generated content is huge. Because people say, who went like? I was like, my babysitter. I was like, my babysitter became a star creator. She was a nursing student and she ended up making so much money that she paid off her student debt. So there's all this opportunity there, and anybody can do it. You can go live at any point, right? That's the 1st thing. The 2nd thing is, you can educate. You can stand there and tell people all about your products, and they will listen. There's an audience sitting on TikTok right now. I go live at any given moment. I've got at least 100 people in the room. Some days I have a 1000 people in the room. I don't know how many people are in here, but imagine you're sitting there on your phone and you have a 1000 people listening about your new product lunch.</w:t>
+      </w:r>
+    </w:p>
+    <w:p>
+      <w:pPr>
+        <w:spacing w:after="140" w:line="300"/>
+      </w:pPr>
+      <w:r>
+        <w:rPr>
+          <w:sz w:val="21"/>
+          <w:szCs w:val="21"/>
+        </w:rPr>
+        <w:t xml:space="preserve">Right? And then you can put a little out spin behind it and then you got 10,000 people. Like, so there's quite a massive audience already sitting there, already waiting to listen to your story, right? And then it's entertainment. When you look at other channels, and we're really talking about how does it differ from your traditional retail, from your Amazon, from your other places, those live streams are all about quick education for a PDP. I'm like, okay, this is the product, this is how it works. I've got a couple live viewers in there on Amazon, your show. Well, last longer, right? But when you go on TikTok, it's an entertainment value. You have to bring, and it's fun. You have to think about it. Like, I brought dunk tanks in, I had to put my brother in law into dunk tank, and I was like, oh, let's go.</w:t>
+      </w:r>
+    </w:p>
+    <w:p>
+      <w:pPr>
+        <w:spacing w:after="140" w:line="300"/>
+      </w:pPr>
+      <w:r>
+        <w:rPr>
+          <w:sz w:val="21"/>
+          <w:szCs w:val="21"/>
+        </w:rPr>
+        <w:t xml:space="preserve">I mean, because it's gonna draw the enter the room rate is really important, right? There's people that may have never followed you. They're not, they might not be looking for a curling iron, but then they're like, oh, what are we doing in there? Let me enter in. Let me go see what's happening. So it's quite different, and you need to think about it as if you were hanging out with your friends, and what you would do with them. That's what you were doing on TikTok Shop. And I love that answer, because one of the things you mentioned, you said the word specifically, is community. And we're talking a lot of this conference about how AI is being used, but then there's the other side. How do you keep humanity? Patrick, that's a very interesting point. Like, how does community work on TikTok shop? What do you see within that value set that you bring to the shopper and the consumer?</w:t>
+      </w:r>
+    </w:p>
+    <w:p>
+      <w:pPr>
+        <w:spacing w:after="140" w:line="300"/>
+      </w:pPr>
+      <w:r>
+        <w:rPr>
+          <w:sz w:val="21"/>
+          <w:szCs w:val="21"/>
+        </w:rPr>
+        <w:t xml:space="preserve">Yeah, so communities are, of course, like core to TikTok, right? TikTok is really built around communities. And nobody's for you feed is the same as someone else's, right? Because everyone has different interests, and behind those interests and passions are just thousands and thousands of, or maybe even 1000000s of communities, really all over the world. The funny story, you know, the other day, I met this, you know, elderly retired couple, and I'm like, oh, I work at TikTok. And they just, they were amazed because they're really into bird watching and they found their bird watching community on TikTok. and even reconnected with some people that they knew from like 40 years ago. And also got their new binoculars from TikTok Shop because there's some merchants who are participating and engaging into that community. And so really, the difference with TikTok Shop is that, you know, an audience watches you, right?</w:t>
+      </w:r>
+    </w:p>
+    <w:p>
+      <w:pPr>
+        <w:spacing w:after="140" w:line="300"/>
+      </w:pPr>
+      <w:r>
+        <w:rPr>
+          <w:sz w:val="21"/>
+          <w:szCs w:val="21"/>
+        </w:rPr>
+        <w:t xml:space="preserve">But the community participates and engages with you, and it's a fundamentally, like, different approach. With the website, you sure you might have a newsletter, right? You might have your social channels where you can engage with users, but it's not the same as being able to go live and having your users ask questions and engage in discussion in real time. and really become part of that. So there's a huge opportunity for brands to tap into the communities in their space, right? But you also have to be thankful that, you know, what users want on TikTok is genuineness and authenticity and authentic content. And so you can't just, like, show up in a community and, you know, here's all my products, right? You need to you need to really engage with that community and add value in that community, participate in the conversation. You need to work with creators.</w:t>
+      </w:r>
+    </w:p>
+    <w:p>
+      <w:pPr>
+        <w:spacing w:after="140" w:line="300"/>
+      </w:pPr>
+      <w:r>
+        <w:rPr>
+          <w:sz w:val="21"/>
+          <w:szCs w:val="21"/>
+        </w:rPr>
+        <w:t xml:space="preserve">You need to give creators the creative freedom and flexibility to do what they know best, right? Sure, you can tell them, like, about your brand, about your products, but you need to trust the creators that the creators know how to talk to their audience, right? What they think is funny, what they think is not funny, which, you know, you as a brand owner, you might not know that. So community is just super important. And really the brands who have found the biggest success on TikTok shot are the ones who have leaned heavily into community, for sure. And sir, you've done that, because your core product, your curling iron, obviously is an extremely good salad, but one of the things is people don't necessarily buy them every day, or maybe they do. But you've extended your brand into other areas, like hair care, because you have such a strong community, they will come back and they'll repeat, bye for you.</w:t>
+      </w:r>
+    </w:p>
+    <w:p>
+      <w:pPr>
+        <w:spacing w:after="140" w:line="300"/>
+      </w:pPr>
+      <w:r>
+        <w:rPr>
+          <w:sz w:val="21"/>
+          <w:szCs w:val="21"/>
+        </w:rPr>
+        <w:t xml:space="preserve">What is your secret to creating that strong community and loyal following? My VIP OGs. That's what they're called. They have been there since day one, and you guys would just rises 35 plus, a lot of moms and grandmas, and I had a very viral show we created. We did a reality TV show, and we did five seasons of it. So we would do brand partnerships. So, like, let's say on day one, I'm gonna launch me and a tarp product. I would just retou my other friends, who are founders. If anyone here is a founder, let me know. I love to partner, 'cause I brought a lot of my friends, like Molly Sims lunched a brand, so I brought her product on with me, and it's important for me to share my love of female founders. We're 100% women now independent, no investors. So me and my sisters have done so much, it's both of them.</w:t>
+      </w:r>
+    </w:p>
+    <w:p>
+      <w:pPr>
+        <w:spacing w:after="140" w:line="300"/>
+      </w:pPr>
+      <w:r>
+        <w:rPr>
+          <w:sz w:val="21"/>
+          <w:szCs w:val="21"/>
+        </w:rPr>
+        <w:t xml:space="preserve">And to just celebrate that aspect of community, right? So last holiday season, we did something called Chief Slays, and we focused our Black Friday campaign on a new bundle every day for 32 days. We brought a new brand onto TikTok Chop. We came together, we introduced them to our audience. And what I have been shocked by, because I know a lot of you guys are probably into data, looking at Shopify or numbers, or where are you attributing the sale? And for many, many years, we would see, like, one, two purchases, right? We would get that, we have a huge EMLS, a big text spam, and we would see a new color come out, a new size. We could get them on a multi girl, like a good one of flatter, and they may add up a hairspray, right? So maybe the most four, five, right?</w:t>
+      </w:r>
+    </w:p>
+    <w:p>
+      <w:pPr>
+        <w:spacing w:after="140" w:line="300"/>
+      </w:pPr>
+      <w:r>
+        <w:rPr>
+          <w:sz w:val="21"/>
+          <w:szCs w:val="21"/>
+        </w:rPr>
+        <w:t xml:space="preserve">And then if they got a subscription, I would get them every couple months. Well, TikTok comes along, and one day, I decided to run the report and shop. I was like, I'm just curious, how much are you guys buying? Like, what's going on? And I was shocked. 100s and 100s of customers purchasing 30 plus times, 40 plus, 50 plus. And then I was like, what if I type in 100 plus of orders? And I was like, oh, my gosh. I was like, okay, you know, I'm like, granny Doreen has bought over 100 times for me. And then I, and she's like, Oh yeah, I bought for everybody the holiday. I bought from the teachers at the school, and I was like, This is amazing. That they're coming, and they're purchasing the hair care, and then they want to know. Oh, what else do you have?</w:t>
+      </w:r>
+    </w:p>
+    <w:p>
+      <w:pPr>
+        <w:spacing w:after="140" w:line="300"/>
+      </w:pPr>
+      <w:r>
+        <w:rPr>
+          <w:sz w:val="21"/>
+          <w:szCs w:val="21"/>
+        </w:rPr>
+        <w:t xml:space="preserve">Well, what else can I buy? And I'm like, okay, okay, let me launch the new stuff. So in my hair care, I built an aroma experience. I make the fragrances in Illinois, local fragrance house run by a woman, and I was like, I want to bring out candles and body butter, and fragrances, limited edition. But that's hard to introduce in, like, a mass channel when you're a hair brand, right? Not on TikTok. I was like, I'm gonna bring these items in, the aroma experience, and they all fell in love. So I worked at the charity, on the candle, and I could tell the story. I could, like, talk to them. Like, I think back the moments where I, like, cried with them, because they're like, Okay, we're gonna work with Bright Endeavors, who helps women return to the workforce. You can't do that on other channels with your customer.</w:t>
+      </w:r>
+    </w:p>
+    <w:p>
+      <w:pPr>
+        <w:spacing w:after="140" w:line="300"/>
+      </w:pPr>
+      <w:r>
+        <w:rPr>
+          <w:sz w:val="21"/>
+          <w:szCs w:val="21"/>
+        </w:rPr>
+        <w:t xml:space="preserve">And then they're like, I feel so dedicated to you in the mission. And that means a lot to a bounder into women and things that you can give back. And I think it's a phenomenal place for community. Like, I know their names. And someone from our corporate employees at Disney. I'm like, I'm one of my biggest ones and she's just a supporter. So it's really phenomenal to see the other community. We've even gone as far as designing a collection based on what they wanted. So I kept saying, what do you guys want? Is there something you would desire? If you could design a beach over, what would you design? And they all go think cow prints. Right, right, yeah. Calprit. what a cow prince. So we came on cow print at stagecoach, and it was our fastest sellout on TikTok today. They designed, we want a pink and black and white.</w:t>
+      </w:r>
+    </w:p>
+    <w:p>
+      <w:pPr>
+        <w:spacing w:after="140" w:line="300"/>
+      </w:pPr>
+      <w:r>
+        <w:rPr>
+          <w:sz w:val="21"/>
+          <w:szCs w:val="21"/>
+        </w:rPr>
+        <w:t xml:space="preserve">And so if you're in a data and if you're in a customer engagement, if you're live enough and you've learned your community, they will give you feedback. They'll say, I want a stronghold gel for you. I want a hair square for you. I will buy it. I will be the 1st one there. And they buy it. It's a really phenomenal place. think that's another really powerful component of the community, right? So, you know, it's like the content section really turned into your product innovation, an R&amp;D engine. And the brands who have really been embracing that, you know, they've learned a lot. They've received feedback about their products that, you know, would have taken like 6 months or a year and maybe like a two-way mirror, you know, user research interview session to learn and they're able to incorporate that and then design new products and and, you know, grow and beat their competitions.</w:t>
+      </w:r>
+    </w:p>
+    <w:p>
+      <w:pPr>
+        <w:spacing w:after="140" w:line="300"/>
+      </w:pPr>
+      <w:r>
+        <w:rPr>
+          <w:sz w:val="21"/>
+          <w:szCs w:val="21"/>
+        </w:rPr>
+        <w:t xml:space="preserve">What I'm interested in, though, because obviously, so you control your business and you controlled it. Wow, and you're the founder. So you can decide where you go. Obviously, the type of things necessarities are very effective for life tool value. But sometimes for the bigger brands, and I know you have a lockdown on the platform, including Best Buy wishes announce yesterday. It can be difficult because your culture is very human, it's very fast, it's very creative. How do you see those bigger brands adapting? What sort of advice would you give to a bigger brand if they're coming onto TikTok shop for the 1st time? Yeah, it's a great question and a question I get quite often, as you can imagine. A lot of companies, brand guidelines or brand standards, frameworks, really weren't designed or written with this format in mind, right? It was written with maybe a billboard or TV commercial, you know, something more static, let's say, am I?</w:t>
+      </w:r>
+    </w:p>
+    <w:p>
+      <w:pPr>
+        <w:spacing w:after="140" w:line="300"/>
+      </w:pPr>
+      <w:r>
+        <w:rPr>
+          <w:sz w:val="21"/>
+          <w:szCs w:val="21"/>
+        </w:rPr>
+        <w:t xml:space="preserve">But engaging on TikTok Shop means participating in live conversation, participating in community. So there's a couple things I say. First is that, you know, you need to stick to your framework, your principles, that's for sure. But you need to be flexible in the execution because times have changed. And the 2nd thing I often say is that, you know, the community of users, we have over well over 200 million Americans, like, active on TikTok in the US. You know, the conversation about your product, about your brand is happening, whether you're there or not. And so, you know, my recommendation is, of course, to lean in and participate in that and reap the benefits fully. But, you know, that's sort of the situation, right? So I think it's really about being flexible, being, you know, yesterday there was a lot of great sessions. You guys may have heard about too, about the sort of cultural, like, organizational mindset shift.</w:t>
+      </w:r>
+    </w:p>
+    <w:p>
+      <w:pPr>
+        <w:spacing w:after="140" w:line="300"/>
+      </w:pPr>
+      <w:r>
+        <w:rPr>
+          <w:sz w:val="21"/>
+          <w:szCs w:val="21"/>
+        </w:rPr>
+        <w:t xml:space="preserve">I think that's all really important. Um, and you need to you need to embrace that. I think it's as simple as that. Yeah, that's great. Now, we've got about a minute and 40 seconds left. So the final thing, I want to ask both of you, it's the same question for each, and maybe we'll start with you, Seres. If there are brands in the audience, people who haven't gone on TikTok want to go on TikTok shop, what's one piece of advice you would give them to make a success of it commercially? I think if you're a founder, is anyone in the room a founder? Like, you own your own business? Okay. So, for founders, it's literally turned your camera on. Like, go live tomorrow. Go live tonight. Go on the app, turn it on and just start pushing all the buttons. There's so many fun buttons.</w:t>
+      </w:r>
+    </w:p>
+    <w:p>
+      <w:pPr>
+        <w:spacing w:after="140" w:line="300"/>
+      </w:pPr>
+      <w:r>
+        <w:rPr>
+          <w:sz w:val="21"/>
+          <w:szCs w:val="21"/>
+        </w:rPr>
+        <w:t xml:space="preserve">There's so many things you can do. That's everyone, and anyone here kind of controlled their marketing. We get a huge brand. If that's you guys, yes. I think it's about, like, kind of cutting the red tape, right? You've got to come with creative ideas, but it's not a scary place. It's a beautiful, welcoming, good energy, good vibe space. And like you said, they're talking about your brand anyways. So go on, employee generated content is phenomenal. Also, think about building sets. If you're working with agencies, if you're working with somebody creative like Mikey at high school, like somebody who's like creating stuff, we're gonna be building sets. I go in the warehouse, I'm building, I'm creating. Think about that, because I think big brands understand that. Let's build a set, think about QVC. Those are beautiful sets that I was on, and I loved them, right?</w:t>
+      </w:r>
+    </w:p>
+    <w:p>
+      <w:pPr>
+        <w:spacing w:after="140" w:line="300"/>
+      </w:pPr>
+      <w:r>
+        <w:rPr>
+          <w:sz w:val="21"/>
+          <w:szCs w:val="21"/>
+        </w:rPr>
+        <w:t xml:space="preserve">Being on there where you can feel like you're entering into a space, and then you're bringing them, whether it's your, you know, your backyard garden, I'm joining the bird group, 'cause I got an owl somewhere in my backyard. Just hold on. And it's either where you're, you know, wherever you live and breathe and love what you do, or if you're comfortable in a huge studio with cameras and lights and the whole thing and a host in a set and do it. Just make that, you know, moment where you're like, I'm gonna connect with the poster. I am gonna entertain them. Yes, that's great. Patrick? My biggest, you know, takeaway is be consistent. These past three years, those brands, whether you're a small business, medium business, or a mega, you know, global brand, the ones who have been most successful on this channel are the ones that are consistent.</w:t>
+      </w:r>
+    </w:p>
+    <w:p>
+      <w:pPr>
+        <w:spacing w:after="140" w:line="300"/>
+      </w:pPr>
+      <w:r>
+        <w:rPr>
+          <w:sz w:val="21"/>
+          <w:szCs w:val="21"/>
+        </w:rPr>
+        <w:t xml:space="preserve">It is not a platform for one off viral moments. Of course, you know, everyone could have their viral moment and many do, but it's not designed just for that. It's really designed as a everyday, always on e-commerce channel. And it's kind of like, I arrived on Monday, and I walked down Broadway at 2 p.m. and all the honky tonks were playing, Windows were open, people were walking. It's like that, right? It's not Saturday at 8 PM or 9 PM. It's like, it's always on. And I think participating in finding success on TikTok shop is very much the same. And it's a nice good toilet. It's a very human, very open environment, and that's exactly what the consumer wants. Yeah, I think these days, more than ever, you know, users want that real genuine human to human story. They want to know, like, why did Sarah create this product?</w:t>
+      </w:r>
+    </w:p>
+    <w:p>
+      <w:pPr>
+        <w:spacing w:after="140" w:line="300"/>
+      </w:pPr>
+      <w:r>
+        <w:rPr>
+          <w:sz w:val="21"/>
+          <w:szCs w:val="21"/>
+        </w:rPr>
+        <w:t xml:space="preserve">Who did she create it for, right? What problem does it solve? and being able to connect at scale is something truly special. And the final point, I have to AI. Oh, real quick, the personalization in AI is very important right now. like reaching customers one by one. And I think TikTok is the human, personal, one one on one. That's great. That's a great point, Ellie. Thank you very much, Sarah. Thank you very much. Patrick. Thanks very much.</w:t>
       </w:r>
     </w:p>
     <w:sectPr>

</xml_diff>

<commit_message>
Add Shoptalk opening, Estee Lauder and AWS/Anthropic/Coresight transcripts
Co-Authored-By: Claude Opus 5.5 <noreply@anthropic.com>
Claude-Session: https://claude.ai/code/session_01KmRp2ESunoKfn1WQuEFGHQ
</commit_message>
<xml_diff>
--- a/transcripts/Shoptalk_Session_Notes.docx
+++ b/transcripts/Shoptalk_Session_Notes.docx
@@ -16,7 +16,7 @@
           <w:sz w:val="28"/>
           <w:szCs w:val="28"/>
         </w:rPr>
-        <w:t xml:space="preserve">SHOPTALK</w:t>
+        <w:t xml:space="preserve">SHOPTALK FALL 2026 (NASHVILLE)</w:t>
       </w:r>
     </w:p>
     <w:p>
@@ -1561,6 +1561,451 @@
           </w:p>
         </w:tc>
       </w:tr>
+      <w:tr>
+        <w:trPr>
+          <w:cantSplit/>
+        </w:trPr>
+        <w:tc>
+          <w:tcPr>
+            <w:tcW w:type="dxa" w:w="1500"/>
+            <w:tcBorders>
+              <w:top w:val="single" w:color="BFBFBF" w:sz="4"/>
+              <w:left w:val="single" w:color="BFBFBF" w:sz="4"/>
+              <w:bottom w:val="single" w:color="BFBFBF" w:sz="4"/>
+              <w:right w:val="single" w:color="BFBFBF" w:sz="4"/>
+            </w:tcBorders>
+            <w:shd w:fill="F2F2F2" w:color="auto" w:val="clear"/>
+            <w:tcMar>
+              <w:top w:type="dxa" w:w="80"/>
+              <w:left w:type="dxa" w:w="120"/>
+              <w:bottom w:type="dxa" w:w="80"/>
+              <w:right w:type="dxa" w:w="120"/>
+            </w:tcMar>
+          </w:tcPr>
+          <w:p>
+            <w:r>
+              <w:rPr>
+                <w:b w:val="false"/>
+                <w:bCs w:val="false"/>
+                <w:sz w:val="20"/>
+                <w:szCs w:val="20"/>
+              </w:rPr>
+              <w:t xml:space="preserve">TBC</w:t>
+            </w:r>
+          </w:p>
+        </w:tc>
+        <w:tc>
+          <w:tcPr>
+            <w:tcW w:type="dxa" w:w="1900"/>
+            <w:tcBorders>
+              <w:top w:val="single" w:color="BFBFBF" w:sz="4"/>
+              <w:left w:val="single" w:color="BFBFBF" w:sz="4"/>
+              <w:bottom w:val="single" w:color="BFBFBF" w:sz="4"/>
+              <w:right w:val="single" w:color="BFBFBF" w:sz="4"/>
+            </w:tcBorders>
+            <w:shd w:fill="F2F2F2" w:color="auto" w:val="clear"/>
+            <w:tcMar>
+              <w:top w:type="dxa" w:w="80"/>
+              <w:left w:type="dxa" w:w="120"/>
+              <w:bottom w:type="dxa" w:w="80"/>
+              <w:right w:type="dxa" w:w="120"/>
+            </w:tcMar>
+          </w:tcPr>
+          <w:p>
+            <w:r>
+              <w:rPr>
+                <w:b w:val="false"/>
+                <w:bCs w:val="false"/>
+                <w:sz w:val="20"/>
+                <w:szCs w:val="20"/>
+              </w:rPr>
+              <w:t xml:space="preserve">TBC</w:t>
+            </w:r>
+          </w:p>
+        </w:tc>
+        <w:tc>
+          <w:tcPr>
+            <w:tcW w:type="dxa" w:w="1500"/>
+            <w:tcBorders>
+              <w:top w:val="single" w:color="BFBFBF" w:sz="4"/>
+              <w:left w:val="single" w:color="BFBFBF" w:sz="4"/>
+              <w:bottom w:val="single" w:color="BFBFBF" w:sz="4"/>
+              <w:right w:val="single" w:color="BFBFBF" w:sz="4"/>
+            </w:tcBorders>
+            <w:shd w:fill="F2F2F2" w:color="auto" w:val="clear"/>
+            <w:tcMar>
+              <w:top w:type="dxa" w:w="80"/>
+              <w:left w:type="dxa" w:w="120"/>
+              <w:bottom w:type="dxa" w:w="80"/>
+              <w:right w:type="dxa" w:w="120"/>
+            </w:tcMar>
+          </w:tcPr>
+          <w:p>
+            <w:r>
+              <w:rPr>
+                <w:b w:val="false"/>
+                <w:bCs w:val="false"/>
+                <w:sz w:val="20"/>
+                <w:szCs w:val="20"/>
+              </w:rPr>
+              <w:t xml:space="preserve">TBC</w:t>
+            </w:r>
+          </w:p>
+        </w:tc>
+        <w:tc>
+          <w:tcPr>
+            <w:tcW w:type="dxa" w:w="3060"/>
+            <w:tcBorders>
+              <w:top w:val="single" w:color="BFBFBF" w:sz="4"/>
+              <w:left w:val="single" w:color="BFBFBF" w:sz="4"/>
+              <w:bottom w:val="single" w:color="BFBFBF" w:sz="4"/>
+              <w:right w:val="single" w:color="BFBFBF" w:sz="4"/>
+            </w:tcBorders>
+            <w:shd w:fill="F2F2F2" w:color="auto" w:val="clear"/>
+            <w:tcMar>
+              <w:top w:type="dxa" w:w="80"/>
+              <w:left w:type="dxa" w:w="120"/>
+              <w:bottom w:type="dxa" w:w="80"/>
+              <w:right w:type="dxa" w:w="120"/>
+            </w:tcMar>
+          </w:tcPr>
+          <w:p>
+            <w:r>
+              <w:rPr>
+                <w:b w:val="false"/>
+                <w:bCs w:val="false"/>
+                <w:sz w:val="20"/>
+                <w:szCs w:val="20"/>
+              </w:rPr>
+              <w:t xml:space="preserve">Unmatched: Agentic commerce session (AWS, Anthropic, Coresight Research)</w:t>
+            </w:r>
+          </w:p>
+        </w:tc>
+        <w:tc>
+          <w:tcPr>
+            <w:tcW w:type="dxa" w:w="1400"/>
+            <w:tcBorders>
+              <w:top w:val="single" w:color="BFBFBF" w:sz="4"/>
+              <w:left w:val="single" w:color="BFBFBF" w:sz="4"/>
+              <w:bottom w:val="single" w:color="BFBFBF" w:sz="4"/>
+              <w:right w:val="single" w:color="BFBFBF" w:sz="4"/>
+            </w:tcBorders>
+            <w:shd w:fill="F2F2F2" w:color="auto" w:val="clear"/>
+            <w:tcMar>
+              <w:top w:type="dxa" w:w="80"/>
+              <w:left w:type="dxa" w:w="120"/>
+              <w:bottom w:type="dxa" w:w="80"/>
+              <w:right w:type="dxa" w:w="120"/>
+            </w:tcMar>
+          </w:tcPr>
+          <w:p>
+            <w:r>
+              <w:rPr>
+                <w:b w:val="false"/>
+                <w:bCs w:val="false"/>
+                <w:sz w:val="20"/>
+                <w:szCs w:val="20"/>
+              </w:rPr>
+              <w:t xml:space="preserve">Transcript; session not identified</w:t>
+            </w:r>
+          </w:p>
+        </w:tc>
+      </w:tr>
+      <w:tr>
+        <w:trPr>
+          <w:cantSplit/>
+        </w:trPr>
+        <w:tc>
+          <w:tcPr>
+            <w:tcW w:type="dxa" w:w="1500"/>
+            <w:tcBorders>
+              <w:top w:val="single" w:color="BFBFBF" w:sz="4"/>
+              <w:left w:val="single" w:color="BFBFBF" w:sz="4"/>
+              <w:bottom w:val="single" w:color="BFBFBF" w:sz="4"/>
+              <w:right w:val="single" w:color="BFBFBF" w:sz="4"/>
+            </w:tcBorders>
+            <w:tcMar>
+              <w:top w:type="dxa" w:w="80"/>
+              <w:left w:type="dxa" w:w="120"/>
+              <w:bottom w:type="dxa" w:w="80"/>
+              <w:right w:type="dxa" w:w="120"/>
+            </w:tcMar>
+          </w:tcPr>
+          <w:p>
+            <w:r>
+              <w:rPr>
+                <w:b w:val="false"/>
+                <w:bCs w:val="false"/>
+                <w:sz w:val="20"/>
+                <w:szCs w:val="20"/>
+              </w:rPr>
+              <w:t xml:space="preserve">TBC</w:t>
+            </w:r>
+          </w:p>
+        </w:tc>
+        <w:tc>
+          <w:tcPr>
+            <w:tcW w:type="dxa" w:w="1900"/>
+            <w:tcBorders>
+              <w:top w:val="single" w:color="BFBFBF" w:sz="4"/>
+              <w:left w:val="single" w:color="BFBFBF" w:sz="4"/>
+              <w:bottom w:val="single" w:color="BFBFBF" w:sz="4"/>
+              <w:right w:val="single" w:color="BFBFBF" w:sz="4"/>
+            </w:tcBorders>
+            <w:tcMar>
+              <w:top w:type="dxa" w:w="80"/>
+              <w:left w:type="dxa" w:w="120"/>
+              <w:bottom w:type="dxa" w:w="80"/>
+              <w:right w:type="dxa" w:w="120"/>
+            </w:tcMar>
+          </w:tcPr>
+          <w:p>
+            <w:r>
+              <w:rPr>
+                <w:b w:val="false"/>
+                <w:bCs w:val="false"/>
+                <w:sz w:val="20"/>
+                <w:szCs w:val="20"/>
+              </w:rPr>
+              <w:t xml:space="preserve">TBC</w:t>
+            </w:r>
+          </w:p>
+        </w:tc>
+        <w:tc>
+          <w:tcPr>
+            <w:tcW w:type="dxa" w:w="1500"/>
+            <w:tcBorders>
+              <w:top w:val="single" w:color="BFBFBF" w:sz="4"/>
+              <w:left w:val="single" w:color="BFBFBF" w:sz="4"/>
+              <w:bottom w:val="single" w:color="BFBFBF" w:sz="4"/>
+              <w:right w:val="single" w:color="BFBFBF" w:sz="4"/>
+            </w:tcBorders>
+            <w:tcMar>
+              <w:top w:type="dxa" w:w="80"/>
+              <w:left w:type="dxa" w:w="120"/>
+              <w:bottom w:type="dxa" w:w="80"/>
+              <w:right w:type="dxa" w:w="120"/>
+            </w:tcMar>
+          </w:tcPr>
+          <w:p>
+            <w:r>
+              <w:rPr>
+                <w:b w:val="false"/>
+                <w:bCs w:val="false"/>
+                <w:sz w:val="20"/>
+                <w:szCs w:val="20"/>
+              </w:rPr>
+              <w:t xml:space="preserve">TBC</w:t>
+            </w:r>
+          </w:p>
+        </w:tc>
+        <w:tc>
+          <w:tcPr>
+            <w:tcW w:type="dxa" w:w="3060"/>
+            <w:tcBorders>
+              <w:top w:val="single" w:color="BFBFBF" w:sz="4"/>
+              <w:left w:val="single" w:color="BFBFBF" w:sz="4"/>
+              <w:bottom w:val="single" w:color="BFBFBF" w:sz="4"/>
+              <w:right w:val="single" w:color="BFBFBF" w:sz="4"/>
+            </w:tcBorders>
+            <w:tcMar>
+              <w:top w:type="dxa" w:w="80"/>
+              <w:left w:type="dxa" w:w="120"/>
+              <w:bottom w:type="dxa" w:w="80"/>
+              <w:right w:type="dxa" w:w="120"/>
+            </w:tcMar>
+          </w:tcPr>
+          <w:p>
+            <w:r>
+              <w:rPr>
+                <w:b w:val="false"/>
+                <w:bCs w:val="false"/>
+                <w:sz w:val="20"/>
+                <w:szCs w:val="20"/>
+              </w:rPr>
+              <w:t xml:space="preserve">Unmatched: Opening remarks</w:t>
+            </w:r>
+          </w:p>
+        </w:tc>
+        <w:tc>
+          <w:tcPr>
+            <w:tcW w:type="dxa" w:w="1400"/>
+            <w:tcBorders>
+              <w:top w:val="single" w:color="BFBFBF" w:sz="4"/>
+              <w:left w:val="single" w:color="BFBFBF" w:sz="4"/>
+              <w:bottom w:val="single" w:color="BFBFBF" w:sz="4"/>
+              <w:right w:val="single" w:color="BFBFBF" w:sz="4"/>
+            </w:tcBorders>
+            <w:tcMar>
+              <w:top w:type="dxa" w:w="80"/>
+              <w:left w:type="dxa" w:w="120"/>
+              <w:bottom w:type="dxa" w:w="80"/>
+              <w:right w:type="dxa" w:w="120"/>
+            </w:tcMar>
+          </w:tcPr>
+          <w:p>
+            <w:r>
+              <w:rPr>
+                <w:b w:val="false"/>
+                <w:bCs w:val="false"/>
+                <w:sz w:val="20"/>
+                <w:szCs w:val="20"/>
+              </w:rPr>
+              <w:t xml:space="preserve">Transcript; session not identified</w:t>
+            </w:r>
+          </w:p>
+        </w:tc>
+      </w:tr>
+      <w:tr>
+        <w:trPr>
+          <w:cantSplit/>
+        </w:trPr>
+        <w:tc>
+          <w:tcPr>
+            <w:tcW w:type="dxa" w:w="1500"/>
+            <w:tcBorders>
+              <w:top w:val="single" w:color="BFBFBF" w:sz="4"/>
+              <w:left w:val="single" w:color="BFBFBF" w:sz="4"/>
+              <w:bottom w:val="single" w:color="BFBFBF" w:sz="4"/>
+              <w:right w:val="single" w:color="BFBFBF" w:sz="4"/>
+            </w:tcBorders>
+            <w:shd w:fill="F2F2F2" w:color="auto" w:val="clear"/>
+            <w:tcMar>
+              <w:top w:type="dxa" w:w="80"/>
+              <w:left w:type="dxa" w:w="120"/>
+              <w:bottom w:type="dxa" w:w="80"/>
+              <w:right w:type="dxa" w:w="120"/>
+            </w:tcMar>
+          </w:tcPr>
+          <w:p>
+            <w:r>
+              <w:rPr>
+                <w:b w:val="false"/>
+                <w:bCs w:val="false"/>
+                <w:sz w:val="20"/>
+                <w:szCs w:val="20"/>
+              </w:rPr>
+              <w:t xml:space="preserve">TBC</w:t>
+            </w:r>
+          </w:p>
+        </w:tc>
+        <w:tc>
+          <w:tcPr>
+            <w:tcW w:type="dxa" w:w="1900"/>
+            <w:tcBorders>
+              <w:top w:val="single" w:color="BFBFBF" w:sz="4"/>
+              <w:left w:val="single" w:color="BFBFBF" w:sz="4"/>
+              <w:bottom w:val="single" w:color="BFBFBF" w:sz="4"/>
+              <w:right w:val="single" w:color="BFBFBF" w:sz="4"/>
+            </w:tcBorders>
+            <w:shd w:fill="F2F2F2" w:color="auto" w:val="clear"/>
+            <w:tcMar>
+              <w:top w:type="dxa" w:w="80"/>
+              <w:left w:type="dxa" w:w="120"/>
+              <w:bottom w:type="dxa" w:w="80"/>
+              <w:right w:type="dxa" w:w="120"/>
+            </w:tcMar>
+          </w:tcPr>
+          <w:p>
+            <w:r>
+              <w:rPr>
+                <w:b w:val="false"/>
+                <w:bCs w:val="false"/>
+                <w:sz w:val="20"/>
+                <w:szCs w:val="20"/>
+              </w:rPr>
+              <w:t xml:space="preserve">TBC</w:t>
+            </w:r>
+          </w:p>
+        </w:tc>
+        <w:tc>
+          <w:tcPr>
+            <w:tcW w:type="dxa" w:w="1500"/>
+            <w:tcBorders>
+              <w:top w:val="single" w:color="BFBFBF" w:sz="4"/>
+              <w:left w:val="single" w:color="BFBFBF" w:sz="4"/>
+              <w:bottom w:val="single" w:color="BFBFBF" w:sz="4"/>
+              <w:right w:val="single" w:color="BFBFBF" w:sz="4"/>
+            </w:tcBorders>
+            <w:shd w:fill="F2F2F2" w:color="auto" w:val="clear"/>
+            <w:tcMar>
+              <w:top w:type="dxa" w:w="80"/>
+              <w:left w:type="dxa" w:w="120"/>
+              <w:bottom w:type="dxa" w:w="80"/>
+              <w:right w:type="dxa" w:w="120"/>
+            </w:tcMar>
+          </w:tcPr>
+          <w:p>
+            <w:r>
+              <w:rPr>
+                <w:b w:val="false"/>
+                <w:bCs w:val="false"/>
+                <w:sz w:val="20"/>
+                <w:szCs w:val="20"/>
+              </w:rPr>
+              <w:t xml:space="preserve">TBC</w:t>
+            </w:r>
+          </w:p>
+        </w:tc>
+        <w:tc>
+          <w:tcPr>
+            <w:tcW w:type="dxa" w:w="3060"/>
+            <w:tcBorders>
+              <w:top w:val="single" w:color="BFBFBF" w:sz="4"/>
+              <w:left w:val="single" w:color="BFBFBF" w:sz="4"/>
+              <w:bottom w:val="single" w:color="BFBFBF" w:sz="4"/>
+              <w:right w:val="single" w:color="BFBFBF" w:sz="4"/>
+            </w:tcBorders>
+            <w:shd w:fill="F2F2F2" w:color="auto" w:val="clear"/>
+            <w:tcMar>
+              <w:top w:type="dxa" w:w="80"/>
+              <w:left w:type="dxa" w:w="120"/>
+              <w:bottom w:type="dxa" w:w="80"/>
+              <w:right w:type="dxa" w:w="120"/>
+            </w:tcMar>
+          </w:tcPr>
+          <w:p>
+            <w:r>
+              <w:rPr>
+                <w:b w:val="false"/>
+                <w:bCs w:val="false"/>
+                <w:sz w:val="20"/>
+                <w:szCs w:val="20"/>
+              </w:rPr>
+              <w:t xml:space="preserve">Unmatched: Estée Lauder Companies keynote</w:t>
+            </w:r>
+          </w:p>
+        </w:tc>
+        <w:tc>
+          <w:tcPr>
+            <w:tcW w:type="dxa" w:w="1400"/>
+            <w:tcBorders>
+              <w:top w:val="single" w:color="BFBFBF" w:sz="4"/>
+              <w:left w:val="single" w:color="BFBFBF" w:sz="4"/>
+              <w:bottom w:val="single" w:color="BFBFBF" w:sz="4"/>
+              <w:right w:val="single" w:color="BFBFBF" w:sz="4"/>
+            </w:tcBorders>
+            <w:shd w:fill="F2F2F2" w:color="auto" w:val="clear"/>
+            <w:tcMar>
+              <w:top w:type="dxa" w:w="80"/>
+              <w:left w:type="dxa" w:w="120"/>
+              <w:bottom w:type="dxa" w:w="80"/>
+              <w:right w:type="dxa" w:w="120"/>
+            </w:tcMar>
+          </w:tcPr>
+          <w:p>
+            <w:r>
+              <w:rPr>
+                <w:b w:val="false"/>
+                <w:bCs w:val="false"/>
+                <w:sz w:val="20"/>
+                <w:szCs w:val="20"/>
+              </w:rPr>
+              <w:t xml:space="preserve">Transcript; session not identified</w:t>
+            </w:r>
+          </w:p>
+        </w:tc>
+      </w:tr>
     </w:tbl>
     <w:p>
       <w:pPr>
@@ -1582,7 +2027,7 @@
           <w:sz w:val="18"/>
           <w:szCs w:val="18"/>
         </w:rPr>
-        <w:t xml:space="preserve">Times are as listed in the Shoptalk agenda. “TBC” means the detail has not been provided yet.</w:t>
+        <w:t xml:space="preserve">Times are Central Time (CT), as listed in the Shoptalk agenda. “TBC” means the detail has not been provided yet.</w:t>
       </w:r>
     </w:p>
     <w:p>
@@ -10077,6 +10522,2720 @@
         <w:t xml:space="preserve">And so you won't see breakage in a P&amp;L for Amazon Prime. So those would be the 2 things I would say. I could talk to you for hours, and then we'll have to have another session, one of these days, just the 2 of us going even more deep into Amazon Prime, guys. Thank you so much for being here, Jameel Gani, leading Amazon Prime worldwide. It is such a pleasure.</w:t>
       </w:r>
     </w:p>
+    <w:p>
+      <w:pPr>
+        <w:pageBreakBefore/>
+        <w:spacing w:after="60"/>
+      </w:pPr>
+      <w:r>
+        <w:rPr>
+          <w:b/>
+          <w:bCs/>
+          <w:color w:val="7F7F7F"/>
+          <w:spacing w:val="40"/>
+          <w:sz w:val="18"/>
+          <w:szCs w:val="18"/>
+        </w:rPr>
+        <w:t xml:space="preserve">SESSION 10</w:t>
+      </w:r>
+    </w:p>
+    <w:p>
+      <w:pPr>
+        <w:pStyle w:val="Heading1"/>
+      </w:pPr>
+      <w:r>
+        <w:t xml:space="preserve">Unmatched: Agentic commerce session (AWS, Anthropic, Coresight Research)</w:t>
+      </w:r>
+    </w:p>
+    <w:tbl>
+      <w:tblPr>
+        <w:tblW w:type="dxa" w:w="9360"/>
+        <w:tblBorders>
+          <w:top w:val="single" w:color="auto" w:sz="4"/>
+          <w:left w:val="single" w:color="auto" w:sz="4"/>
+          <w:bottom w:val="single" w:color="auto" w:sz="4"/>
+          <w:right w:val="single" w:color="auto" w:sz="4"/>
+          <w:insideH w:val="single" w:color="auto" w:sz="4"/>
+          <w:insideV w:val="single" w:color="auto" w:sz="4"/>
+        </w:tblBorders>
+      </w:tblPr>
+      <w:tblGrid>
+        <w:gridCol w:w="2200"/>
+        <w:gridCol w:w="7160"/>
+      </w:tblGrid>
+      <w:tr>
+        <w:trPr>
+          <w:tblHeader/>
+        </w:trPr>
+        <w:tc>
+          <w:tcPr>
+            <w:tcW w:type="dxa" w:w="2200"/>
+            <w:tcBorders>
+              <w:top w:val="single" w:color="BFBFBF" w:sz="4"/>
+              <w:left w:val="single" w:color="BFBFBF" w:sz="4"/>
+              <w:bottom w:val="single" w:color="BFBFBF" w:sz="4"/>
+              <w:right w:val="single" w:color="BFBFBF" w:sz="4"/>
+            </w:tcBorders>
+            <w:shd w:fill="1F4E79" w:color="auto" w:val="clear"/>
+            <w:tcMar>
+              <w:top w:type="dxa" w:w="80"/>
+              <w:left w:type="dxa" w:w="120"/>
+              <w:bottom w:type="dxa" w:w="80"/>
+              <w:right w:type="dxa" w:w="120"/>
+            </w:tcMar>
+          </w:tcPr>
+          <w:p>
+            <w:r>
+              <w:rPr>
+                <w:b/>
+                <w:bCs/>
+                <w:color w:val="FFFFFF"/>
+                <w:sz w:val="20"/>
+                <w:szCs w:val="20"/>
+              </w:rPr>
+              <w:t xml:space="preserve">Session Details</w:t>
+            </w:r>
+          </w:p>
+        </w:tc>
+        <w:tc>
+          <w:tcPr>
+            <w:tcW w:type="dxa" w:w="7160"/>
+            <w:tcBorders>
+              <w:top w:val="single" w:color="BFBFBF" w:sz="4"/>
+              <w:left w:val="single" w:color="BFBFBF" w:sz="4"/>
+              <w:bottom w:val="single" w:color="BFBFBF" w:sz="4"/>
+              <w:right w:val="single" w:color="BFBFBF" w:sz="4"/>
+            </w:tcBorders>
+            <w:shd w:fill="1F4E79" w:color="auto" w:val="clear"/>
+            <w:tcMar>
+              <w:top w:type="dxa" w:w="80"/>
+              <w:left w:type="dxa" w:w="120"/>
+              <w:bottom w:type="dxa" w:w="80"/>
+              <w:right w:type="dxa" w:w="120"/>
+            </w:tcMar>
+          </w:tcPr>
+          <w:p>
+            <w:r>
+              <w:rPr>
+                <w:b/>
+                <w:bCs/>
+                <w:color w:val="FFFFFF"/>
+                <w:sz w:val="20"/>
+                <w:szCs w:val="20"/>
+              </w:rPr>
+              <w:t xml:space="preserve"/>
+            </w:r>
+          </w:p>
+        </w:tc>
+      </w:tr>
+      <w:tr>
+        <w:trPr>
+          <w:cantSplit/>
+        </w:trPr>
+        <w:tc>
+          <w:tcPr>
+            <w:tcW w:type="dxa" w:w="2200"/>
+            <w:tcBorders>
+              <w:top w:val="single" w:color="BFBFBF" w:sz="4"/>
+              <w:left w:val="single" w:color="BFBFBF" w:sz="4"/>
+              <w:bottom w:val="single" w:color="BFBFBF" w:sz="4"/>
+              <w:right w:val="single" w:color="BFBFBF" w:sz="4"/>
+            </w:tcBorders>
+            <w:tcMar>
+              <w:top w:type="dxa" w:w="80"/>
+              <w:left w:type="dxa" w:w="120"/>
+              <w:bottom w:type="dxa" w:w="80"/>
+              <w:right w:type="dxa" w:w="120"/>
+            </w:tcMar>
+          </w:tcPr>
+          <w:p>
+            <w:r>
+              <w:rPr>
+                <w:b/>
+                <w:bCs/>
+                <w:sz w:val="20"/>
+                <w:szCs w:val="20"/>
+              </w:rPr>
+              <w:t xml:space="preserve">Date</w:t>
+            </w:r>
+          </w:p>
+        </w:tc>
+        <w:tc>
+          <w:tcPr>
+            <w:tcW w:type="dxa" w:w="7160"/>
+            <w:tcBorders>
+              <w:top w:val="single" w:color="BFBFBF" w:sz="4"/>
+              <w:left w:val="single" w:color="BFBFBF" w:sz="4"/>
+              <w:bottom w:val="single" w:color="BFBFBF" w:sz="4"/>
+              <w:right w:val="single" w:color="BFBFBF" w:sz="4"/>
+            </w:tcBorders>
+            <w:tcMar>
+              <w:top w:type="dxa" w:w="80"/>
+              <w:left w:type="dxa" w:w="120"/>
+              <w:bottom w:type="dxa" w:w="80"/>
+              <w:right w:type="dxa" w:w="120"/>
+            </w:tcMar>
+          </w:tcPr>
+          <w:p>
+            <w:r>
+              <w:rPr>
+                <w:b w:val="false"/>
+                <w:bCs w:val="false"/>
+                <w:sz w:val="20"/>
+                <w:szCs w:val="20"/>
+              </w:rPr>
+              <w:t xml:space="preserve">TBC</w:t>
+            </w:r>
+          </w:p>
+        </w:tc>
+      </w:tr>
+      <w:tr>
+        <w:trPr>
+          <w:cantSplit/>
+        </w:trPr>
+        <w:tc>
+          <w:tcPr>
+            <w:tcW w:type="dxa" w:w="2200"/>
+            <w:tcBorders>
+              <w:top w:val="single" w:color="BFBFBF" w:sz="4"/>
+              <w:left w:val="single" w:color="BFBFBF" w:sz="4"/>
+              <w:bottom w:val="single" w:color="BFBFBF" w:sz="4"/>
+              <w:right w:val="single" w:color="BFBFBF" w:sz="4"/>
+            </w:tcBorders>
+            <w:shd w:fill="F2F2F2" w:color="auto" w:val="clear"/>
+            <w:tcMar>
+              <w:top w:type="dxa" w:w="80"/>
+              <w:left w:type="dxa" w:w="120"/>
+              <w:bottom w:type="dxa" w:w="80"/>
+              <w:right w:type="dxa" w:w="120"/>
+            </w:tcMar>
+          </w:tcPr>
+          <w:p>
+            <w:r>
+              <w:rPr>
+                <w:b/>
+                <w:bCs/>
+                <w:sz w:val="20"/>
+                <w:szCs w:val="20"/>
+              </w:rPr>
+              <w:t xml:space="preserve">Time</w:t>
+            </w:r>
+          </w:p>
+        </w:tc>
+        <w:tc>
+          <w:tcPr>
+            <w:tcW w:type="dxa" w:w="7160"/>
+            <w:tcBorders>
+              <w:top w:val="single" w:color="BFBFBF" w:sz="4"/>
+              <w:left w:val="single" w:color="BFBFBF" w:sz="4"/>
+              <w:bottom w:val="single" w:color="BFBFBF" w:sz="4"/>
+              <w:right w:val="single" w:color="BFBFBF" w:sz="4"/>
+            </w:tcBorders>
+            <w:shd w:fill="F2F2F2" w:color="auto" w:val="clear"/>
+            <w:tcMar>
+              <w:top w:type="dxa" w:w="80"/>
+              <w:left w:type="dxa" w:w="120"/>
+              <w:bottom w:type="dxa" w:w="80"/>
+              <w:right w:type="dxa" w:w="120"/>
+            </w:tcMar>
+          </w:tcPr>
+          <w:p>
+            <w:r>
+              <w:rPr>
+                <w:b w:val="false"/>
+                <w:bCs w:val="false"/>
+                <w:sz w:val="20"/>
+                <w:szCs w:val="20"/>
+              </w:rPr>
+              <w:t xml:space="preserve">TBC</w:t>
+            </w:r>
+          </w:p>
+        </w:tc>
+      </w:tr>
+      <w:tr>
+        <w:trPr>
+          <w:cantSplit/>
+        </w:trPr>
+        <w:tc>
+          <w:tcPr>
+            <w:tcW w:type="dxa" w:w="2200"/>
+            <w:tcBorders>
+              <w:top w:val="single" w:color="BFBFBF" w:sz="4"/>
+              <w:left w:val="single" w:color="BFBFBF" w:sz="4"/>
+              <w:bottom w:val="single" w:color="BFBFBF" w:sz="4"/>
+              <w:right w:val="single" w:color="BFBFBF" w:sz="4"/>
+            </w:tcBorders>
+            <w:tcMar>
+              <w:top w:type="dxa" w:w="80"/>
+              <w:left w:type="dxa" w:w="120"/>
+              <w:bottom w:type="dxa" w:w="80"/>
+              <w:right w:type="dxa" w:w="120"/>
+            </w:tcMar>
+          </w:tcPr>
+          <w:p>
+            <w:r>
+              <w:rPr>
+                <w:b/>
+                <w:bCs/>
+                <w:sz w:val="20"/>
+                <w:szCs w:val="20"/>
+              </w:rPr>
+              <w:t xml:space="preserve">Stage</w:t>
+            </w:r>
+          </w:p>
+        </w:tc>
+        <w:tc>
+          <w:tcPr>
+            <w:tcW w:type="dxa" w:w="7160"/>
+            <w:tcBorders>
+              <w:top w:val="single" w:color="BFBFBF" w:sz="4"/>
+              <w:left w:val="single" w:color="BFBFBF" w:sz="4"/>
+              <w:bottom w:val="single" w:color="BFBFBF" w:sz="4"/>
+              <w:right w:val="single" w:color="BFBFBF" w:sz="4"/>
+            </w:tcBorders>
+            <w:tcMar>
+              <w:top w:type="dxa" w:w="80"/>
+              <w:left w:type="dxa" w:w="120"/>
+              <w:bottom w:type="dxa" w:w="80"/>
+              <w:right w:type="dxa" w:w="120"/>
+            </w:tcMar>
+          </w:tcPr>
+          <w:p>
+            <w:r>
+              <w:rPr>
+                <w:b w:val="false"/>
+                <w:bCs w:val="false"/>
+                <w:sz w:val="20"/>
+                <w:szCs w:val="20"/>
+              </w:rPr>
+              <w:t xml:space="preserve">TBC</w:t>
+            </w:r>
+          </w:p>
+        </w:tc>
+      </w:tr>
+      <w:tr>
+        <w:trPr>
+          <w:cantSplit/>
+        </w:trPr>
+        <w:tc>
+          <w:tcPr>
+            <w:tcW w:type="dxa" w:w="2200"/>
+            <w:tcBorders>
+              <w:top w:val="single" w:color="BFBFBF" w:sz="4"/>
+              <w:left w:val="single" w:color="BFBFBF" w:sz="4"/>
+              <w:bottom w:val="single" w:color="BFBFBF" w:sz="4"/>
+              <w:right w:val="single" w:color="BFBFBF" w:sz="4"/>
+            </w:tcBorders>
+            <w:shd w:fill="F2F2F2" w:color="auto" w:val="clear"/>
+            <w:tcMar>
+              <w:top w:type="dxa" w:w="80"/>
+              <w:left w:type="dxa" w:w="120"/>
+              <w:bottom w:type="dxa" w:w="80"/>
+              <w:right w:type="dxa" w:w="120"/>
+            </w:tcMar>
+          </w:tcPr>
+          <w:p>
+            <w:r>
+              <w:rPr>
+                <w:b/>
+                <w:bCs/>
+                <w:sz w:val="20"/>
+                <w:szCs w:val="20"/>
+              </w:rPr>
+              <w:t xml:space="preserve">Notes</w:t>
+            </w:r>
+          </w:p>
+        </w:tc>
+        <w:tc>
+          <w:tcPr>
+            <w:tcW w:type="dxa" w:w="7160"/>
+            <w:tcBorders>
+              <w:top w:val="single" w:color="BFBFBF" w:sz="4"/>
+              <w:left w:val="single" w:color="BFBFBF" w:sz="4"/>
+              <w:bottom w:val="single" w:color="BFBFBF" w:sz="4"/>
+              <w:right w:val="single" w:color="BFBFBF" w:sz="4"/>
+            </w:tcBorders>
+            <w:shd w:fill="F2F2F2" w:color="auto" w:val="clear"/>
+            <w:tcMar>
+              <w:top w:type="dxa" w:w="80"/>
+              <w:left w:type="dxa" w:w="120"/>
+              <w:bottom w:type="dxa" w:w="80"/>
+              <w:right w:type="dxa" w:w="120"/>
+            </w:tcMar>
+          </w:tcPr>
+          <w:p>
+            <w:r>
+              <w:rPr>
+                <w:b w:val="false"/>
+                <w:bCs w:val="false"/>
+                <w:sz w:val="20"/>
+                <w:szCs w:val="20"/>
+              </w:rPr>
+              <w:t xml:space="preserve">Transcript; session not identified</w:t>
+            </w:r>
+          </w:p>
+        </w:tc>
+      </w:tr>
+      <w:tr>
+        <w:trPr>
+          <w:cantSplit/>
+        </w:trPr>
+        <w:tc>
+          <w:tcPr>
+            <w:tcW w:type="dxa" w:w="2200"/>
+            <w:tcBorders>
+              <w:top w:val="single" w:color="BFBFBF" w:sz="4"/>
+              <w:left w:val="single" w:color="BFBFBF" w:sz="4"/>
+              <w:bottom w:val="single" w:color="BFBFBF" w:sz="4"/>
+              <w:right w:val="single" w:color="BFBFBF" w:sz="4"/>
+            </w:tcBorders>
+            <w:tcMar>
+              <w:top w:type="dxa" w:w="80"/>
+              <w:left w:type="dxa" w:w="120"/>
+              <w:bottom w:type="dxa" w:w="80"/>
+              <w:right w:type="dxa" w:w="120"/>
+            </w:tcMar>
+          </w:tcPr>
+          <w:p>
+            <w:r>
+              <w:rPr>
+                <w:b/>
+                <w:bCs/>
+                <w:sz w:val="20"/>
+                <w:szCs w:val="20"/>
+              </w:rPr>
+              <w:t xml:space="preserve">Title</w:t>
+            </w:r>
+          </w:p>
+        </w:tc>
+        <w:tc>
+          <w:tcPr>
+            <w:tcW w:type="dxa" w:w="7160"/>
+            <w:tcBorders>
+              <w:top w:val="single" w:color="BFBFBF" w:sz="4"/>
+              <w:left w:val="single" w:color="BFBFBF" w:sz="4"/>
+              <w:bottom w:val="single" w:color="BFBFBF" w:sz="4"/>
+              <w:right w:val="single" w:color="BFBFBF" w:sz="4"/>
+            </w:tcBorders>
+            <w:tcMar>
+              <w:top w:type="dxa" w:w="80"/>
+              <w:left w:type="dxa" w:w="120"/>
+              <w:bottom w:type="dxa" w:w="80"/>
+              <w:right w:type="dxa" w:w="120"/>
+            </w:tcMar>
+          </w:tcPr>
+          <w:p>
+            <w:r>
+              <w:rPr>
+                <w:b w:val="false"/>
+                <w:bCs w:val="false"/>
+                <w:sz w:val="20"/>
+                <w:szCs w:val="20"/>
+              </w:rPr>
+              <w:t xml:space="preserve">Not yet matched to an agenda session. A presentation by Justin (AWS, retail and consumer goods), a presentation by Marina (heads partnerships at Anthropic; name partly unclear), then a panel moderated by Deborah Weinswig (Founder &amp; CEO, Coresight Research).</w:t>
+            </w:r>
+          </w:p>
+        </w:tc>
+      </w:tr>
+    </w:tbl>
+    <w:p>
+      <w:pPr>
+        <w:pStyle w:val="Heading2"/>
+      </w:pPr>
+      <w:r>
+        <w:t xml:space="preserve">Speakers</w:t>
+      </w:r>
+    </w:p>
+    <w:p>
+      <w:pPr>
+        <w:spacing w:after="120"/>
+      </w:pPr>
+      <w:r>
+        <w:rPr>
+          <w:i/>
+          <w:iCs/>
+          <w:color w:val="7F7F7F"/>
+        </w:rPr>
+        <w:t xml:space="preserve">Speakers TBC.</w:t>
+      </w:r>
+    </w:p>
+    <w:p>
+      <w:pPr>
+        <w:pStyle w:val="Heading2"/>
+      </w:pPr>
+      <w:r>
+        <w:t xml:space="preserve">Key Takeaways</w:t>
+      </w:r>
+    </w:p>
+    <w:p>
+      <w:pPr>
+        <w:pStyle w:val="ListParagraph"/>
+        <w:numPr>
+          <w:ilvl w:val="0"/>
+          <w:numId w:val="2"/>
+        </w:numPr>
+        <w:spacing w:after="60"/>
+      </w:pPr>
+      <w:r>
+        <w:t xml:space="preserve">AWS: most retailers are still held back by fragmented data (multiple ERPs, separate commerce systems); agentic AI is already live at Amazon in Rufus/Alexa for Shopping, Buy for Me, advertising and the internal tool Amazon Quick.</w:t>
+      </w:r>
+    </w:p>
+    <w:p>
+      <w:pPr>
+        <w:pStyle w:val="ListParagraph"/>
+        <w:numPr>
+          <w:ilvl w:val="0"/>
+          <w:numId w:val="2"/>
+        </w:numPr>
+        <w:spacing w:after="60"/>
+      </w:pPr>
+      <w:r>
+        <w:t xml:space="preserve">Anthropic: three modalities of agentic commerce; the open-source Claude Commerce Agent covers consumer-facing, merchandising and supply-chain agents, with about 35% larger carts and 60% higher conversion reported.</w:t>
+      </w:r>
+    </w:p>
+    <w:p>
+      <w:pPr>
+        <w:pStyle w:val="ListParagraph"/>
+        <w:numPr>
+          <w:ilvl w:val="0"/>
+          <w:numId w:val="2"/>
+        </w:numPr>
+        <w:spacing w:after="60"/>
+      </w:pPr>
+      <w:r>
+        <w:t xml:space="preserve">Coresight: a 75% increase in agentic build for commerce in the last 90 days; AI leadership roles are increasingly reporting to the CEO.</w:t>
+      </w:r>
+    </w:p>
+    <w:p>
+      <w:pPr>
+        <w:pStyle w:val="ListParagraph"/>
+        <w:numPr>
+          <w:ilvl w:val="0"/>
+          <w:numId w:val="2"/>
+        </w:numPr>
+        <w:spacing w:after="60"/>
+      </w:pPr>
+      <w:r>
+        <w:t xml:space="preserve">Retailer concerns from the AI council: connecting stores and e-commerce, proving the value of AI, supply chain, cybersecurity and change management; many retailers are hiring, not cutting.</w:t>
+      </w:r>
+    </w:p>
+    <w:p>
+      <w:pPr>
+        <w:pStyle w:val="ListParagraph"/>
+        <w:numPr>
+          <w:ilvl w:val="0"/>
+          <w:numId w:val="2"/>
+        </w:numPr>
+        <w:spacing w:after="60"/>
+      </w:pPr>
+      <w:r>
+        <w:t xml:space="preserve">Advice: ask to see AI working with real customers, invest in change management, and keep the customer at the centre.</w:t>
+      </w:r>
+    </w:p>
+    <w:p>
+      <w:pPr>
+        <w:pStyle w:val="Heading2"/>
+      </w:pPr>
+      <w:r>
+        <w:t xml:space="preserve">Transcript</w:t>
+      </w:r>
+    </w:p>
+    <w:p>
+      <w:pPr>
+        <w:spacing w:after="120"/>
+      </w:pPr>
+      <w:r>
+        <w:rPr>
+          <w:i/>
+          <w:iCs/>
+          <w:color w:val="595959"/>
+          <w:sz w:val="18"/>
+          <w:szCs w:val="18"/>
+        </w:rPr>
+        <w:t xml:space="preserve">Automatic speech-to-text output, kept word for word; not split by speaker.</w:t>
+      </w:r>
+    </w:p>
+    <w:p>
+      <w:pPr>
+        <w:spacing w:after="120"/>
+      </w:pPr>
+      <w:r>
+        <w:rPr>
+          <w:i/>
+          <w:iCs/>
+          <w:color w:val="595959"/>
+          <w:sz w:val="18"/>
+          <w:szCs w:val="18"/>
+        </w:rPr>
+        <w:t xml:space="preserve">The recording starts partway through the opening introductions.</w:t>
+      </w:r>
+    </w:p>
+    <w:p>
+      <w:pPr>
+        <w:spacing w:after="140" w:line="300"/>
+      </w:pPr>
+      <w:r>
+        <w:rPr>
+          <w:sz w:val="21"/>
+          <w:szCs w:val="21"/>
+        </w:rPr>
+        <w:t xml:space="preserve">I mean, to top it off, we have a top analyst in retail. Foresight Research, CEO, founder, deadlines, wig, where's that? Over here? How do you know, course site? All right, if you don't, I look them up and sign up for their content, because they are the top industry in LSM retail. So that's our plan for today. Thank you. So glad you get that you all were here, and as we go through today, you'll have a chance to get to know each other, and also, we'll hit some content. We've passed a lot into the 55 minutes that we have or even less than that now. So if you've got questions as we go, yeah, we'll be around afterwards. A bunch of folks are here from our team, so we can address those with you, so to know that we'll not answer your question, that we don't get to it during the session day.</w:t>
+      </w:r>
+    </w:p>
+    <w:p>
+      <w:pPr>
+        <w:spacing w:after="140" w:line="300"/>
+      </w:pPr>
+      <w:r>
+        <w:rPr>
+          <w:sz w:val="21"/>
+          <w:szCs w:val="21"/>
+        </w:rPr>
+        <w:t xml:space="preserve">Cool. All right, here we go. So let's jump in. So, um, how many of your Amos, my customers? Thank you. Thank you. Thank you for being customed. How many of you know you know what AWS is? Okay, wow. That's maj. Oh, you, well, good. So our mission in Amazon is we are supposed customer centered company. One thing I love about Amazon is, like, how clear our mission is. It's tied in everything we do, and it was unsizable. I mean, we have a million and a half employees, we operate 130 countries for their scale here, which is why a lot of our customers, many of our customers, work with us, right? And if you think about Amazon, from a broader perspective, I mentioned AWS. I mentioned it was on retail, right? Some of you are leveraging our supply chain services, shipping, returns, Bible crime, but that's a whole nother part of the business.</w:t>
+      </w:r>
+    </w:p>
+    <w:p>
+      <w:pPr>
+        <w:spacing w:after="140" w:line="300"/>
+      </w:pPr>
+      <w:r>
+        <w:rPr>
+          <w:sz w:val="21"/>
+          <w:szCs w:val="21"/>
+        </w:rPr>
+        <w:t xml:space="preserve">Some of you are leveraging our emails on business, and I direct B&amp;B business. And what we find in retail, we're here to find the HOV, is that most of the week order we work with are operating with five, six, seven, eight businesses. So, Amazon sizable, and that scales helpful, then we're going to deliver capable and services and solutions to our us. So, of course, the topic for, at least this week, I mean, it seems like every week right now, is all about that, and the conversation, I mean, for agenda conference. How many of you are using, like, AI pools in your day to day work? Okay, good. I mean, a year ago, I'm not sure that would have been all the number of pans in there, right? Not even six months ago. In fact, even for us at Amazon, we only, a couple months ago, got our session claims on quick.</w:t>
+      </w:r>
+    </w:p>
+    <w:p>
+      <w:pPr>
+        <w:spacing w:after="140" w:line="300"/>
+      </w:pPr>
+      <w:r>
+        <w:rPr>
+          <w:sz w:val="21"/>
+          <w:szCs w:val="21"/>
+        </w:rPr>
+        <w:t xml:space="preserve">But a lot is happening in the AI space. So, just in the last two years, everybody, you can see, how do I mean, AI, because we started back in the mid '90s, AWS, started in 2006. But the last two years, significant, and that's the power in the check, and the model business. We're in the application of services business, right? And some of you have been in touch for a minute. And you remember the big day to days. I don't know reason for him, but maybe a little not. I mean, do you remember a big idea? Um, so, yeah, and what's interesting about retail is I learned to do AI we, you'd be clean, or access to clean, you know, eye interest one. You have clean, you know, thank you, dear. And the challenge that we need, that we try to work with is, take out this aggregated systems.</w:t>
+      </w:r>
+    </w:p>
+    <w:p>
+      <w:pPr>
+        <w:spacing w:after="140" w:line="300"/>
+      </w:pPr>
+      <w:r>
+        <w:rPr>
+          <w:sz w:val="21"/>
+          <w:szCs w:val="21"/>
+        </w:rPr>
+        <w:t xml:space="preserve">They have ERPs that are still on print on the cloud. You have the conversation systems that are built separately, just from store. You've got multiple data platforms and no problem. Hard to do AI, right? And so, well, this chart, and why, everyone has moved forward, the identification, most of our customers in retail are still struggling. Yeah, I think data, working as a friendship. I mean, totally. And so, yeah, there's a lot of excitement and energy around it just in common. We would try Egyptic commerce back to, like, last January, kind of when we 1st started seeing a lot of discussions that we kind of transitioned out of the JAI days, right? It seemed like that was like 3 or 4 years, and then agenda has just exploded 18 or 19 months. And of course, I, of course, when I've got up here later, but yesterday we had the AI council meeting with, of course, I, and I mean, the numbers were stupid.</w:t>
+      </w:r>
+    </w:p>
+    <w:p>
+      <w:pPr>
+        <w:spacing w:after="140" w:line="300"/>
+      </w:pPr>
+      <w:r>
+        <w:rPr>
+          <w:sz w:val="21"/>
+          <w:szCs w:val="21"/>
+        </w:rPr>
+        <w:t xml:space="preserve">We look at the applications of software that are going to be agentified by the word that I use very often. And then look by playing 30, size in the retail market. And the potential impact for agentive commerce on retail?. So one of the challenges I would just offer to me today is an honest year here to learn. And I think that's so cool that you all spend the time with us. You chose, we are from an hour. But keeping a foot in, this market is moving so fast, everything something doing different is happening, and including from the partner of popular music, right? I keep put in the game, even when you're back doing the data. You can store it open, you're running the commerce, killing customers, that just keeps a foot at each time. IT thing this is important. And as we're looking at Q1, we're already starting to plan for NRF.</w:t>
+      </w:r>
+    </w:p>
+    <w:p>
+      <w:pPr>
+        <w:spacing w:after="140" w:line="300"/>
+      </w:pPr>
+      <w:r>
+        <w:rPr>
+          <w:sz w:val="21"/>
+          <w:szCs w:val="21"/>
+        </w:rPr>
+        <w:t xml:space="preserve">That's the beat, the National Recal Federation, big shows, with you, will be there in January. We're already planning ahead. It will be all about authentic, right? I think every partner, every customer there will be talking agentic, but there's more to it. Right now, we're starting to talk about, like, how does AI enable supply game? and marketing, advertising, retail media. I mean, what retail media is so important? Seems like I told you on the list, right? Product innovation and consumer goods. Powerful use cases around the jumping cover. So, and then Cyrus Security, which everyone should care about, is our number one security's our top priority in the US, and should be your top priorities, especially with the news dances in AI. But these are some things to be thinking about as you get towards 2027, which, oh, by the way, really three months out. What is the most of the trip we're preparing for holiday, right?</w:t>
+      </w:r>
+    </w:p>
+    <w:p>
+      <w:pPr>
+        <w:spacing w:after="140" w:line="300"/>
+      </w:pPr>
+      <w:r>
+        <w:rPr>
+          <w:sz w:val="21"/>
+          <w:szCs w:val="21"/>
+        </w:rPr>
+        <w:t xml:space="preserve">You're in retail, next couple months, it's game up. Okay, so, I thought what I'd do to share with my time remaining, to show you a bit about how Amazon brought AI to life, which turns to generative AI, applications and examples, and also some agentic examples, like, is this real or not, right? Someone you might be asking? You're not around, and everybody, like, we are, people live in it every day? I thought I'd show you some examples, probably. I was going to brought to life. I'm gonna show you just a couple things. I'm thinking about, we're gonna, I'll hand Rovers with my partner, uh, greatness. Okay? Are we good? Okay, cool. All right. So, personalization, not new. Personalization has been around since, I mean, when I first got in attacking consulting, it's been around for many, many years, right? And this is where traditional personalization of the you bought this before, you know, like about this, for other people have bought this, therefore, right?</w:t>
+      </w:r>
+    </w:p>
+    <w:p>
+      <w:pPr>
+        <w:spacing w:after="140" w:line="300"/>
+      </w:pPr>
+      <w:r>
+        <w:rPr>
+          <w:sz w:val="21"/>
+          <w:szCs w:val="21"/>
+        </w:rPr>
+        <w:t xml:space="preserve">But where we've seen a lot of change is in the space, what generative AI. So the last couple years, right, when you've been in the space room a bit. So generative AI has been super exciting. There have been a lot of questions about the value of Generative AI. Is it driving revenue, or is it more, like, an optimization, or a kind of a matter of experiential play? And here's some examples of where, um, Amazon is rather still like. Now, you can see on the left, um, the summarization of reviews, like, this was really, you know, like, over years ago. That house kind of like no big deal. Maybe you have reviews on your own e-commerce sites. You know, when you do that today, you don't have to send off all your reviews for agency how then someone upbring it back. There are companies we work with that are paying hundreds of thousands of dollars to do that.</w:t>
+      </w:r>
+    </w:p>
+    <w:p>
+      <w:pPr>
+        <w:spacing w:after="140" w:line="300"/>
+      </w:pPr>
+      <w:r>
+        <w:rPr>
+          <w:sz w:val="21"/>
+          <w:szCs w:val="21"/>
+        </w:rPr>
+        <w:t xml:space="preserve">Now you put a model in it. Got that instantly, right? Virtual try on, these are some older examples of virtual try on the phone. Look, I think we put these together for NRL, two years ago. And it's kind of like, that was cool then. Now I was kind like, that you can do that today. You have your own sunglass brand, you have your own ugly brand. First one, try on is there. You don't need to create commercials and ads. We need you here in North America. You're seeing a lot of football games on the weekend. Hey, close, look at some of those audio commercials. We will see. Many of them are AI doing it, right? It's actually becoming more and more available in terms of advertising. Virtual signers, another is just quick example. This, again, this is something that 2 or 3 years ago, when Jerry May I was just kind of rolling, right?</w:t>
+      </w:r>
+    </w:p>
+    <w:p>
+      <w:pPr>
+        <w:spacing w:after="140" w:line="300"/>
+      </w:pPr>
+      <w:r>
+        <w:rPr>
+          <w:sz w:val="21"/>
+          <w:szCs w:val="21"/>
+        </w:rPr>
+        <w:t xml:space="preserve">This is a big deal now. available and inaccessible for you. on your platform. Interstarch, one of the, my phone is over here, I'm gonna just jump off the stage, and I'm gonna show you and be flexible. So, um, one thing that's really cool about, I mean, Amazon app, I think you have Amazon app. Yeah, okay. If you open it, hopefully you won't open it often. Here's the app. On the bottom, you'll see an A for a lex. at a moment on the top. Have you ever searched for product? Do the image search? How many of you? Yes.. I mean, it seems like I've been there for a while, and I just started in last year. Oh, this clicker. Two, three, four seconds. So, in this search, probably take a picture of some things in your table, try it out. This is something you can do today.</w:t>
+      </w:r>
+    </w:p>
+    <w:p>
+      <w:pPr>
+        <w:spacing w:after="140" w:line="300"/>
+      </w:pPr>
+      <w:r>
+        <w:rPr>
+          <w:sz w:val="21"/>
+          <w:szCs w:val="21"/>
+        </w:rPr>
+        <w:t xml:space="preserve">on your own decoding platform. And you're not playing. You can think it's true to sport, too. Just the same, right? Check. Um, okay, these are, these are low hanging treatment, like, AI use cases now. The ability to take images. I work for Coca Cola for 10 years. To do this, with an agency, would have been three or four months. I see a nodding head in the back. They had the agency come in. They tell what our plans are, randomly, their guidelines, and they go off, and there's really beautiful pictures to come back and come on the wall, right? Then we'd have a meeting with 12, 13, 14, 15 people. That was just from the agency. Right you decided to narrow it down. We have to get approvals, months, this, you know, this is Peter old. Just a couple minutes, right? Images. There are many CPG brands that were not ever gonna use AI for images.</w:t>
+      </w:r>
+    </w:p>
+    <w:p>
+      <w:pPr>
+        <w:spacing w:after="140" w:line="300"/>
+      </w:pPr>
+      <w:r>
+        <w:rPr>
+          <w:sz w:val="21"/>
+          <w:szCs w:val="21"/>
+        </w:rPr>
+        <w:t xml:space="preserve">Now, they're using it another day. Easy. Models have gotten really good. 60% plus a seller on amazon.com are small and the inside of the business. So, what do we need to do to enable them to be successful? Well, what am I selling? Available now. Makes it easier to sell on the iPhone. Of course, some of you may have been in our, were the Amazon ghost stores? That was our community store concept, and there's a technology called Just Walk Out Technology. And so, this is a great AI use case, because you had your skin on your way in, and we're using computer vision, and self self sensors, to create a virtual card. Pretty cool, right? NAI app at work. And you'll still see this in some airports, and some of you live in Los Angeles, or if you go to Las Vegas, you'll see, actually, some of our regional partners have, it just worked out.</w:t>
+      </w:r>
+    </w:p>
+    <w:p>
+      <w:pPr>
+        <w:spacing w:after="140" w:line="300"/>
+      </w:pPr>
+      <w:r>
+        <w:rPr>
+          <w:sz w:val="21"/>
+          <w:szCs w:val="21"/>
+        </w:rPr>
+        <w:t xml:space="preserve">Okay, so then, what about agenda, right? There's a lot of excited agents, and so what are some of the ways that Amazon's bringing us to live? So one way is through the little egg on the app that it should be. Last year, that was a search company called Rufus. How many have you ever used Rufus? Okay, wow, it's amazing. I am not surprised, because the number of besidesable in terms of the transaction going through that. Rufus is actually a dog, and that one of the Amazon employees used to have in Seattle that are offices are actually a nicely on picture of the dog. And so we took that, and that kind of became the service. And then we changed the name to Alexa for shopping. How do you have a lesson advice? Right, I mean, familiar with Lenser, right? Brand recognition. We took the service, renamed it, but then, we had so many customers say, I want that for my own retail platform, that we took it and made it into our own service that you can use.</w:t>
+      </w:r>
+    </w:p>
+    <w:p>
+      <w:pPr>
+        <w:spacing w:after="140" w:line="300"/>
+      </w:pPr>
+      <w:r>
+        <w:rPr>
+          <w:sz w:val="21"/>
+          <w:szCs w:val="21"/>
+        </w:rPr>
+        <w:t xml:space="preserve">So, worked really well on Amazon. So, millions of dollars in incremental sales, right, to not leave the, until all kinds of signs of businesses. And now you can take that and deploy it in days. Pretty cool, right? But this is the power of agenta commerce, not only the ability to take something that allows you to do it kind of enhances your search and find capability, but also something that can be deployed so quickly. So for those of you in the text space, you know, to play a piece of software, you sort of service, kind of take weeks, months, a big project with a consultant, an SI, right? We're talking a couple days to just be up and running on your product set, and we'll be able to deploy it in a couple weeks. Pretty cool. If you're not doing that, you should be thinking about that.</w:t>
+      </w:r>
+    </w:p>
+    <w:p>
+      <w:pPr>
+        <w:spacing w:after="140" w:line="300"/>
+      </w:pPr>
+      <w:r>
+        <w:rPr>
+          <w:sz w:val="21"/>
+          <w:szCs w:val="21"/>
+        </w:rPr>
+        <w:t xml:space="preserve">More than 80 customers of ours, in just 4 months, are working towards dependence on our platform. And not only do our retailers, In fact, there's many other industries at CBD brands that are highly interested in taking this and providing better access to providing data. Cool, right. So a lot of conversation around inbound agents, on site agents, and outbound agents. A lot of conversations. A lot of energy and news about this as well. I'm not gonna give you, like, an answer today about what's the right way to think about this, but it's a conversation to be thinking about, what you're peer, you do about this morning. And now it'll be, I'm on a platform, I'm searching, it comes into your sight, right? You're using, let's say, a chat, you can eat or a publesky, doesn't make them. How found will be, I'll say an example, on Amazon buy for me.</w:t>
+      </w:r>
+    </w:p>
+    <w:p>
+      <w:pPr>
+        <w:spacing w:after="140" w:line="300"/>
+      </w:pPr>
+      <w:r>
+        <w:rPr>
+          <w:sz w:val="21"/>
+          <w:szCs w:val="21"/>
+        </w:rPr>
+        <w:t xml:space="preserve">I look for a product that Amazon's not there. But don't worry. We know where it is, and we're gonna either send you there to complete the transaction, or you complete it and read Amazon an environment. Okay, and then on site is more of what I just showed you with a licensed topic. So, who doesn't be thinking about? And then, as an example, I just mentioned the Amazon, how we deployed this, and this is something you can find, and also, you'll see a top up of bi-direct, how we get the website. We have many partners that sell only specific parts of their portfolio on amazon.com. right? And for those of you that understand channel planning, you know that you decide certain products for certain channels in a certain price, right? So that's essentially what you have. But the nice thing about agentic search, whether it's on or Amazon, is the ability to go find that plot.</w:t>
+      </w:r>
+    </w:p>
+    <w:p>
+      <w:pPr>
+        <w:spacing w:after="140" w:line="300"/>
+      </w:pPr>
+      <w:r>
+        <w:rPr>
+          <w:sz w:val="21"/>
+          <w:szCs w:val="21"/>
+        </w:rPr>
+        <w:t xml:space="preserve">But there's all kinds of implications in that. Some of you are data people, and you're like, wait a second. How do I make sure? I thought I'd find them. Or am defining the right product, or that it's found in the right place at the right price. Oh, probably data discussion that we had around that as well. So it's not as simple as, let's go throw that up and then use it. It's something that you have to straggy around the partner organization. A couple other examples of agentic, you know, the delivery from any of you in many markets were delivering in less than 30 minutes. especially in the grocery side of things. Amazon has decided in grocery and in kind of the retail space to go from being the everything store to be in the everyday story. I want you to come to Amazon first, find product, and you can see the expansion and delivery capabilities, especially with grocery and delivery timing.</w:t>
+      </w:r>
+    </w:p>
+    <w:p>
+      <w:pPr>
+        <w:spacing w:after="140" w:line="300"/>
+      </w:pPr>
+      <w:r>
+        <w:rPr>
+          <w:sz w:val="21"/>
+          <w:szCs w:val="21"/>
+        </w:rPr>
+        <w:t xml:space="preserve">And finally, many of you are also using Amazon advertising to drive either business to your products, selling on the Amazon or off site, to other platforms. And we're using agents to do that now. Like, this is real. This isn't, like, some test hoping to launch in a couple months. And if I, just challenge you, if I can, if you're feeling behind, it's okay. But just know a lot of people are working to try to get to a place where they can start using ages, get the data in a better place, and be able to unable to people's organization know how to use it, right? And create a little bit of attention for you. I mentioned video earlier, this is a year ago, there's a puma ad, one of our agency partners put together all those agents using agents for different parts of creation of that video, because it's only 12 months ago.</w:t>
+      </w:r>
+    </w:p>
+    <w:p>
+      <w:pPr>
+        <w:spacing w:after="140" w:line="300"/>
+      </w:pPr>
+      <w:r>
+        <w:rPr>
+          <w:sz w:val="21"/>
+          <w:szCs w:val="21"/>
+        </w:rPr>
+        <w:t xml:space="preserve">I didn't put the ad into it at this time, but 12 months later, this stuff's moving weekly. Like, the ability to do images of videos, especially with agents. And last, we actually rolled out a solution called Amazon Quick internally. This is literally in the last 3 or 4 months. You know, I got an email saying, download this, connect it to your files on your machine, to Slack, to Salesforce, to all kinds of things, and start using it. There was no training. It was just here. And it's so simple, and so easy, and so good. We do a lot of lighting today, I was on, we call six pages. Man, I think you put six papers together, like, two seconds. At least the first trap, right? I've read awards for people, like people that plan the basement. event. I put in a couple bullets, and it will summarize and create the most amazing write-up using our leadership principles, ever.</w:t>
+      </w:r>
+    </w:p>
+    <w:p>
+      <w:pPr>
+        <w:spacing w:after="140" w:line="300"/>
+      </w:pPr>
+      <w:r>
+        <w:rPr>
+          <w:sz w:val="21"/>
+          <w:szCs w:val="21"/>
+        </w:rPr>
+        <w:t xml:space="preserve">Most of you probably have a tool like this on your laptop or a desktop today. If you don't, you will, I promise this will be, we think there's only a matter of weeks and months before most of our customers are even using this or another solution like it. Because it's so accessible, so easy to collect, technically consistent for you and your nature. And this will change how you do that, how you do category planning, trade promotion management, revenue group management. Chopper execution, play integration. They're an amazing use case, right? But only if you're not listening to me, right? In the pool remember something. So, what's changing? quite a bit in retail. And when I talk about many of these today, we do spend an entire hour on what these look like. But let me just give you the last 5 year, uh, couple takeaways. Number one, we see agents, the agent deployment process, like it's expanding rapidly.</w:t>
+      </w:r>
+    </w:p>
+    <w:p>
+      <w:pPr>
+        <w:spacing w:after="140" w:line="300"/>
+      </w:pPr>
+      <w:r>
+        <w:rPr>
+          <w:sz w:val="21"/>
+          <w:szCs w:val="21"/>
+        </w:rPr>
+        <w:t xml:space="preserve">It isn't even wrong. Don't engineer is wrong. It's already moving so quickly, and you're seeing this. You're gonna follow those pictures. We're doing this. Second is date of modernization. I think I've covered that enough where, I mean, it's just, it's a priority. You see customers accelerating, the move to the cloud, you see cover, accelerating, the use of data platforms, like data versus snowflake. I mean, you're seeing this. I want to take advantage. You can buildings. We're seeing vendor agnostics. There are a lot of vendors in this room here today. We're seeing best of great selections for capabilities. And finally, cybersecurity, I've already talked about is your capitalist, and it wasn't in the past. One thing I mentioned yesterday at our AI council, it was like last question, what is your advice? One thing I would say is, don't take our word for it. We can ask to see it working.</w:t>
+      </w:r>
+    </w:p>
+    <w:p>
+      <w:pPr>
+        <w:spacing w:after="140" w:line="300"/>
+      </w:pPr>
+      <w:r>
+        <w:rPr>
+          <w:sz w:val="21"/>
+          <w:szCs w:val="21"/>
+        </w:rPr>
+        <w:t xml:space="preserve">Not just like we're almost the pool working, those do demos. Or talk to a customer. There's a lot of noise and excitement in AI. Not shiny objects, have some food, okay? And last but not least, chain men to the people. Like, I feel like it's, you know, if you've been a type of consulting, it's always last but not least, right? Change management always gets cut from the budget. I have customers that want to deploy AI, but they can't, because of progenitors of real losing their job. For the coder, thinks they're better than model. There's a lot of people are really good. So with that, thank you. I gonna hand it over to Marina's, and she's gonna come up and talk about, and problem. Right? Hi, everyone. Can you hear me? Where am I home? Here we go. Thank you for joining, and everyone who's reminding me of this claw board.</w:t>
+      </w:r>
+    </w:p>
+    <w:p>
+      <w:pPr>
+        <w:spacing w:after="140" w:line="300"/>
+      </w:pPr>
+      <w:r>
+        <w:rPr>
+          <w:sz w:val="21"/>
+          <w:szCs w:val="21"/>
+        </w:rPr>
+        <w:t xml:space="preserve">Thank you. But the feedback of your power users, I'm around, and how did you take your feedback, so you can continue proving it. Have you used quad for dresses, Thomas? Okay no one. Great. Hopefully, we can move it, you to figure out how to use squad and advent comics. I'm Renas, and I leave our group of partnerships at the profit, and we've launched, we've been fairly quiet in the Shanti Commerce compared to some other labs, and we've actually just entered the space about a month ago, and I'm here to share a little bit more of that, what that looks like. And what is on the horizon. So what's, what would the scene, in terms of attending commerce, that happened? The space is moving so fast, we're affecting the roads from back here. In 2025, really, what we saw was AI was really used for search.</w:t>
+      </w:r>
+    </w:p>
+    <w:p>
+      <w:pPr>
+        <w:spacing w:after="140" w:line="300"/>
+      </w:pPr>
+      <w:r>
+        <w:rPr>
+          <w:sz w:val="21"/>
+          <w:szCs w:val="21"/>
+        </w:rPr>
+        <w:t xml:space="preserve">So there were about 2 billion searches a month to really understand, you know, what should a loser use. In 2026, what we're seeing is more anti facilitated, so they have more information about who you are, what is your intent, and they're helping you choose. And now, at the stage that we're evolving into with some of the new agents that have come out, is really more around facilitating that end time flow. So now they know who you are, they have that intent, and now they're able to go out there and be your agent and work with the merchant agents.. And that's the r really starting a couple months ago. I'm not gonna get to give you a sunset. I wanna ground you. And what is a gente commerce? There's so many different definitions of it, and the way I learned about it is when you're using an AI agent to help you from discovery to some element of purchase.</w:t>
+      </w:r>
+    </w:p>
+    <w:p>
+      <w:pPr>
+        <w:spacing w:after="140" w:line="300"/>
+      </w:pPr>
+      <w:r>
+        <w:rPr>
+          <w:sz w:val="21"/>
+          <w:szCs w:val="21"/>
+        </w:rPr>
+        <w:t xml:space="preserve">And there are many ways we don't want it, like, to make life sense of commerce. The first modality was really within our surface. So, where you are working with Claw to figure out what you might want to purchase. And I'll get that sends you a little bit more to be. Um, that'll be your way to do a little bit, uh, what you want to do, your business, a subscription, etc. Well, that's become very strongly about truly being the intelligence layer, where we want to be an undiased, here, sweet, beautiful, you think you're a student. You do not want this intermediate emotions. So we really, then, redirects, so you go to the market site, and the market owns the relationship with that. And I oftentimes get asked, How can I make sure I fill up under service? And it's really pretty annoying. It's making sure that bots are allowed to be on your websites.</w:t>
+      </w:r>
+    </w:p>
+    <w:p>
+      <w:pPr>
+        <w:spacing w:after="140" w:line="300"/>
+      </w:pPr>
+      <w:r>
+        <w:rPr>
+          <w:sz w:val="21"/>
+          <w:szCs w:val="21"/>
+        </w:rPr>
+        <w:t xml:space="preserve">You make sure your CDMs are not blocking them, check your robots out TST. So it's really important to just make sure they have access. The second piece of it is just making sure your data is really simple in HTML formats. That took up, and again, agreed, and is not hidden behind some images. So that's important. And keep it really current. And then what Claude does sometimes is understanding that you've heard your intent, and then they will understand like how they're in that ecosystem, hopefully be able to induct your data on your website and bring that rubber into our service. And then, one that, since I was ready to be invisible compactive service. So that's my dollar one. The second modality is what we're really seeing, pick up now, which is the bot going out there and exacting on your behalf on merchant services. And we've been go here, there is a merchant box that's really interesting, and a consumer box.</w:t>
+      </w:r>
+    </w:p>
+    <w:p>
+      <w:pPr>
+        <w:spacing w:after="140" w:line="300"/>
+      </w:pPr>
+      <w:r>
+        <w:rPr>
+          <w:sz w:val="21"/>
+          <w:szCs w:val="21"/>
+        </w:rPr>
+        <w:t xml:space="preserve">And we can see a world in which they will, essentially, communicate together and have compactions with the movement and the users and their thoughts working together. And the third one, which is what I'm cured, is specifically top of us, say, is where we want to reeval all the retailers to build their own thoughts, on their own outside, to own that relationship, and there's a spectrum, both of the consumer facing, to some of the back, and there were bottom walls. And that's really what we launched about a month ago in our first true entrance in Atlantic commerce. All right, so let's go back. Okay, so this is the modality foray, which is how do we enable every single retailer and merchants to have their own agents? And there are three parts to this. And you see this look like this beautiful flywheel, that has been great.</w:t>
+      </w:r>
+    </w:p>
+    <w:p>
+      <w:pPr>
+        <w:spacing w:after="140" w:line="300"/>
+      </w:pPr>
+      <w:r>
+        <w:rPr>
+          <w:sz w:val="21"/>
+          <w:szCs w:val="21"/>
+        </w:rPr>
+        <w:t xml:space="preserve">The first part is really consumer facing, which is, I think, what people primarily think about when they think by the time they commerce, we can now type in a little bit more intent, if not that I'm looking for a crib, but that I'm looking for a nursery, and my budget is under $1,000, and this is a small room, and it's going to really help you understand the process website. Here are all the things that you can possibly be. So that's the first, like, customer facing piece of it. And the 2nd thing that we are hoping to bring more light and attention to is really, how do you have the right notion for your life? Something is selling really fast. Are you losing money? Something is not selling fast. Can you actually have a discount that's more real time? So we're essentially able to tie in what's happening on the sale side with making sure your back end is now reactive in a much more real time basis to help increase that GMB that we're able to get.</w:t>
+      </w:r>
+    </w:p>
+    <w:p>
+      <w:pPr>
+        <w:spacing w:after="140" w:line="300"/>
+      </w:pPr>
+      <w:r>
+        <w:rPr>
+          <w:sz w:val="21"/>
+          <w:szCs w:val="21"/>
+        </w:rPr>
+        <w:t xml:space="preserve">And the last part is the fly chain. Something might be running low, and there can be real time alerts. There's real time, feedback loop of how to make sure the feedback you're getting when the consumer reflects in your back end, in your customer support, in your school facing agents, if you have someone. So that's what we have essentially built, and in true anthropic fashion, we have built this where it is open source, it is free to use, it is open to everyone that they want, and it is fully customizable. So what this results, and I'll dive into the details a little bit more about what this results, and what we've seen at least with some of our merchants, is much bigger baskets. So they're seeing about 35% larger parts, just because, again, there's that intent, that's where we're clear, and there's natural hot cell that's happening there.</w:t>
+      </w:r>
+    </w:p>
+    <w:p>
+      <w:pPr>
+        <w:spacing w:after="140" w:line="300"/>
+      </w:pPr>
+      <w:r>
+        <w:rPr>
+          <w:sz w:val="21"/>
+          <w:szCs w:val="21"/>
+        </w:rPr>
+        <w:t xml:space="preserve">The 2nd thing we're seeing is more jam bever salter, and that goes into ensuring your price points reflects the demand that you're seeing. And over there, we're seeing people so much higher conversion rate. So about 60%, higher probability of a user completing the purchase. And the good news is that because this is an open source, rebo with clog code as one of the capabilities, this can essentially be stood up within 15 minutes. Um, it won't be production in 15 minutes, but you can actually start testing it out within 15 minutes to see how this is becomes indoor, in your design. So, we're gonna go into a little bit of detail on what is Claude Commerce Agent, which is the name of this. where, again, what we are really doing is, we're bringing the things that we believe we're good at, which is a little bit of pedentelligence when, and we're allowing we're just making sure that you, as the retailers, the merchants, own everything else.</w:t>
+      </w:r>
+    </w:p>
+    <w:p>
+      <w:pPr>
+        <w:spacing w:after="140" w:line="300"/>
+      </w:pPr>
+      <w:r>
+        <w:rPr>
+          <w:sz w:val="21"/>
+          <w:szCs w:val="21"/>
+        </w:rPr>
+        <w:t xml:space="preserve">It is your data, it is your catalog. We're not asking you to build APIs or give us access to all your mean pot data. It just taking this rebound, this code reference that we have, and pointing it directly to your data and have. If all your systems, so this is compatible with whatever product provider you have, whatever checkouts that you have, or a payment system you have, we are being totally agnostic here, and it's your brand, it's your policies in terms of returns, liability, et cetera. And you continue to maintain that relationship with your users. And what we are really bringing in is 2 agents, so that's the consumer agents, which is going to be a lot more consumer facing, and then you have the merchant agents, which is a little bit more in the back end. We have built a harness for our models have been professed to really fall for this use case.</w:t>
+      </w:r>
+    </w:p>
+    <w:p>
+      <w:pPr>
+        <w:spacing w:after="140" w:line="300"/>
+      </w:pPr>
+      <w:r>
+        <w:rPr>
+          <w:sz w:val="21"/>
+          <w:szCs w:val="21"/>
+        </w:rPr>
+        <w:t xml:space="preserve">And the way we are essentially helping build this is with claw code, if you want to fork it, they can completely personalize this, fork it, and implement that into your business specifically. And you can essentially put in whatever car drills you want, if you want to allow a lot, don't allow a lot. You want a human Olympic, cetera. You have the ability to basically build those carwils. And I'm really excited about it. We've seen a huge, huge uptake in the industry where to see if I can find. These slides are questionable. Okay. Okay. But I will make some of different books that we've seen. So starting with Amazon, actually. So Rufus was built using clods. So what we started seeing was large companies, like Amazon, like Shopify, like Priceline, were all doing this, and we're doing very bespoke work for some of our large merchants.</w:t>
+      </w:r>
+    </w:p>
+    <w:p>
+      <w:pPr>
+        <w:spacing w:after="140" w:line="300"/>
+      </w:pPr>
+      <w:r>
+        <w:rPr>
+          <w:sz w:val="21"/>
+          <w:szCs w:val="21"/>
+        </w:rPr>
+        <w:t xml:space="preserve">And what we started to realize is, actually, we want to open this up to the broader ecosystem of merchants. And that's why we basically look across many of the merchants that are using this, and what are some of the trends that we're seeing? And we have this opportunity of this video, and we've intentionally kept it very open ended, when you can customize some person like that, as you would. Um, and we have today here to support different industries, including detail, travel, telco, um, and entertainment. It can be run via API, SUKs, Claude, manage agents, and the cardrails are already in code that you can again go out there and customize, however, if you want. And there's always that, basically, involved in some of those different things that we have to talk to in Canada. And what we've seen with our users, still, we have wits that were able to set this up in 15 minutes.</w:t>
+      </w:r>
+    </w:p>
+    <w:p>
+      <w:pPr>
+        <w:spacing w:after="140" w:line="300"/>
+      </w:pPr>
+      <w:r>
+        <w:rPr>
+          <w:sz w:val="21"/>
+          <w:szCs w:val="21"/>
+        </w:rPr>
+        <w:t xml:space="preserve">We had both agents running within one hour by one of our users, which is... And within weeks, there were you able to have this fully plugged into older system, and... So we feel like this is a really great time, if you want to build something before the holidays, and we're talking about agency commerce, and you can add withality one and vidality, too, which is, you could essentially depend on some of these AI pop options or bring new traffic, or you can also make sure the task that's coming directly to your website is optimized to making sure you increase that conversion, and make the most of a higher asset size. So that is out in the open. If you look for Claude, conversation agents, you'll see it, and you'll see exactly how you like it. All right, fine. Oh, my God. Amazing. All right. Let's get up here.</w:t>
+      </w:r>
+    </w:p>
+    <w:p>
+      <w:pPr>
+        <w:spacing w:after="140" w:line="300"/>
+      </w:pPr>
+      <w:r>
+        <w:rPr>
+          <w:sz w:val="21"/>
+          <w:szCs w:val="21"/>
+        </w:rPr>
+        <w:t xml:space="preserve">Um, will you start? Deb, why don't you use yourself while we're all getting settled here? For the other day, dead one? Uh, double one, six, zero, five, of course, I research. We may suggest, or a research organization. We also have looked at the eye council up, but that has been to my mentors back in 2023, which was a long time ago, but we had a lot of claim for conversation. She's good. AI. Used to meet another week, because everyone was wearing more, how to use AI, and we kept everything, and even our compageste. Everything is off the record. You can go to a very comfortable asking questions, right? When retailers have had challenges, which they are there. I think it is probably the individual customer basing, right? These things can happen in no time, because people have been able to get questions answered, and really follow them solved in a very real period of time to me.</w:t>
+      </w:r>
+    </w:p>
+    <w:p>
+      <w:pPr>
+        <w:spacing w:after="140" w:line="300"/>
+      </w:pPr>
+      <w:r>
+        <w:rPr>
+          <w:sz w:val="21"/>
+          <w:szCs w:val="21"/>
+        </w:rPr>
+        <w:t xml:space="preserve">We love our, you know, our love frameworks, because it's been helpful when I grow thinking. And so, we can go to the house, framework, the best framework, the new, the poor, and I'm like, But for... Yeah, we'll call you 3DI, the next dead, and then we built this impact framework, because if you think about some of the challenges that you face, and the size of your organizations, right, it probably comes with thousands of people, millions of cases, how do you govern? How do you give access? How do you learn? How do you explain? Because, I mean, things I'm gonna do, I mean, it's so cool, is, like, and, you know, what happens? Oh, you know, I'm gonna do two weeks ago, a lot. I didn't do that. And also, so, years are coming, though, we were, so, really in Boston, then we're from the maintain for, they found based on China.</w:t>
+      </w:r>
+    </w:p>
+    <w:p>
+      <w:pPr>
+        <w:spacing w:after="140" w:line="300"/>
+      </w:pPr>
+      <w:r>
+        <w:rPr>
+          <w:sz w:val="21"/>
+          <w:szCs w:val="21"/>
+        </w:rPr>
+        <w:t xml:space="preserve">So our company now are 9 countries on 4 continents, but we're just one company, right? And so, we have a T-Legos, they're in our agentic film. And so if, like, your presentation plans is, because they're like, you know, we want to, you have, At the other day, we saw subscriptions, and I'm like, no, people just want to buy one or four. She needs to be create a research store. And so they have this whole thing that they built, and I'm just like, I've been sitting on it, Disney is not on. And after they're usually like, oh, like, I just threw it up because you struggle with confidence in a way that I think you have about war. And so I think that that goes back to, I, it, it was intrigued with some of the other things. And like I said, I... I'm a stressed brainer.</w:t>
+      </w:r>
+    </w:p>
+    <w:p>
+      <w:pPr>
+        <w:spacing w:after="140" w:line="300"/>
+      </w:pPr>
+      <w:r>
+        <w:rPr>
+          <w:sz w:val="21"/>
+          <w:szCs w:val="21"/>
+        </w:rPr>
+        <w:t xml:space="preserve">I wrote, I like to think about what could be, and then go back to today, to be very happy. I think, or is this, what, what pods have really done for a lot of us is that. And so it gives all of us this room, right? the ability to have a conversation and before you'd be like, oh, yeah, sure, they're like way out there. And now I'm like, that makes total sense, right? Because with retail, there, ultimately, I will get it, and once again, I still focus on shareholder value. Because if the customer's happy and the employee is happy, that is when ultimately dress offers. Right? Because the customer is going to buy more, the employee is going to deliver a better service. And so, I think that we're in a place right now, and I still, and the news that you've also given all of us, is that in the last quarter, right?</w:t>
+      </w:r>
+    </w:p>
+    <w:p>
+      <w:pPr>
+        <w:spacing w:after="140" w:line="300"/>
+      </w:pPr>
+      <w:r>
+        <w:rPr>
+          <w:sz w:val="21"/>
+          <w:szCs w:val="21"/>
+        </w:rPr>
+        <w:t xml:space="preserve">I mean, we asked this question, you know, we dressed an earlier, we need to kind of like provide the shit. But you've got, and we're literally just about to go, like, well, here. What you can do, and what you can change, with top of the carbrails, it's there. And when the really interesting thing that we're seeing change, and I don't know what to think of this, so I'm just... So, number one, we have the last 90 days, between the 75% increase in agentic build for commerce. So that has been, I would say, having exceeded all expectations. Number two, who owns AI, the organization has changed also about the last 75, 90 days, where we're seeing, we have pay attention, you have more and more, the CIO CTO is reporting into the CFO, and you have a AI officer, a key transformation officer, recording the CEO.</w:t>
+      </w:r>
+    </w:p>
+    <w:p>
+      <w:pPr>
+        <w:spacing w:after="140" w:line="300"/>
+      </w:pPr>
+      <w:r>
+        <w:rPr>
+          <w:sz w:val="21"/>
+          <w:szCs w:val="21"/>
+        </w:rPr>
+        <w:t xml:space="preserve">So they're able to, and I think it goes back to you. It's moving so quickly. The CEO's name, that person would translate from like the tech and the financial side, what that means for the organization. So I think you have, all right, this would be on the cheese strategy, Officer, and she's a nation officer, it didn't ever work that way. It just took so long to get it done. And now, right, we're seeing very methodical approaches that are allowing that. So, Justin, you were with us yesterday. We had a conference for those of you who can practice supply in the room, and I saw crop earlier, and the strong people were there with us. is, and it was about this idea, once again, we keep opening off the record. It was the art of the possible. And so, I mean, really, your presentation was very kind of inspiring.</w:t>
+      </w:r>
+    </w:p>
+    <w:p>
+      <w:pPr>
+        <w:spacing w:after="140" w:line="300"/>
+      </w:pPr>
+      <w:r>
+        <w:rPr>
+          <w:sz w:val="21"/>
+          <w:szCs w:val="21"/>
+        </w:rPr>
+        <w:t xml:space="preserve">But, Justin, your Honor, of course, I advise the warp, just 25 retailers. We have a chair, a vicar, we have a head of governance. And then we have a secretary, and so these are our leaders in the retail and talking industry. But Justin, from what you heard, zeroizes we haven't heard before, what kind of themes can you take out that would be helpful to people in the room? Yeah, so, so thank you for being here. Yeah, yesterday, we were at Tractor Supply. was headquarters here in Nashville, and it was, 1st of all, for those in the driver's supply. Thank you for hosting us. Yeah, so it was panel after panel of leaders from retail or and also the type side of things. And I think if I had to sum up, we were trying to get to a top 5 of topics that everyone was bringing up yesterday.</w:t>
+      </w:r>
+    </w:p>
+    <w:p>
+      <w:pPr>
+        <w:spacing w:after="140" w:line="300"/>
+      </w:pPr>
+      <w:r>
+        <w:rPr>
+          <w:sz w:val="21"/>
+          <w:szCs w:val="21"/>
+        </w:rPr>
+        <w:t xml:space="preserve">One was actually brought up one of our team members, this whole connectivity between stores, any commerce, and how do you apply thinking around AI when you're trying to match up the experience in store to e-com. And for those that I see when people die in their heads, you all know that, I have to struggle today, let alone try to now apply, I think, into that, a 2nd area was, you know, the value fees of AI. So, I got it, something really big for a picture, lady, or faster, or in a different way, but like, what's the real growth? Is a genta gonna help me, like, truly grow the business or kind of operate in a way that helps me to do dynamic pricing or manage costs or sourcing? And supply chain, like if we were talking about, like, matching up store, sell through, back to inventory, can agents manage that process, and we have customers doing that, actually.</w:t>
+      </w:r>
+    </w:p>
+    <w:p>
+      <w:pPr>
+        <w:spacing w:after="140" w:line="300"/>
+      </w:pPr>
+      <w:r>
+        <w:rPr>
+          <w:sz w:val="21"/>
+          <w:szCs w:val="21"/>
+        </w:rPr>
+        <w:t xml:space="preserve">Like, there's an opportunity, right? So that was another, and then I would throw, I'll throw up 2 more, and then I'd love to hand over to Reyes. Cybersecurity, but most people don't know what that means because they're not technical or let's not their area, but they know it's important. So there's some, you know, like, really gap there. It's like, I know it's important. reading about the potential hazards of AI. I'm not sure who got that or... What think keeps everybody I mean, I dontize make a thing, but I that keeps everybody up nice. Yeah, it should. Right? I mean, I think that's the one thing, because we feel, like, we all have to have a certain mind control. But it comes to cyber and just keeping not only your people, your data, right, everything, like, safe, right? I think as humans, right, we lean into that.</w:t>
+      </w:r>
+    </w:p>
+    <w:p>
+      <w:pPr>
+        <w:spacing w:after="140" w:line="300"/>
+      </w:pPr>
+      <w:r>
+        <w:rPr>
+          <w:sz w:val="21"/>
+          <w:szCs w:val="21"/>
+        </w:rPr>
+        <w:t xml:space="preserve">And when you don't understand, right, kind of, how the bad guys are thinking about these, I have to, I'm just, like, signed up here. So, I have two cell phones, one, a lot of our larger clients have, and the rings, I pick it up, no matter where I am. I mean, the month stage probably wouldn't, but outside of that. And so, I've had this phone ring a few nights in the past, six months, and it's all been on the cyberpags. And so, everyone handles this differently, and the funny, not funny. So, one, the bad guys had since the retailer had five backups of their data. That guy's got all five copies, which they accidentally deleted. Because you think about it, bad guys have a reputation to uphold. And this is something I had never thought about, because if you pay the ransom, and then you don't get your data, and then nobody else is gonna pay the ransom.</w:t>
+      </w:r>
+    </w:p>
+    <w:p>
+      <w:pPr>
+        <w:spacing w:after="140" w:line="300"/>
+      </w:pPr>
+      <w:r>
+        <w:rPr>
+          <w:sz w:val="21"/>
+          <w:szCs w:val="21"/>
+        </w:rPr>
+        <w:t xml:space="preserve">So this is actually a very organized market that you would never think about, and so it goes back to, like, I'm certainly not dreaming of that happening, but things that you would never have thought about. So... I threw it over to Marina, so, like, I threw out a bunch of topics, but what other areas did you see from your retail customers? into those who are about their? So I'll share, like, a little bit of how it's transitioned. I used to prior to being anthropic, I used to be a Stripe and a letter, agentic, commerce there. So, I was on the team that led the open AI and sent checkout with Essay, and... But, I think, tropical ideal that happened. And it was interesting because there was a moment in time where it was damn if you do, damn if you don't, like, I think merchants did love the idea of being disermediated, but if they didn't, then they were not gonna be surfaced in the platforms, but now they were worried they were not gonna own the customer relationship.</w:t>
+      </w:r>
+    </w:p>
+    <w:p>
+      <w:pPr>
+        <w:spacing w:after="140" w:line="300"/>
+      </w:pPr>
+      <w:r>
+        <w:rPr>
+          <w:sz w:val="21"/>
+          <w:szCs w:val="21"/>
+        </w:rPr>
+        <w:t xml:space="preserve">And I think we saw that model was not necessarily the model that's the model today. I think that's a legality one, where I think ancients are starting to realize their surfaces are good for discovery. Their agents are good to do certain things, but we don't necessarily need to own that relationship. So it's been nice for the industry thing. A year ago, to go, you're going to dismediate it, potentially, you're not going to have that relationship with your customer, which is what we're seeing today is, a consumer agent is now going to go on merchandise, and there might be a little bit of, like, who is this agent? Is this, like, an actual bot? Is this a good bot? Is it a bad thought? How do I trust the thought What the identity of the bob? That's why I put a human, you know, what is, who takes on the liability?</w:t>
+      </w:r>
+    </w:p>
+    <w:p>
+      <w:pPr>
+        <w:spacing w:after="140" w:line="300"/>
+      </w:pPr>
+      <w:r>
+        <w:rPr>
+          <w:sz w:val="21"/>
+          <w:szCs w:val="21"/>
+        </w:rPr>
+        <w:t xml:space="preserve">I think these are really interesting, hard questions that the whole ecosystem is trying to answer now. And I think this is a really nice way to still make sure the merchants own that relationship. Whether it's that human in the loop, human, or their agents, and I think there's gonna be a little bit of, like, how do we continue to understand what agents want and build that relationship with this agent as well. You know, beyond the human itself. I think a really important question for people in this room is who is Anthropic working with on the retailer side? Like, who is the person? Because, you know, it may be a different job or a broader job. and then how are you help kind of guideance on path? So we work with retailers of all sizes. We're a very small sales team, which is Wildhouse Mall. Given our revenue, it would be laughable if I told you the exact number.</w:t>
+      </w:r>
+    </w:p>
+    <w:p>
+      <w:pPr>
+        <w:spacing w:after="140" w:line="300"/>
+      </w:pPr>
+      <w:r>
+        <w:rPr>
+          <w:sz w:val="21"/>
+          <w:szCs w:val="21"/>
+        </w:rPr>
+        <w:t xml:space="preserve">And so we really try to make sure our products are as easily accessible as possible without many food and intervention that's required. But we do tend to get a little bit more hands on, and our team that's the largest, is really on the Enterprise time, where they do tend to have many more CSOs and AI transmission officers, where it's a little bit of a slightly different timeline, and that requires hit the multi stakeholder conversation, where you need to get buying from variety of different those in the ecosystem in that company. But otherwise, you know, we work with anywhere from Starbucks that are doing retail to, you know, mid market, commercial, into the enterprises, but we're really more involved in that enterprise that once been interesting is, I think about a year ago, even, the persona that was, like, someone dedicated to figure out our AI strategy, versus now it's, like, AI is our strategy, you know, and everyone is thinking about it, and it's part of the broader org.</w:t>
+      </w:r>
+    </w:p>
+    <w:p>
+      <w:pPr>
+        <w:spacing w:after="140" w:line="300"/>
+      </w:pPr>
+      <w:r>
+        <w:rPr>
+          <w:sz w:val="21"/>
+          <w:szCs w:val="21"/>
+        </w:rPr>
+        <w:t xml:space="preserve">It is not just confined to 18. That sits in a company. And that's what it shows, though. So he has CEO runs about a $500 business on stage yesterday. He said, in one of a cup calls, I never expected to be talking about AI as much as I am. And how much it's driving our uses. Yeah. And I mean, you see that all the time. Yeah, um, legitative AI, do you remember when it, like, it became very much a question of, what is an AI? We were doing Gen AI days. Some of our team were here. We were posting Gen AI days for customer events and whatnot, that's kind of what. And then we had a similar type, I'd say, trend, I'll call it, last Q1. And what does a gen take? Why should I care? What is this? And it felt like we were back in the day, we were hosting, I think, days and agent day conversing.</w:t>
+      </w:r>
+    </w:p>
+    <w:p>
+      <w:pPr>
+        <w:spacing w:after="140" w:line="300"/>
+      </w:pPr>
+      <w:r>
+        <w:rPr>
+          <w:sz w:val="21"/>
+          <w:szCs w:val="21"/>
+        </w:rPr>
+        <w:t xml:space="preserve">But I'll tell you what's interesting for us is the conversation has shifted back to let's talk about supply chain. Let's talk about this. This one was, like, the next. And because it's just art, AI is kind of part of everything we do, and a solution might be, well, it could be machine learning, it could be a spreadsheet. It could be a data problem, it could be JAI, model, and dropping. It could be I mean, there's a lot of solves, right? Not everything requires agenda commerce or agenda AI. So, and what I, our team yesterday was like, Wait a second, we gotta make sure we don't get so enamored with the technology that we lose sight of the customer experience. I'm like, wait a second, why am I even doing this? Because I want to help a customer find a product. Okay, let's keep that front in the center.</w:t>
+      </w:r>
+    </w:p>
+    <w:p>
+      <w:pPr>
+        <w:spacing w:after="140" w:line="300"/>
+      </w:pPr>
+      <w:r>
+        <w:rPr>
+          <w:sz w:val="21"/>
+          <w:szCs w:val="21"/>
+        </w:rPr>
+        <w:t xml:space="preserve">So we're trying to make sure we don't lose sight of, like, the customer in the, uh, excitement of all the Johnny objects. Well, I think when you bring up this applying, which is really interesting with that profit, right? is we're moving to these digital passports. So the complexity in, let's call it, discretionary, is exponential. And it is going to be really interesting, and especially, you know, how do you think about that from a really transparency of applying, which is that everyone's dream and, you know, and fears at the same time, but how do you think about that? And as, I mean, I thought your slides were amazing. How does anthropic kind of enable and also give additional comfort to those in the room? From a purchasing standpoint, like what is going off on the supply chain and the transparency there? Oh, yeah. I think the first part is, like, how do we actually enable the merchants, the suppliers, to make sure they're incorporating AI into their workstream?</w:t>
+      </w:r>
+    </w:p>
+    <w:p>
+      <w:pPr>
+        <w:spacing w:after="140" w:line="300"/>
+      </w:pPr>
+      <w:r>
+        <w:rPr>
+          <w:sz w:val="21"/>
+          <w:szCs w:val="21"/>
+        </w:rPr>
+        <w:t xml:space="preserve">So that's like step one, and I think that's a little bit of what I shared about. Claude's conversation. We wanted not just speak, because we were facing, but really on the back end. Once you have that visibility, you can choose to now surface that to a user that might care a little bit more about supply chain transparency, et cetera. But we want to really empower the ecosystem, the users, to make the decision on how they want to show up the users. But at least we want to give them the wrong tools to incorporate that in America. I'm almost there. I really appreciate one of the biggest business class being was around this intermediation, and I think there's a lot of fears. I appreciate you addressing that, because I think it is here. Justin, what are you hearing in terms of things with eating people? week at night, and how are, you know, what do you see when, again, you've still got 3+ months to make this year.</w:t>
+      </w:r>
+    </w:p>
+    <w:p>
+      <w:pPr>
+        <w:spacing w:after="140" w:line="300"/>
+      </w:pPr>
+      <w:r>
+        <w:rPr>
+          <w:sz w:val="21"/>
+          <w:szCs w:val="21"/>
+        </w:rPr>
+        <w:t xml:space="preserve">What you see people trying to do? Yeah, and thank you all again for being here today has been, I can't wait to meet some of you after we're done. I'll pick an area that we haven't spent any time on, and that is, I mentioned changing management earlier, but I'll talk about people. So, um, I had a meeting with one of our big retailers in Latin America, like, weeks ago, 100s of stores, and, you know, they were dealing with their traditional data problems, like in European, the 3DRPs got to do something about that, and they were putting data together, data platforms, and using that for AI. He's like, we're all in on AI, but I can't get some of my business people to sign on to use the tools or they're worried about the jobs we're done. So we're seeing that, and then we're seeing that in the middle, many of our customers are hiring, they are not playing off.</w:t>
+      </w:r>
+    </w:p>
+    <w:p>
+      <w:pPr>
+        <w:spacing w:after="140" w:line="300"/>
+      </w:pPr>
+      <w:r>
+        <w:rPr>
+          <w:sz w:val="21"/>
+          <w:szCs w:val="21"/>
+        </w:rPr>
+        <w:t xml:space="preserve">They are looking for talent that can come in and use the tools that are now available and be somewhat tech aware. And then on the to the far end, there are a couple of retailers that are way out there and they are building their own custom ERP to replace SAD. They are building their own one and sales system and loyalty system and not buying off the shelf. They're building their own customer contacts and center solution, and salesforce solution. And so, you think, you hear the noise about applications and companies out there, like, they're getting squeezed by the ability of these models to go and build your own custom solution. So that's just an area that's kind of brought the scenario. Yeah, I'm crazy, one thing, I will say, more than any time in my career, people are looking for more people. This is not what you would have, especially, and it's in the stores, right?</w:t>
+      </w:r>
+    </w:p>
+    <w:p>
+      <w:pPr>
+        <w:spacing w:after="140" w:line="300"/>
+      </w:pPr>
+      <w:r>
+        <w:rPr>
+          <w:sz w:val="21"/>
+          <w:szCs w:val="21"/>
+        </w:rPr>
+        <w:t xml:space="preserve">Because you can now empower your work work, right? It's very different solutions to really have an impact on the consumer. We're doing more and more, right? People, right? This, like, idea around, like, globe service, even if you're kind of more mass, you know, mass mastige. And so, from anthropic perspective, they used to think about Justin said, how do you think about kind of the human side, I guess? We deeply care about the human side of it, and we see AI as enabling new jobs that maybe didn't even exist before, right? So it's like, what's in the art of the possible? And you start and roles won't be as relevant, but we think they can be chosen transformed into where AI and the ecosystem is evolving. So, for example, like, FDEs applied AI is, like, what we have with an anthropic, and those are large teams that we have, which is, how do you actually implement AI in your companies?</w:t>
+      </w:r>
+    </w:p>
+    <w:p>
+      <w:pPr>
+        <w:spacing w:after="140" w:line="300"/>
+      </w:pPr>
+      <w:r>
+        <w:rPr>
+          <w:sz w:val="21"/>
+          <w:szCs w:val="21"/>
+        </w:rPr>
+        <w:t xml:space="preserve">And that was a rule that didn't exist really, you know, two years ago. So I do think we're the crux of a change of one employment is going to look like in the coming years. Well, it's interesting, the art of the hospital, is our conference yesterday, that's a great movie. So, if we're here, because I think just you, the amazing job of the timeline, right? Last year was Jet AI, this year was agentic. What are we gonna be talking about next year? So, look, and I'm telling you, if you go to interrupt in January, I think the whole thing is genetic, but, like I said, for us to pinch on swinging not to capabilities, instead of talking about the type of the model, because I think there's something new. So like, it's confusing. Hard to keep up with. So we're trying to stay one step ahead of our customers on what's it possible, and then tie it back to business capability.</w:t>
+      </w:r>
+    </w:p>
+    <w:p>
+      <w:pPr>
+        <w:spacing w:after="140" w:line="300"/>
+      </w:pPr>
+      <w:r>
+        <w:rPr>
+          <w:sz w:val="21"/>
+          <w:szCs w:val="21"/>
+        </w:rPr>
+        <w:t xml:space="preserve">So I think many of you will be leaned into partners, like Amazon, like your SI partners, like some of the other tech companies in this room to help you navigate that. No, okay, wait, there's so much noise. Like, what do I really use this or how are others using this capability to derive value? So I do think that that's important to see a lot of questions and a lot of up to us to make sure we're bringing that to you. And I think that's one week. So, I think Friday, I come into this room, but Justin has said, need this education. Do not have, people don't want people to, and they will remember. Basically, help them out as they say, they commit previously. And that's what we're saying at work right now, and that's just you always in that way. The one thing I'll add to, maybe just on your point, is something we spend a lot of time thinking about is with the rate and pace at which models are changing and we're getting into more and more frontier models.</w:t>
+      </w:r>
+    </w:p>
+    <w:p>
+      <w:pPr>
+        <w:spacing w:after="140" w:line="300"/>
+      </w:pPr>
+      <w:r>
+        <w:rPr>
+          <w:sz w:val="21"/>
+          <w:szCs w:val="21"/>
+        </w:rPr>
+        <w:t xml:space="preserve">The way the shape of products that exist today doesn't necessarily always leverage the frontier intelligence that we're building. So we constantly think about, what is the next shape of products that can exist in the market to truly leverage the intelligence exponential growth that we are seeing, especially as we're getting towards our assign, I think it's going to start to increase at such a quick pace. So today, you know, we can kind of understand the shape of things that I have no idea what it's going to look like in 6 months from now. Well, and just in thinking about last year, I thought, well, I think it was this year 26, and Iraq, what you showed us as some of those, in this room around design, that was kind of a wow for me. was a wild moment. And you can share that and just talk about her thinking about...</w:t>
+      </w:r>
+    </w:p>
+    <w:p>
+      <w:pPr>
+        <w:spacing w:after="140" w:line="300"/>
+      </w:pPr>
+      <w:r>
+        <w:rPr>
+          <w:sz w:val="21"/>
+          <w:szCs w:val="21"/>
+        </w:rPr>
+        <w:t xml:space="preserve">Yes, and then we were at the end of our time. We can talk for hours, you can see. We knew on for another very nice, but, um, so, basically, last January, Atente Commerce was so new. It was like, it's hard. I don't know you all, but it's kind of hard to understand. Like, if you, it's, like, agents. I don't, there was no, like, copilot or Amazon Quick. It was not good because those things weren't there. So what we did when we showed how to how agents can work together to come up with a product design, like a new product, so product innovation is a big, big idea. Like a prior design, then how agents can work together to sketch out a couple of materials for that product. And agents could then work together to say, okay, if I had to build materials, what would be the cost of those materials?</w:t>
+      </w:r>
+    </w:p>
+    <w:p>
+      <w:pPr>
+        <w:spacing w:after="140" w:line="300"/>
+      </w:pPr>
+      <w:r>
+        <w:rPr>
+          <w:sz w:val="21"/>
+          <w:szCs w:val="21"/>
+        </w:rPr>
+        <w:t xml:space="preserve">And what would be the potential suppliers? Right? Kind of the agentic search things we talked about earlier. And then, okay, now that I have that, like, what is the testing process for? What needs to be true? What does I? again, going through all of that, but like, you could see what we showed, like, models, communicating, and agents working together to generate an output. That wasn't some demo. Here, I mean, it wasn't... Like real time. You saw the slider, which had something moving around like that, it's a demo. Like, this was, like, real. So, that was powerful, and I think if you can look at it and not be a hikey person to go, huh. Okay, kind of, I see how this could work. And so, what we've been trying to do, especially getting away from this, like, I love slides. I love them, right? But the show, like, how this can work or what, bring it to life, you know, the little, the slide on it was, like, wait, I'd rather open my desktop version and show me that, like, showing you how prepared for the panel, that shop profile?</w:t>
+      </w:r>
+    </w:p>
+    <w:p>
+      <w:pPr>
+        <w:spacing w:after="140" w:line="300"/>
+      </w:pPr>
+      <w:r>
+        <w:rPr>
+          <w:sz w:val="21"/>
+          <w:szCs w:val="21"/>
+        </w:rPr>
+        <w:t xml:space="preserve">Yes. And, like, you know, show you what that would did. But anyway. So, for the chocolate, as you think about, kind of, what those in the room should lead with, because I think that what you're going to see from the stage, what you're going to lead with at the end of the show. What do people think about? What questions should they be asking, and how do you think about the art of the possible? And then you answer the same question, you'll wrap up. Yeah. I would say, a dental commerce is here, and just try to understand how you want to show up and participate in that space, and make sure there's, like, very low hanging fruit. I mean, people oftentimes get really carried away into, What can we do, AEO, GEO, and Syra? There's just really low hanging fruit, and we have a lot of information on our website, of how to make sure that you stay relevant in the role of intent and commerce, from a search and service standpoint, you build your own agents in the world which have a commerce to make sure you're getting control, as well, of that customer.</w:t>
+      </w:r>
+    </w:p>
+    <w:p>
+      <w:pPr>
+        <w:spacing w:after="140" w:line="300"/>
+      </w:pPr>
+      <w:r>
+        <w:rPr>
+          <w:sz w:val="21"/>
+          <w:szCs w:val="21"/>
+        </w:rPr>
+        <w:t xml:space="preserve">and make sure monsters are coming to a website, and again, it's like, damn it, if you do the end, if you don't. So if you choose to allow the boss, make sure that, again, you have all the right setup in place, so that they are able to come and transact on your services. But it's here, and we have, we have a lot of material on how to make sure you can participate in it. I love it. Well, none of them work out, because we had some lot issues the other day, and all of a sudden, we were just... This is, like, you know, self healthier. So, I, for those of you who attend to see us in January 26, one of the keynotes at the sphere was a ZML Novo, and he had the four Chip MDs on stage with him. And for the first time, I took retail and fashion, right?</w:t>
+      </w:r>
+    </w:p>
+    <w:p>
+      <w:pPr>
+        <w:spacing w:after="140" w:line="300"/>
+      </w:pPr>
+      <w:r>
+        <w:rPr>
+          <w:sz w:val="21"/>
+          <w:szCs w:val="21"/>
+        </w:rPr>
+        <w:t xml:space="preserve">That was the conversation. I've been going to CS Warriors and I will say for this week. And I'm just, you know, I actually was there with the CTO from a gap, and I think, and there's some guys, you should check, and do this, and, like, I was like, we gotta hear this. And they talked about going into a supply chain cycle. and very much about what's been said on the stage. But thinking about, because if you go into your supply chain and you go down a few layers, it can get a little dicey. And thinking about, kind of, what product you can create, I can get to the customer, how you can get it to them at the right time. The quantity you need on hand, because of the customer has locations, with lack of unchop availability, but I think we're gonna see a pretty significant spend in supply chain.</w:t>
+      </w:r>
+    </w:p>
+    <w:p>
+      <w:pPr>
+        <w:spacing w:after="140" w:line="300"/>
+      </w:pPr>
+      <w:r>
+        <w:rPr>
+          <w:sz w:val="21"/>
+          <w:szCs w:val="21"/>
+        </w:rPr>
+        <w:t xml:space="preserve">And those meetings here early, I think that this is going to be where a winter takes off, because what we're seeing right now in retail is something I've never seen, is that when a consumer has a bad experience, they don't go back. And so, I need your opportunity to satisfy that customer, is unlike anything it's ever been. And lean into that and do the right thing for the customer, and I think that the rewards are significant. So I want to make this panel, and thanks, Justin, thanks for news, and thanks for all of you for coming. Amazing. Thank you, guys. Um, have a great show. Do you got other questions for us?</w:t>
+      </w:r>
+    </w:p>
+    <w:p>
+      <w:pPr>
+        <w:pageBreakBefore/>
+        <w:spacing w:after="60"/>
+      </w:pPr>
+      <w:r>
+        <w:rPr>
+          <w:b/>
+          <w:bCs/>
+          <w:color w:val="7F7F7F"/>
+          <w:spacing w:val="40"/>
+          <w:sz w:val="18"/>
+          <w:szCs w:val="18"/>
+        </w:rPr>
+        <w:t xml:space="preserve">SESSION 11</w:t>
+      </w:r>
+    </w:p>
+    <w:p>
+      <w:pPr>
+        <w:pStyle w:val="Heading1"/>
+      </w:pPr>
+      <w:r>
+        <w:t xml:space="preserve">Unmatched: Opening remarks</w:t>
+      </w:r>
+    </w:p>
+    <w:tbl>
+      <w:tblPr>
+        <w:tblW w:type="dxa" w:w="9360"/>
+        <w:tblBorders>
+          <w:top w:val="single" w:color="auto" w:sz="4"/>
+          <w:left w:val="single" w:color="auto" w:sz="4"/>
+          <w:bottom w:val="single" w:color="auto" w:sz="4"/>
+          <w:right w:val="single" w:color="auto" w:sz="4"/>
+          <w:insideH w:val="single" w:color="auto" w:sz="4"/>
+          <w:insideV w:val="single" w:color="auto" w:sz="4"/>
+        </w:tblBorders>
+      </w:tblPr>
+      <w:tblGrid>
+        <w:gridCol w:w="2200"/>
+        <w:gridCol w:w="7160"/>
+      </w:tblGrid>
+      <w:tr>
+        <w:trPr>
+          <w:tblHeader/>
+        </w:trPr>
+        <w:tc>
+          <w:tcPr>
+            <w:tcW w:type="dxa" w:w="2200"/>
+            <w:tcBorders>
+              <w:top w:val="single" w:color="BFBFBF" w:sz="4"/>
+              <w:left w:val="single" w:color="BFBFBF" w:sz="4"/>
+              <w:bottom w:val="single" w:color="BFBFBF" w:sz="4"/>
+              <w:right w:val="single" w:color="BFBFBF" w:sz="4"/>
+            </w:tcBorders>
+            <w:shd w:fill="1F4E79" w:color="auto" w:val="clear"/>
+            <w:tcMar>
+              <w:top w:type="dxa" w:w="80"/>
+              <w:left w:type="dxa" w:w="120"/>
+              <w:bottom w:type="dxa" w:w="80"/>
+              <w:right w:type="dxa" w:w="120"/>
+            </w:tcMar>
+          </w:tcPr>
+          <w:p>
+            <w:r>
+              <w:rPr>
+                <w:b/>
+                <w:bCs/>
+                <w:color w:val="FFFFFF"/>
+                <w:sz w:val="20"/>
+                <w:szCs w:val="20"/>
+              </w:rPr>
+              <w:t xml:space="preserve">Session Details</w:t>
+            </w:r>
+          </w:p>
+        </w:tc>
+        <w:tc>
+          <w:tcPr>
+            <w:tcW w:type="dxa" w:w="7160"/>
+            <w:tcBorders>
+              <w:top w:val="single" w:color="BFBFBF" w:sz="4"/>
+              <w:left w:val="single" w:color="BFBFBF" w:sz="4"/>
+              <w:bottom w:val="single" w:color="BFBFBF" w:sz="4"/>
+              <w:right w:val="single" w:color="BFBFBF" w:sz="4"/>
+            </w:tcBorders>
+            <w:shd w:fill="1F4E79" w:color="auto" w:val="clear"/>
+            <w:tcMar>
+              <w:top w:type="dxa" w:w="80"/>
+              <w:left w:type="dxa" w:w="120"/>
+              <w:bottom w:type="dxa" w:w="80"/>
+              <w:right w:type="dxa" w:w="120"/>
+            </w:tcMar>
+          </w:tcPr>
+          <w:p>
+            <w:r>
+              <w:rPr>
+                <w:b/>
+                <w:bCs/>
+                <w:color w:val="FFFFFF"/>
+                <w:sz w:val="20"/>
+                <w:szCs w:val="20"/>
+              </w:rPr>
+              <w:t xml:space="preserve"/>
+            </w:r>
+          </w:p>
+        </w:tc>
+      </w:tr>
+      <w:tr>
+        <w:trPr>
+          <w:cantSplit/>
+        </w:trPr>
+        <w:tc>
+          <w:tcPr>
+            <w:tcW w:type="dxa" w:w="2200"/>
+            <w:tcBorders>
+              <w:top w:val="single" w:color="BFBFBF" w:sz="4"/>
+              <w:left w:val="single" w:color="BFBFBF" w:sz="4"/>
+              <w:bottom w:val="single" w:color="BFBFBF" w:sz="4"/>
+              <w:right w:val="single" w:color="BFBFBF" w:sz="4"/>
+            </w:tcBorders>
+            <w:tcMar>
+              <w:top w:type="dxa" w:w="80"/>
+              <w:left w:type="dxa" w:w="120"/>
+              <w:bottom w:type="dxa" w:w="80"/>
+              <w:right w:type="dxa" w:w="120"/>
+            </w:tcMar>
+          </w:tcPr>
+          <w:p>
+            <w:r>
+              <w:rPr>
+                <w:b/>
+                <w:bCs/>
+                <w:sz w:val="20"/>
+                <w:szCs w:val="20"/>
+              </w:rPr>
+              <w:t xml:space="preserve">Date</w:t>
+            </w:r>
+          </w:p>
+        </w:tc>
+        <w:tc>
+          <w:tcPr>
+            <w:tcW w:type="dxa" w:w="7160"/>
+            <w:tcBorders>
+              <w:top w:val="single" w:color="BFBFBF" w:sz="4"/>
+              <w:left w:val="single" w:color="BFBFBF" w:sz="4"/>
+              <w:bottom w:val="single" w:color="BFBFBF" w:sz="4"/>
+              <w:right w:val="single" w:color="BFBFBF" w:sz="4"/>
+            </w:tcBorders>
+            <w:tcMar>
+              <w:top w:type="dxa" w:w="80"/>
+              <w:left w:type="dxa" w:w="120"/>
+              <w:bottom w:type="dxa" w:w="80"/>
+              <w:right w:type="dxa" w:w="120"/>
+            </w:tcMar>
+          </w:tcPr>
+          <w:p>
+            <w:r>
+              <w:rPr>
+                <w:b w:val="false"/>
+                <w:bCs w:val="false"/>
+                <w:sz w:val="20"/>
+                <w:szCs w:val="20"/>
+              </w:rPr>
+              <w:t xml:space="preserve">TBC</w:t>
+            </w:r>
+          </w:p>
+        </w:tc>
+      </w:tr>
+      <w:tr>
+        <w:trPr>
+          <w:cantSplit/>
+        </w:trPr>
+        <w:tc>
+          <w:tcPr>
+            <w:tcW w:type="dxa" w:w="2200"/>
+            <w:tcBorders>
+              <w:top w:val="single" w:color="BFBFBF" w:sz="4"/>
+              <w:left w:val="single" w:color="BFBFBF" w:sz="4"/>
+              <w:bottom w:val="single" w:color="BFBFBF" w:sz="4"/>
+              <w:right w:val="single" w:color="BFBFBF" w:sz="4"/>
+            </w:tcBorders>
+            <w:shd w:fill="F2F2F2" w:color="auto" w:val="clear"/>
+            <w:tcMar>
+              <w:top w:type="dxa" w:w="80"/>
+              <w:left w:type="dxa" w:w="120"/>
+              <w:bottom w:type="dxa" w:w="80"/>
+              <w:right w:type="dxa" w:w="120"/>
+            </w:tcMar>
+          </w:tcPr>
+          <w:p>
+            <w:r>
+              <w:rPr>
+                <w:b/>
+                <w:bCs/>
+                <w:sz w:val="20"/>
+                <w:szCs w:val="20"/>
+              </w:rPr>
+              <w:t xml:space="preserve">Time</w:t>
+            </w:r>
+          </w:p>
+        </w:tc>
+        <w:tc>
+          <w:tcPr>
+            <w:tcW w:type="dxa" w:w="7160"/>
+            <w:tcBorders>
+              <w:top w:val="single" w:color="BFBFBF" w:sz="4"/>
+              <w:left w:val="single" w:color="BFBFBF" w:sz="4"/>
+              <w:bottom w:val="single" w:color="BFBFBF" w:sz="4"/>
+              <w:right w:val="single" w:color="BFBFBF" w:sz="4"/>
+            </w:tcBorders>
+            <w:shd w:fill="F2F2F2" w:color="auto" w:val="clear"/>
+            <w:tcMar>
+              <w:top w:type="dxa" w:w="80"/>
+              <w:left w:type="dxa" w:w="120"/>
+              <w:bottom w:type="dxa" w:w="80"/>
+              <w:right w:type="dxa" w:w="120"/>
+            </w:tcMar>
+          </w:tcPr>
+          <w:p>
+            <w:r>
+              <w:rPr>
+                <w:b w:val="false"/>
+                <w:bCs w:val="false"/>
+                <w:sz w:val="20"/>
+                <w:szCs w:val="20"/>
+              </w:rPr>
+              <w:t xml:space="preserve">TBC</w:t>
+            </w:r>
+          </w:p>
+        </w:tc>
+      </w:tr>
+      <w:tr>
+        <w:trPr>
+          <w:cantSplit/>
+        </w:trPr>
+        <w:tc>
+          <w:tcPr>
+            <w:tcW w:type="dxa" w:w="2200"/>
+            <w:tcBorders>
+              <w:top w:val="single" w:color="BFBFBF" w:sz="4"/>
+              <w:left w:val="single" w:color="BFBFBF" w:sz="4"/>
+              <w:bottom w:val="single" w:color="BFBFBF" w:sz="4"/>
+              <w:right w:val="single" w:color="BFBFBF" w:sz="4"/>
+            </w:tcBorders>
+            <w:tcMar>
+              <w:top w:type="dxa" w:w="80"/>
+              <w:left w:type="dxa" w:w="120"/>
+              <w:bottom w:type="dxa" w:w="80"/>
+              <w:right w:type="dxa" w:w="120"/>
+            </w:tcMar>
+          </w:tcPr>
+          <w:p>
+            <w:r>
+              <w:rPr>
+                <w:b/>
+                <w:bCs/>
+                <w:sz w:val="20"/>
+                <w:szCs w:val="20"/>
+              </w:rPr>
+              <w:t xml:space="preserve">Stage</w:t>
+            </w:r>
+          </w:p>
+        </w:tc>
+        <w:tc>
+          <w:tcPr>
+            <w:tcW w:type="dxa" w:w="7160"/>
+            <w:tcBorders>
+              <w:top w:val="single" w:color="BFBFBF" w:sz="4"/>
+              <w:left w:val="single" w:color="BFBFBF" w:sz="4"/>
+              <w:bottom w:val="single" w:color="BFBFBF" w:sz="4"/>
+              <w:right w:val="single" w:color="BFBFBF" w:sz="4"/>
+            </w:tcBorders>
+            <w:tcMar>
+              <w:top w:type="dxa" w:w="80"/>
+              <w:left w:type="dxa" w:w="120"/>
+              <w:bottom w:type="dxa" w:w="80"/>
+              <w:right w:type="dxa" w:w="120"/>
+            </w:tcMar>
+          </w:tcPr>
+          <w:p>
+            <w:r>
+              <w:rPr>
+                <w:b w:val="false"/>
+                <w:bCs w:val="false"/>
+                <w:sz w:val="20"/>
+                <w:szCs w:val="20"/>
+              </w:rPr>
+              <w:t xml:space="preserve">TBC</w:t>
+            </w:r>
+          </w:p>
+        </w:tc>
+      </w:tr>
+      <w:tr>
+        <w:trPr>
+          <w:cantSplit/>
+        </w:trPr>
+        <w:tc>
+          <w:tcPr>
+            <w:tcW w:type="dxa" w:w="2200"/>
+            <w:tcBorders>
+              <w:top w:val="single" w:color="BFBFBF" w:sz="4"/>
+              <w:left w:val="single" w:color="BFBFBF" w:sz="4"/>
+              <w:bottom w:val="single" w:color="BFBFBF" w:sz="4"/>
+              <w:right w:val="single" w:color="BFBFBF" w:sz="4"/>
+            </w:tcBorders>
+            <w:shd w:fill="F2F2F2" w:color="auto" w:val="clear"/>
+            <w:tcMar>
+              <w:top w:type="dxa" w:w="80"/>
+              <w:left w:type="dxa" w:w="120"/>
+              <w:bottom w:type="dxa" w:w="80"/>
+              <w:right w:type="dxa" w:w="120"/>
+            </w:tcMar>
+          </w:tcPr>
+          <w:p>
+            <w:r>
+              <w:rPr>
+                <w:b/>
+                <w:bCs/>
+                <w:sz w:val="20"/>
+                <w:szCs w:val="20"/>
+              </w:rPr>
+              <w:t xml:space="preserve">Notes</w:t>
+            </w:r>
+          </w:p>
+        </w:tc>
+        <w:tc>
+          <w:tcPr>
+            <w:tcW w:type="dxa" w:w="7160"/>
+            <w:tcBorders>
+              <w:top w:val="single" w:color="BFBFBF" w:sz="4"/>
+              <w:left w:val="single" w:color="BFBFBF" w:sz="4"/>
+              <w:bottom w:val="single" w:color="BFBFBF" w:sz="4"/>
+              <w:right w:val="single" w:color="BFBFBF" w:sz="4"/>
+            </w:tcBorders>
+            <w:shd w:fill="F2F2F2" w:color="auto" w:val="clear"/>
+            <w:tcMar>
+              <w:top w:type="dxa" w:w="80"/>
+              <w:left w:type="dxa" w:w="120"/>
+              <w:bottom w:type="dxa" w:w="80"/>
+              <w:right w:type="dxa" w:w="120"/>
+            </w:tcMar>
+          </w:tcPr>
+          <w:p>
+            <w:r>
+              <w:rPr>
+                <w:b w:val="false"/>
+                <w:bCs w:val="false"/>
+                <w:sz w:val="20"/>
+                <w:szCs w:val="20"/>
+              </w:rPr>
+              <w:t xml:space="preserve">Transcript; session not identified</w:t>
+            </w:r>
+          </w:p>
+        </w:tc>
+      </w:tr>
+      <w:tr>
+        <w:trPr>
+          <w:cantSplit/>
+        </w:trPr>
+        <w:tc>
+          <w:tcPr>
+            <w:tcW w:type="dxa" w:w="2200"/>
+            <w:tcBorders>
+              <w:top w:val="single" w:color="BFBFBF" w:sz="4"/>
+              <w:left w:val="single" w:color="BFBFBF" w:sz="4"/>
+              <w:bottom w:val="single" w:color="BFBFBF" w:sz="4"/>
+              <w:right w:val="single" w:color="BFBFBF" w:sz="4"/>
+            </w:tcBorders>
+            <w:tcMar>
+              <w:top w:type="dxa" w:w="80"/>
+              <w:left w:type="dxa" w:w="120"/>
+              <w:bottom w:type="dxa" w:w="80"/>
+              <w:right w:type="dxa" w:w="120"/>
+            </w:tcMar>
+          </w:tcPr>
+          <w:p>
+            <w:r>
+              <w:rPr>
+                <w:b/>
+                <w:bCs/>
+                <w:sz w:val="20"/>
+                <w:szCs w:val="20"/>
+              </w:rPr>
+              <w:t xml:space="preserve">Title</w:t>
+            </w:r>
+          </w:p>
+        </w:tc>
+        <w:tc>
+          <w:tcPr>
+            <w:tcW w:type="dxa" w:w="7160"/>
+            <w:tcBorders>
+              <w:top w:val="single" w:color="BFBFBF" w:sz="4"/>
+              <w:left w:val="single" w:color="BFBFBF" w:sz="4"/>
+              <w:bottom w:val="single" w:color="BFBFBF" w:sz="4"/>
+              <w:right w:val="single" w:color="BFBFBF" w:sz="4"/>
+            </w:tcBorders>
+            <w:tcMar>
+              <w:top w:type="dxa" w:w="80"/>
+              <w:left w:type="dxa" w:w="120"/>
+              <w:bottom w:type="dxa" w:w="80"/>
+              <w:right w:type="dxa" w:w="120"/>
+            </w:tcMar>
+          </w:tcPr>
+          <w:p>
+            <w:r>
+              <w:rPr>
+                <w:b w:val="false"/>
+                <w:bCs w:val="false"/>
+                <w:sz w:val="20"/>
+                <w:szCs w:val="20"/>
+              </w:rPr>
+              <w:t xml:space="preserve">Not yet matched to an agenda session. Welcome by Zia Daniell Wigder, Co-Founder, Groceryshop/Shoptalk (title as on the Groceryshop app).</w:t>
+            </w:r>
+          </w:p>
+        </w:tc>
+      </w:tr>
+    </w:tbl>
+    <w:p>
+      <w:pPr>
+        <w:pStyle w:val="Heading2"/>
+      </w:pPr>
+      <w:r>
+        <w:t xml:space="preserve">Speakers</w:t>
+      </w:r>
+    </w:p>
+    <w:p>
+      <w:pPr>
+        <w:spacing w:after="120"/>
+      </w:pPr>
+      <w:r>
+        <w:rPr>
+          <w:i/>
+          <w:iCs/>
+          <w:color w:val="7F7F7F"/>
+        </w:rPr>
+        <w:t xml:space="preserve">Speakers TBC.</w:t>
+      </w:r>
+    </w:p>
+    <w:p>
+      <w:pPr>
+        <w:pStyle w:val="Heading2"/>
+      </w:pPr>
+      <w:r>
+        <w:t xml:space="preserve">Key Takeaways</w:t>
+      </w:r>
+    </w:p>
+    <w:p>
+      <w:pPr>
+        <w:pStyle w:val="ListParagraph"/>
+        <w:numPr>
+          <w:ilvl w:val="0"/>
+          <w:numId w:val="2"/>
+        </w:numPr>
+        <w:spacing w:after="60"/>
+      </w:pPr>
+      <w:r>
+        <w:t xml:space="preserve">First time a US Shoptalk event has moved location: from Chicago to Nashville.</w:t>
+      </w:r>
+    </w:p>
+    <w:p>
+      <w:pPr>
+        <w:pStyle w:val="ListParagraph"/>
+        <w:numPr>
+          <w:ilvl w:val="0"/>
+          <w:numId w:val="2"/>
+        </w:numPr>
+        <w:spacing w:after="60"/>
+      </w:pPr>
+      <w:r>
+        <w:t xml:space="preserve">Shoptalk Fall is designed to be intimate and interactive and is used to test new formats: a B2B track, hands-on sessions (e.g. AI literacy to live agents in 45 minutes), ask-me-anything sessions, town halls and a Gen Z/Gen Alpha teen panel.</w:t>
+      </w:r>
+    </w:p>
+    <w:p>
+      <w:pPr>
+        <w:pStyle w:val="Heading2"/>
+      </w:pPr>
+      <w:r>
+        <w:t xml:space="preserve">Transcript</w:t>
+      </w:r>
+    </w:p>
+    <w:p>
+      <w:pPr>
+        <w:spacing w:after="120"/>
+      </w:pPr>
+      <w:r>
+        <w:rPr>
+          <w:i/>
+          <w:iCs/>
+          <w:color w:val="595959"/>
+          <w:sz w:val="18"/>
+          <w:szCs w:val="18"/>
+        </w:rPr>
+        <w:t xml:space="preserve">Automatic speech-to-text output, kept word for word; not split by speaker.</w:t>
+      </w:r>
+    </w:p>
+    <w:p>
+      <w:pPr>
+        <w:spacing w:after="140" w:line="300"/>
+      </w:pPr>
+      <w:r>
+        <w:rPr>
+          <w:sz w:val="21"/>
+          <w:szCs w:val="21"/>
+        </w:rPr>
+        <w:t xml:space="preserve">So, Zia, Daniel, wait down. Alrighty. Good morning, everyone, and welcome to Shot Talk Fall. This is actually a really exciting day for all of us here because you may not know, but this is the 1st time in Shop Talk's history that we have moved any of our U.S. events to a new location. So, I'm just curious to hear, what do you think about having Shop Top Fall in Nashville? That was our reaction as well. We were thrilled when we were in Chicago. It was a great location, great city, but the reception that we've had in moving the event to Nashville has just been overwhelming. So we are thrilled that you're here with us and can't wait to spend these next few days with all of you. So another question for you. How many of you have been to a shop talk event before? Hands up.</w:t>
+      </w:r>
+    </w:p>
+    <w:p>
+      <w:pPr>
+        <w:spacing w:after="140" w:line="300"/>
+      </w:pPr>
+      <w:r>
+        <w:rPr>
+          <w:sz w:val="21"/>
+          <w:szCs w:val="21"/>
+        </w:rPr>
+        <w:t xml:space="preserve">Okay. Solid number, not a majority. But I thought it might be helpful to spend just a couple minutes talking about how shop top fall is different from some of our other events. In particular, sister event, the very large shop top spring, which takes place in March in Vegas. So, aside from kind of the obvious, the time of year, the location, one of our goals was Shop Talk Fall was to make it a very intimate, interactive, hands on event. And there's actually something else that's different about Shop Talk Fall as well. And that is that we use this particular event as an opportunity for us to test some of the new things that we want to try. Some of the things that we've heard about from all of you that you would like more of. So you'll see this in particular when it comes to some of the insights you'll be hearing across our stages.</w:t>
+      </w:r>
+    </w:p>
+    <w:p>
+      <w:pPr>
+        <w:spacing w:after="140" w:line="300"/>
+      </w:pPr>
+      <w:r>
+        <w:rPr>
+          <w:sz w:val="21"/>
+          <w:szCs w:val="21"/>
+        </w:rPr>
+        <w:t xml:space="preserve">So what are some of these new things that you'll be seeing here at the fall show? Well, for example, we have a B to B track, which we've never done before, started yesterday, continuing again today. We have very interactive sessions. I mentioned that we were striving to make this an interactive event, but for example, we have one hands-on session that is called from AI literacy to live agents in 45 minutes. So kind of a primer on AI for those of you who are interested. We haven't asked me anything. One, we know that a lot of our sessions don't traditionally have Q and A at the end. So we've invited some of our speakers to come and answer any questions you might have. And that includes, for example, the CEO, the Bombus, the CIO of the vitamin shop. We have Reddit on some of those sessions.</w:t>
+      </w:r>
+    </w:p>
+    <w:p>
+      <w:pPr>
+        <w:spacing w:after="140" w:line="300"/>
+      </w:pPr>
+      <w:r>
+        <w:rPr>
+          <w:sz w:val="21"/>
+          <w:szCs w:val="21"/>
+        </w:rPr>
+        <w:t xml:space="preserve">We also have what we're calling town halls. And these will have breakout interactive sessions. They're led by industry experts where you can talk about some of the most pressing issues, for example, we have one on the evolution of the physical, excuse me, of the physical store. And then finally, we will have our team panel. It will include both Gen, B, Gen Alpha, so you can hear a little bit more about what this generation is thinking, how they're interacting with brands, what, you know, some of their beliefs are and how that translates into their spending. So the one thing I would ask of all of you is, please let us know what you think of some of these different session types. Do you like them? Do you not like them? Do you have much better ideas? would be great. We would love to hear them. But just let us know.</w:t>
+      </w:r>
+    </w:p>
+    <w:p>
+      <w:pPr>
+        <w:spacing w:after="140" w:line="300"/>
+      </w:pPr>
+      <w:r>
+        <w:rPr>
+          <w:sz w:val="21"/>
+          <w:szCs w:val="21"/>
+        </w:rPr>
+        <w:t xml:space="preserve">We want this to be an event that's fantastic for all of you. And with that, I am going to kick off Shut Top Fall and say once again, welcome to Nashville. Thank you. There you go.</w:t>
+      </w:r>
+    </w:p>
+    <w:p>
+      <w:pPr>
+        <w:pageBreakBefore/>
+        <w:spacing w:after="60"/>
+      </w:pPr>
+      <w:r>
+        <w:rPr>
+          <w:b/>
+          <w:bCs/>
+          <w:color w:val="7F7F7F"/>
+          <w:spacing w:val="40"/>
+          <w:sz w:val="18"/>
+          <w:szCs w:val="18"/>
+        </w:rPr>
+        <w:t xml:space="preserve">SESSION 12</w:t>
+      </w:r>
+    </w:p>
+    <w:p>
+      <w:pPr>
+        <w:pStyle w:val="Heading1"/>
+      </w:pPr>
+      <w:r>
+        <w:t xml:space="preserve">Unmatched: Estée Lauder Companies keynote</w:t>
+      </w:r>
+    </w:p>
+    <w:tbl>
+      <w:tblPr>
+        <w:tblW w:type="dxa" w:w="9360"/>
+        <w:tblBorders>
+          <w:top w:val="single" w:color="auto" w:sz="4"/>
+          <w:left w:val="single" w:color="auto" w:sz="4"/>
+          <w:bottom w:val="single" w:color="auto" w:sz="4"/>
+          <w:right w:val="single" w:color="auto" w:sz="4"/>
+          <w:insideH w:val="single" w:color="auto" w:sz="4"/>
+          <w:insideV w:val="single" w:color="auto" w:sz="4"/>
+        </w:tblBorders>
+      </w:tblPr>
+      <w:tblGrid>
+        <w:gridCol w:w="2200"/>
+        <w:gridCol w:w="7160"/>
+      </w:tblGrid>
+      <w:tr>
+        <w:trPr>
+          <w:tblHeader/>
+        </w:trPr>
+        <w:tc>
+          <w:tcPr>
+            <w:tcW w:type="dxa" w:w="2200"/>
+            <w:tcBorders>
+              <w:top w:val="single" w:color="BFBFBF" w:sz="4"/>
+              <w:left w:val="single" w:color="BFBFBF" w:sz="4"/>
+              <w:bottom w:val="single" w:color="BFBFBF" w:sz="4"/>
+              <w:right w:val="single" w:color="BFBFBF" w:sz="4"/>
+            </w:tcBorders>
+            <w:shd w:fill="1F4E79" w:color="auto" w:val="clear"/>
+            <w:tcMar>
+              <w:top w:type="dxa" w:w="80"/>
+              <w:left w:type="dxa" w:w="120"/>
+              <w:bottom w:type="dxa" w:w="80"/>
+              <w:right w:type="dxa" w:w="120"/>
+            </w:tcMar>
+          </w:tcPr>
+          <w:p>
+            <w:r>
+              <w:rPr>
+                <w:b/>
+                <w:bCs/>
+                <w:color w:val="FFFFFF"/>
+                <w:sz w:val="20"/>
+                <w:szCs w:val="20"/>
+              </w:rPr>
+              <w:t xml:space="preserve">Session Details</w:t>
+            </w:r>
+          </w:p>
+        </w:tc>
+        <w:tc>
+          <w:tcPr>
+            <w:tcW w:type="dxa" w:w="7160"/>
+            <w:tcBorders>
+              <w:top w:val="single" w:color="BFBFBF" w:sz="4"/>
+              <w:left w:val="single" w:color="BFBFBF" w:sz="4"/>
+              <w:bottom w:val="single" w:color="BFBFBF" w:sz="4"/>
+              <w:right w:val="single" w:color="BFBFBF" w:sz="4"/>
+            </w:tcBorders>
+            <w:shd w:fill="1F4E79" w:color="auto" w:val="clear"/>
+            <w:tcMar>
+              <w:top w:type="dxa" w:w="80"/>
+              <w:left w:type="dxa" w:w="120"/>
+              <w:bottom w:type="dxa" w:w="80"/>
+              <w:right w:type="dxa" w:w="120"/>
+            </w:tcMar>
+          </w:tcPr>
+          <w:p>
+            <w:r>
+              <w:rPr>
+                <w:b/>
+                <w:bCs/>
+                <w:color w:val="FFFFFF"/>
+                <w:sz w:val="20"/>
+                <w:szCs w:val="20"/>
+              </w:rPr>
+              <w:t xml:space="preserve"/>
+            </w:r>
+          </w:p>
+        </w:tc>
+      </w:tr>
+      <w:tr>
+        <w:trPr>
+          <w:cantSplit/>
+        </w:trPr>
+        <w:tc>
+          <w:tcPr>
+            <w:tcW w:type="dxa" w:w="2200"/>
+            <w:tcBorders>
+              <w:top w:val="single" w:color="BFBFBF" w:sz="4"/>
+              <w:left w:val="single" w:color="BFBFBF" w:sz="4"/>
+              <w:bottom w:val="single" w:color="BFBFBF" w:sz="4"/>
+              <w:right w:val="single" w:color="BFBFBF" w:sz="4"/>
+            </w:tcBorders>
+            <w:tcMar>
+              <w:top w:type="dxa" w:w="80"/>
+              <w:left w:type="dxa" w:w="120"/>
+              <w:bottom w:type="dxa" w:w="80"/>
+              <w:right w:type="dxa" w:w="120"/>
+            </w:tcMar>
+          </w:tcPr>
+          <w:p>
+            <w:r>
+              <w:rPr>
+                <w:b/>
+                <w:bCs/>
+                <w:sz w:val="20"/>
+                <w:szCs w:val="20"/>
+              </w:rPr>
+              <w:t xml:space="preserve">Date</w:t>
+            </w:r>
+          </w:p>
+        </w:tc>
+        <w:tc>
+          <w:tcPr>
+            <w:tcW w:type="dxa" w:w="7160"/>
+            <w:tcBorders>
+              <w:top w:val="single" w:color="BFBFBF" w:sz="4"/>
+              <w:left w:val="single" w:color="BFBFBF" w:sz="4"/>
+              <w:bottom w:val="single" w:color="BFBFBF" w:sz="4"/>
+              <w:right w:val="single" w:color="BFBFBF" w:sz="4"/>
+            </w:tcBorders>
+            <w:tcMar>
+              <w:top w:type="dxa" w:w="80"/>
+              <w:left w:type="dxa" w:w="120"/>
+              <w:bottom w:type="dxa" w:w="80"/>
+              <w:right w:type="dxa" w:w="120"/>
+            </w:tcMar>
+          </w:tcPr>
+          <w:p>
+            <w:r>
+              <w:rPr>
+                <w:b w:val="false"/>
+                <w:bCs w:val="false"/>
+                <w:sz w:val="20"/>
+                <w:szCs w:val="20"/>
+              </w:rPr>
+              <w:t xml:space="preserve">TBC</w:t>
+            </w:r>
+          </w:p>
+        </w:tc>
+      </w:tr>
+      <w:tr>
+        <w:trPr>
+          <w:cantSplit/>
+        </w:trPr>
+        <w:tc>
+          <w:tcPr>
+            <w:tcW w:type="dxa" w:w="2200"/>
+            <w:tcBorders>
+              <w:top w:val="single" w:color="BFBFBF" w:sz="4"/>
+              <w:left w:val="single" w:color="BFBFBF" w:sz="4"/>
+              <w:bottom w:val="single" w:color="BFBFBF" w:sz="4"/>
+              <w:right w:val="single" w:color="BFBFBF" w:sz="4"/>
+            </w:tcBorders>
+            <w:shd w:fill="F2F2F2" w:color="auto" w:val="clear"/>
+            <w:tcMar>
+              <w:top w:type="dxa" w:w="80"/>
+              <w:left w:type="dxa" w:w="120"/>
+              <w:bottom w:type="dxa" w:w="80"/>
+              <w:right w:type="dxa" w:w="120"/>
+            </w:tcMar>
+          </w:tcPr>
+          <w:p>
+            <w:r>
+              <w:rPr>
+                <w:b/>
+                <w:bCs/>
+                <w:sz w:val="20"/>
+                <w:szCs w:val="20"/>
+              </w:rPr>
+              <w:t xml:space="preserve">Time</w:t>
+            </w:r>
+          </w:p>
+        </w:tc>
+        <w:tc>
+          <w:tcPr>
+            <w:tcW w:type="dxa" w:w="7160"/>
+            <w:tcBorders>
+              <w:top w:val="single" w:color="BFBFBF" w:sz="4"/>
+              <w:left w:val="single" w:color="BFBFBF" w:sz="4"/>
+              <w:bottom w:val="single" w:color="BFBFBF" w:sz="4"/>
+              <w:right w:val="single" w:color="BFBFBF" w:sz="4"/>
+            </w:tcBorders>
+            <w:shd w:fill="F2F2F2" w:color="auto" w:val="clear"/>
+            <w:tcMar>
+              <w:top w:type="dxa" w:w="80"/>
+              <w:left w:type="dxa" w:w="120"/>
+              <w:bottom w:type="dxa" w:w="80"/>
+              <w:right w:type="dxa" w:w="120"/>
+            </w:tcMar>
+          </w:tcPr>
+          <w:p>
+            <w:r>
+              <w:rPr>
+                <w:b w:val="false"/>
+                <w:bCs w:val="false"/>
+                <w:sz w:val="20"/>
+                <w:szCs w:val="20"/>
+              </w:rPr>
+              <w:t xml:space="preserve">TBC</w:t>
+            </w:r>
+          </w:p>
+        </w:tc>
+      </w:tr>
+      <w:tr>
+        <w:trPr>
+          <w:cantSplit/>
+        </w:trPr>
+        <w:tc>
+          <w:tcPr>
+            <w:tcW w:type="dxa" w:w="2200"/>
+            <w:tcBorders>
+              <w:top w:val="single" w:color="BFBFBF" w:sz="4"/>
+              <w:left w:val="single" w:color="BFBFBF" w:sz="4"/>
+              <w:bottom w:val="single" w:color="BFBFBF" w:sz="4"/>
+              <w:right w:val="single" w:color="BFBFBF" w:sz="4"/>
+            </w:tcBorders>
+            <w:tcMar>
+              <w:top w:type="dxa" w:w="80"/>
+              <w:left w:type="dxa" w:w="120"/>
+              <w:bottom w:type="dxa" w:w="80"/>
+              <w:right w:type="dxa" w:w="120"/>
+            </w:tcMar>
+          </w:tcPr>
+          <w:p>
+            <w:r>
+              <w:rPr>
+                <w:b/>
+                <w:bCs/>
+                <w:sz w:val="20"/>
+                <w:szCs w:val="20"/>
+              </w:rPr>
+              <w:t xml:space="preserve">Stage</w:t>
+            </w:r>
+          </w:p>
+        </w:tc>
+        <w:tc>
+          <w:tcPr>
+            <w:tcW w:type="dxa" w:w="7160"/>
+            <w:tcBorders>
+              <w:top w:val="single" w:color="BFBFBF" w:sz="4"/>
+              <w:left w:val="single" w:color="BFBFBF" w:sz="4"/>
+              <w:bottom w:val="single" w:color="BFBFBF" w:sz="4"/>
+              <w:right w:val="single" w:color="BFBFBF" w:sz="4"/>
+            </w:tcBorders>
+            <w:tcMar>
+              <w:top w:type="dxa" w:w="80"/>
+              <w:left w:type="dxa" w:w="120"/>
+              <w:bottom w:type="dxa" w:w="80"/>
+              <w:right w:type="dxa" w:w="120"/>
+            </w:tcMar>
+          </w:tcPr>
+          <w:p>
+            <w:r>
+              <w:rPr>
+                <w:b w:val="false"/>
+                <w:bCs w:val="false"/>
+                <w:sz w:val="20"/>
+                <w:szCs w:val="20"/>
+              </w:rPr>
+              <w:t xml:space="preserve">TBC</w:t>
+            </w:r>
+          </w:p>
+        </w:tc>
+      </w:tr>
+      <w:tr>
+        <w:trPr>
+          <w:cantSplit/>
+        </w:trPr>
+        <w:tc>
+          <w:tcPr>
+            <w:tcW w:type="dxa" w:w="2200"/>
+            <w:tcBorders>
+              <w:top w:val="single" w:color="BFBFBF" w:sz="4"/>
+              <w:left w:val="single" w:color="BFBFBF" w:sz="4"/>
+              <w:bottom w:val="single" w:color="BFBFBF" w:sz="4"/>
+              <w:right w:val="single" w:color="BFBFBF" w:sz="4"/>
+            </w:tcBorders>
+            <w:shd w:fill="F2F2F2" w:color="auto" w:val="clear"/>
+            <w:tcMar>
+              <w:top w:type="dxa" w:w="80"/>
+              <w:left w:type="dxa" w:w="120"/>
+              <w:bottom w:type="dxa" w:w="80"/>
+              <w:right w:type="dxa" w:w="120"/>
+            </w:tcMar>
+          </w:tcPr>
+          <w:p>
+            <w:r>
+              <w:rPr>
+                <w:b/>
+                <w:bCs/>
+                <w:sz w:val="20"/>
+                <w:szCs w:val="20"/>
+              </w:rPr>
+              <w:t xml:space="preserve">Notes</w:t>
+            </w:r>
+          </w:p>
+        </w:tc>
+        <w:tc>
+          <w:tcPr>
+            <w:tcW w:type="dxa" w:w="7160"/>
+            <w:tcBorders>
+              <w:top w:val="single" w:color="BFBFBF" w:sz="4"/>
+              <w:left w:val="single" w:color="BFBFBF" w:sz="4"/>
+              <w:bottom w:val="single" w:color="BFBFBF" w:sz="4"/>
+              <w:right w:val="single" w:color="BFBFBF" w:sz="4"/>
+            </w:tcBorders>
+            <w:shd w:fill="F2F2F2" w:color="auto" w:val="clear"/>
+            <w:tcMar>
+              <w:top w:type="dxa" w:w="80"/>
+              <w:left w:type="dxa" w:w="120"/>
+              <w:bottom w:type="dxa" w:w="80"/>
+              <w:right w:type="dxa" w:w="120"/>
+            </w:tcMar>
+          </w:tcPr>
+          <w:p>
+            <w:r>
+              <w:rPr>
+                <w:b w:val="false"/>
+                <w:bCs w:val="false"/>
+                <w:sz w:val="20"/>
+                <w:szCs w:val="20"/>
+              </w:rPr>
+              <w:t xml:space="preserve">Transcript; session not identified</w:t>
+            </w:r>
+          </w:p>
+        </w:tc>
+      </w:tr>
+      <w:tr>
+        <w:trPr>
+          <w:cantSplit/>
+        </w:trPr>
+        <w:tc>
+          <w:tcPr>
+            <w:tcW w:type="dxa" w:w="2200"/>
+            <w:tcBorders>
+              <w:top w:val="single" w:color="BFBFBF" w:sz="4"/>
+              <w:left w:val="single" w:color="BFBFBF" w:sz="4"/>
+              <w:bottom w:val="single" w:color="BFBFBF" w:sz="4"/>
+              <w:right w:val="single" w:color="BFBFBF" w:sz="4"/>
+            </w:tcBorders>
+            <w:tcMar>
+              <w:top w:type="dxa" w:w="80"/>
+              <w:left w:type="dxa" w:w="120"/>
+              <w:bottom w:type="dxa" w:w="80"/>
+              <w:right w:type="dxa" w:w="120"/>
+            </w:tcMar>
+          </w:tcPr>
+          <w:p>
+            <w:r>
+              <w:rPr>
+                <w:b/>
+                <w:bCs/>
+                <w:sz w:val="20"/>
+                <w:szCs w:val="20"/>
+              </w:rPr>
+              <w:t xml:space="preserve">Title</w:t>
+            </w:r>
+          </w:p>
+        </w:tc>
+        <w:tc>
+          <w:tcPr>
+            <w:tcW w:type="dxa" w:w="7160"/>
+            <w:tcBorders>
+              <w:top w:val="single" w:color="BFBFBF" w:sz="4"/>
+              <w:left w:val="single" w:color="BFBFBF" w:sz="4"/>
+              <w:bottom w:val="single" w:color="BFBFBF" w:sz="4"/>
+              <w:right w:val="single" w:color="BFBFBF" w:sz="4"/>
+            </w:tcBorders>
+            <w:tcMar>
+              <w:top w:type="dxa" w:w="80"/>
+              <w:left w:type="dxa" w:w="120"/>
+              <w:bottom w:type="dxa" w:w="80"/>
+              <w:right w:type="dxa" w:w="120"/>
+            </w:tcMar>
+          </w:tcPr>
+          <w:p>
+            <w:r>
+              <w:rPr>
+                <w:b w:val="false"/>
+                <w:bCs w:val="false"/>
+                <w:sz w:val="20"/>
+                <w:szCs w:val="20"/>
+              </w:rPr>
+              <w:t xml:space="preserve">Not yet matched to an agenda session. Tara Simon, President of the Americas, and Lisa Sequino, President of MAC (title transcribed as “President of Makeup Bluster”), The Estée Lauder Companies; interviewed by Jessica Matlin, founder and host of Fat Mascara (names as introduced on stage).</w:t>
+            </w:r>
+          </w:p>
+        </w:tc>
+      </w:tr>
+    </w:tbl>
+    <w:p>
+      <w:pPr>
+        <w:pStyle w:val="Heading2"/>
+      </w:pPr>
+      <w:r>
+        <w:t xml:space="preserve">Speakers</w:t>
+      </w:r>
+    </w:p>
+    <w:p>
+      <w:pPr>
+        <w:spacing w:after="120"/>
+      </w:pPr>
+      <w:r>
+        <w:rPr>
+          <w:i/>
+          <w:iCs/>
+          <w:color w:val="7F7F7F"/>
+        </w:rPr>
+        <w:t xml:space="preserve">Speakers TBC.</w:t>
+      </w:r>
+    </w:p>
+    <w:p>
+      <w:pPr>
+        <w:pStyle w:val="Heading2"/>
+      </w:pPr>
+      <w:r>
+        <w:t xml:space="preserve">Key Takeaways</w:t>
+      </w:r>
+    </w:p>
+    <w:p>
+      <w:pPr>
+        <w:pStyle w:val="ListParagraph"/>
+        <w:numPr>
+          <w:ilvl w:val="0"/>
+          <w:numId w:val="2"/>
+        </w:numPr>
+        <w:spacing w:after="60"/>
+      </w:pPr>
+      <w:r>
+        <w:t xml:space="preserve">MAC launched at Sephora in nine months instead of the usual 18–24 by throwing out the rule book; the launch was treated as a cultural moment (campaign by Nicola Formichetti, a fast-turnaround billboard in Times Square).</w:t>
+      </w:r>
+    </w:p>
+    <w:p>
+      <w:pPr>
+        <w:pStyle w:val="ListParagraph"/>
+        <w:numPr>
+          <w:ilvl w:val="0"/>
+          <w:numId w:val="2"/>
+        </w:numPr>
+        <w:spacing w:after="60"/>
+      </w:pPr>
+      <w:r>
+        <w:t xml:space="preserve">ELC is now on Amazon and TikTok Shop; channels feed each other (e.g. a TikTok Shop Super Brand Day for Clinique Black Honey lifted sales at Ulta and Amazon within hours).</w:t>
+      </w:r>
+    </w:p>
+    <w:p>
+      <w:pPr>
+        <w:pStyle w:val="ListParagraph"/>
+        <w:numPr>
+          <w:ilvl w:val="0"/>
+          <w:numId w:val="2"/>
+        </w:numPr>
+        <w:spacing w:after="60"/>
+      </w:pPr>
+      <w:r>
+        <w:t xml:space="preserve">Brand equity and reach aren't mutually exclusive: keep brand codes but be flexible per channel; Kilian Paris's $150 cocktails collection sold out on Sephora.com in 72 hours.</w:t>
+      </w:r>
+    </w:p>
+    <w:p>
+      <w:pPr>
+        <w:pStyle w:val="ListParagraph"/>
+        <w:numPr>
+          <w:ilvl w:val="0"/>
+          <w:numId w:val="2"/>
+        </w:numPr>
+        <w:spacing w:after="60"/>
+      </w:pPr>
+      <w:r>
+        <w:t xml:space="preserve">Leadership: challenger mindset, speed without asking permission, being direct, and “phone a friend” — nobody has all the answers.</w:t>
+      </w:r>
+    </w:p>
+    <w:p>
+      <w:pPr>
+        <w:pStyle w:val="Heading2"/>
+      </w:pPr>
+      <w:r>
+        <w:t xml:space="preserve">Transcript</w:t>
+      </w:r>
+    </w:p>
+    <w:p>
+      <w:pPr>
+        <w:spacing w:after="120"/>
+      </w:pPr>
+      <w:r>
+        <w:rPr>
+          <w:i/>
+          <w:iCs/>
+          <w:color w:val="595959"/>
+          <w:sz w:val="18"/>
+          <w:szCs w:val="18"/>
+        </w:rPr>
+        <w:t xml:space="preserve">Automatic speech-to-text output, kept word for word; not split by speaker.</w:t>
+      </w:r>
+    </w:p>
+    <w:p>
+      <w:pPr>
+        <w:spacing w:after="140" w:line="300"/>
+      </w:pPr>
+      <w:r>
+        <w:rPr>
+          <w:sz w:val="21"/>
+          <w:szCs w:val="21"/>
+        </w:rPr>
+        <w:t xml:space="preserve">Thank you, Zia. Next, please welcome from Estay Lauder Companies, President of the America's Tara Simon, and President of Makeup Bluster, Lisa Sequino. Tara and Lisa will be interviewed by Jessica Matlin, founder and host of Fat Mascara. Hi, everyone. It's so wonderful to be here in Nashville and for Shout Talk. I am so happy to be sitting here with Tara and Lisa from the Estate Lauder Companies. I've been covering ELC for really my entire career, whether it's, you know, a journalist or merchant, a podcaster. Sometimes all 3 at once. And this is easily, I can say, wholeheartedly the most exciting time in ELC. What you guys have achieved in such a short amount of time. For such a legacy company is really just remarkable. I can't really think of another word. It's really incredible. So we're gonna talk about that and also having spent, you know, I've known you guys before, but also just spending time with you this morning.</w:t>
+      </w:r>
+    </w:p>
+    <w:p>
+      <w:pPr>
+        <w:spacing w:after="140" w:line="300"/>
+      </w:pPr>
+      <w:r>
+        <w:rPr>
+          <w:sz w:val="21"/>
+          <w:szCs w:val="21"/>
+        </w:rPr>
+        <w:t xml:space="preserve">You're having a lot of fun, and there's a lot to be said. So it's really having a lot of fun doing it. I think... Did the truck disapply the warehouse? It was just... So, without further ado, today is the first time that the pair of you have been on a public stage together, but it's not the first time that you guys have worked magic together. I want to cut straight to it. The business that you guys are building and you're growing. You recently brokered a deal from Matt Cosmetics to enter Sephora, US, after years of the 2 operating side by side, but never together. What changed? Well, first, Jess, I just want to say thank you for being here and hosting us, and thank you, Shop Talk, for allowing the Essay Lauder companies, an opportunity to talk a little about prestige beauty retail, which is, you know, our favorite topic, I think.</w:t>
+      </w:r>
+    </w:p>
+    <w:p>
+      <w:pPr>
+        <w:spacing w:after="140" w:line="300"/>
+      </w:pPr>
+      <w:r>
+        <w:rPr>
+          <w:sz w:val="21"/>
+          <w:szCs w:val="21"/>
+        </w:rPr>
+        <w:t xml:space="preserve">In February, Matt Cosmetics and Sephora launched together. Now, listen, both companies, really, the OG, Mac Cosmetics, the original Mega Bartistry brand, Sephora, the, you know, very, very early specialty multi-brand. And so it was like, why did it take so long? So it was really sort of about time. And it was really a matter of tossing out the role book, which I feel like we're doing a lot these days, at the S of a lot of companies, and just saying, what would need to be true to do this? It kind of started with a simple dinner conversation, and kind of went from there. And it's really about, I mean, just in both companies and business since the '90s. And so it was about, how can we do this and how can we do it fast? Because normally it would take 18 to 24 months to do a launch like that in any retailer, and we did it in nine, which was really unprecedented.</w:t>
+      </w:r>
+    </w:p>
+    <w:p>
+      <w:pPr>
+        <w:spacing w:after="140" w:line="300"/>
+      </w:pPr>
+      <w:r>
+        <w:rPr>
+          <w:sz w:val="21"/>
+          <w:szCs w:val="21"/>
+        </w:rPr>
+        <w:t xml:space="preserve">There were three significant factors. The 1st was just having the right people at the table to, frankly, make the deal. And for us to decide, what do we need? And in this situation, we both needed to be doing more makeup business and we wanted to deliver more makeup business for the industry. And so we put our heads together, and relationships and people matter, and you can sit down and hash things out pretty quickly. And if you two, it's almost like you'd had this conversation once before in a past life, right? Yes. Lisa and I, yes, like almost 10 years ago, I was adult of beauty. Lisa was an Este Lauder, and we created that 1st math baby. We brought Mac into a rolled adult to beauty, which was really unprecedented back then. And Ultra continues to be an incredible partner with Mac and Sephora is just a different animal.</w:t>
+      </w:r>
+    </w:p>
+    <w:p>
+      <w:pPr>
+        <w:spacing w:after="140" w:line="300"/>
+      </w:pPr>
+      <w:r>
+        <w:rPr>
+          <w:sz w:val="21"/>
+          <w:szCs w:val="21"/>
+        </w:rPr>
+        <w:t xml:space="preserve">You know, and it's all about the consumer and what do they want and what do they expect? and sitting down and, you know, just working it out, creating a very bespoke situation. So it's the same, but it's different. It is, it is, yeah. It's like we have déjà vu. And also, the consumer was asking for it, right? Yes, yeah. Listen, Mac is the everyone makeup around the world. I mean, it's a very beloved brand and, you know, she's over 40 years old, our Mac girl. And it is a matter of, you know, the consumer still wants it and where there's a demand, right? We want to really meet the consumer where they are. So, speaking of where they are, so now you're in Sephora, okay? And I'm curious, who are you reaching at Sephora that you haven't reached before? Now, for beauty lovers, it makes sense for simple, you know, to find magic Sephora.</w:t>
+      </w:r>
+    </w:p>
+    <w:p>
+      <w:pPr>
+        <w:spacing w:after="140" w:line="300"/>
+      </w:pPr>
+      <w:r>
+        <w:rPr>
+          <w:sz w:val="21"/>
+          <w:szCs w:val="21"/>
+        </w:rPr>
+        <w:t xml:space="preserve">But how did you make this launch work, you know, if you're in Sephora, I'm thinking, well, what about your other partners, too? How did you make this work for all of your partners? For us at Mac, it wasn't about launching at a retailer. Sure, for it was super important. We knew that we had a fellow, you know, the playbook that worked for both brands, but we actually made it a cultural moment. Math was founded as a cultural brand, a movement brand. So that was a big part of the work that we've done for the past, I would say, year and a half of infusing back the culture, really connecting with the consumer on a deeper level. So, for example, when we launched Sephora, our creative director, Nicola Formancietti, shot a beautiful campaign that really demonstrated not only who's who of upcoming culture, right, with Gabrielle and Quince and Blackwell and Chapel Ron, but also showed the versatility of our business.</w:t>
+      </w:r>
+    </w:p>
+    <w:p>
+      <w:pPr>
+        <w:spacing w:after="140" w:line="300"/>
+      </w:pPr>
+      <w:r>
+        <w:rPr>
+          <w:sz w:val="21"/>
+          <w:szCs w:val="21"/>
+        </w:rPr>
+        <w:t xml:space="preserve">We're not just a heavy makeup brand. We could go from bareface all the way to full glam. So showing the versatility of our amazing products, and doing it with faces that feel fresh, but also identifiable with our audience so that people actually saw somebody in that campaign that looked like them. So that was one, so smart, he comes from the fashion world, his stylist. So he's is more plugged into the culture than just, you know, our average cricket recorder. And then the other thing that changed for this launch, and for the Mac brand, I'd say over the past few years, is that we move much quicker. So, you know, when we looked at opportunities and we were launching, the brand at Sephora, literally, we were launching on a Saturday, Thursday, we were looking at Rob Rush with the traders. show, and we called him, and we were like, all right, you can come represent Mac at the Times Square store.</w:t>
+      </w:r>
+    </w:p>
+    <w:p>
+      <w:pPr>
+        <w:spacing w:after="140" w:line="300"/>
+      </w:pPr>
+      <w:r>
+        <w:rPr>
+          <w:sz w:val="21"/>
+          <w:szCs w:val="21"/>
+        </w:rPr>
+        <w:t xml:space="preserve">We shot him on a Friday. put him on a billboard. We had them come to Times Square. We had, like, massive crowds of people just, like, storming the store, storming the map space. And it was just a fun connectivity moment where people saw a Mac as, like, a new master class and how to, like, pick up quick culture and bring it into the store. We also joke, Tara and I, we don't really like to follow rules, so we didn't, like, ask anybody in Times Square, so, like, the New York City police and the Sephora security were really unhappy with them. But it worked really well. That feels very, like, odds ways, but I'd imagine a big company, you know, 45 equals around a ground, layers of approval, should be shouldn't we? you know, let's AB test, you know, this person versus that celebrity. I mean, when I heard that he was the face, it felt so he just won.</w:t>
+      </w:r>
+    </w:p>
+    <w:p>
+      <w:pPr>
+        <w:spacing w:after="140" w:line="300"/>
+      </w:pPr>
+      <w:r>
+        <w:rPr>
+          <w:sz w:val="21"/>
+          <w:szCs w:val="21"/>
+        </w:rPr>
+        <w:t xml:space="preserve">How did you get him? Very, very different for, you know, for your company. How about move in that case? You just gotta go. Yeah, yeah. And everything was huge news with Mac and Sephora. And it's really one, you know, fantastic example of how you guys are, how ELC is moving away from the old rules of retail. ELC is the quintessential American luxury house. And you're seeing massive success on social platforms like Amazon and TikTok. And that feels very, very different. Why did you decide it was time? for a luxury house to broaden its reach? And how, again, when you are deciding to go onto Amazon, deciding to go onto TikTok, how are you navigating those conversations, which I can only imagine are delicate with your other partners? They are delicate, certainly. And really, this is, we have such strong and long standing relationships with all of our retail partners.</w:t>
+      </w:r>
+    </w:p>
+    <w:p>
+      <w:pPr>
+        <w:spacing w:after="140" w:line="300"/>
+      </w:pPr>
+      <w:r>
+        <w:rPr>
+          <w:sz w:val="21"/>
+          <w:szCs w:val="21"/>
+        </w:rPr>
+        <w:t xml:space="preserve">And really, this, you know, Mr. Leonard Lauder set the tone 80 years ago, his mom, Este Lauder, set the tone 80 years ago, and then Leonard followed, and really, we don't ever lose sight of that. I mean, we're nothing without our retail partners. I mean, that's where it all that's where it all happens. And so I think that it is about being very direct and very, very clear with each other. You know, you have to have all of this really transparent communication, not easy, not always easy. Some easier than others. But I think the truth is, every retailer plays a really important role, and now more than ever, with more digital players and more social commerce, it's such an interesting ecosystem, and there's really a flywheel that we're seeing take place. And at the center of these decisions, again, it's all about the consumers. So you've got somebody that may see something on TikTok shop for the 1st time, and that's discovery.</w:t>
+      </w:r>
+    </w:p>
+    <w:p>
+      <w:pPr>
+        <w:spacing w:after="140" w:line="300"/>
+      </w:pPr>
+      <w:r>
+        <w:rPr>
+          <w:sz w:val="21"/>
+          <w:szCs w:val="21"/>
+        </w:rPr>
+        <w:t xml:space="preserve">And then they go into Sephora or Ulta or Macy's, because they want to see it touch and feel it, smell it, right? And then Amazon, they'll go and read reviews. And so it's all just very interesting the way it works. And then all is resulting in, you know, a more powerful business for everyone. It's like all boats rise. So some of these conversations are less scary than they were initially. Yeah, I think a lot of people, at least my conversations with brands, that sometimes, you know, years ago, and now it's changing to your point, they think, okay, well, if they see it here, they're gonna buy it there. And then, you know, our door is no longer relevant, where a lot of these platforms are discovery platforms or, you know, it's going to take a customer journey, it's not nearly as predictable as what people thought it was.</w:t>
+      </w:r>
+    </w:p>
+    <w:p>
+      <w:pPr>
+        <w:spacing w:after="140" w:line="300"/>
+      </w:pPr>
+      <w:r>
+        <w:rPr>
+          <w:sz w:val="21"/>
+          <w:szCs w:val="21"/>
+        </w:rPr>
+        <w:t xml:space="preserve">Yeah, that's right. I'll give you a quick example. Yeah. Clinic. Clinic has a lipstick. It's number one selling lipstick, actually. Lipstick shay in the US. Black honey. 1971, or as I say, 1971, this product was created, right? 1971. So, but it's still cool. It's a very universal product. Honey, the product's gone viral, you know, multiple times in the last 5 years. So they had a really cool social campaign, a hot influencer, and, um, they did a big TikTok shops campaign that's called Super Brand Day. So it was a 7 day campaign. Literally, when that thing popped, within 14 hours, we saw an Ulta beauty and an Amazon, like sales, you know, and you're like, oh, okay, this is how this works now. It's completely different. It a marketing lever. I mean, TikTok shops. It's just one example. But the interconnectedness of it all is very interesting.</w:t>
+      </w:r>
+    </w:p>
+    <w:p>
+      <w:pPr>
+        <w:spacing w:after="140" w:line="300"/>
+      </w:pPr>
+      <w:r>
+        <w:rPr>
+          <w:sz w:val="21"/>
+          <w:szCs w:val="21"/>
+        </w:rPr>
+        <w:t xml:space="preserve">And this is not just something that's happening in beauty, by the way. So don't be afraid, dive in, dig in. That's a really good case study, the critique one. Yeah. Mm-hmm. All right, so S.D. Lauder, S.D. Lauder Companies, has always been about luxury and brand equity. It really is, but brand is such a big piece. You have so many brands that, you know, they're very distinct. It really is about, you know, that brand equity and that loyalty people feel. How does that fit in with retail outlets like TikTok shop, like Amazon, 2 platforms that, from my point of view, they're really about speed. They're about the algorithm. I don't see brand being at this today being, you know, at the forefront of those patterns. I do protect those brands. I think you need both. So brand equity and reach are not mutually exclusive. So, for example, when we launched Bobby Brown on Amazon earlier this year, we brought the heritage of the brand, the codes of the brand that were so strong.</w:t>
+      </w:r>
+    </w:p>
+    <w:p>
+      <w:pPr>
+        <w:spacing w:after="140" w:line="300"/>
+      </w:pPr>
+      <w:r>
+        <w:rPr>
+          <w:sz w:val="21"/>
+          <w:szCs w:val="21"/>
+        </w:rPr>
+        <w:t xml:space="preserve">We wrote the hero products that we know consumerists are obsessed with or vitamin enriched space space, for example, or our foundation. But we also plated the House of Amazon, right? So today, you have to be flexible with the codes. You have to be flexible with, you know, how you're reaching that consumer. And it requires discipline, not only for you as a leader, but for your team, right? To have the agility and the knowledge to be able to navigate through each channel and connect it all. I think it also requires more flexibility. So, again, the TikTok shop, it's not just the brand people speaking to the consumer, it's the consumer speaking to us. and now showing us content about how they perceive our product or artists or what they want to see. So it's really a two-way conversation where you're servicing people in real time. Which actually, if they're out, it brings you closer to the consumer.</w:t>
+      </w:r>
+    </w:p>
+    <w:p>
+      <w:pPr>
+        <w:spacing w:after="140" w:line="300"/>
+      </w:pPr>
+      <w:r>
+        <w:rPr>
+          <w:sz w:val="21"/>
+          <w:szCs w:val="21"/>
+        </w:rPr>
+        <w:t xml:space="preserve">Yeah, it's really neat. Big shift. Yeah. The face face is great. I'm just using it for 1st time this morning. I know it's a big salary. So yeah, it is a two-way conversation. I want to return to this idea of creating in culture brand. First of all, what is it in culture brand? Can you define that for me? I either in terror or Lisa. Because I love that phrase, it feels really relevant, but I'm sure it means different things to different whatever industry you're in. Like, what does it mean to be in culture? I think it means that people want you very simply, right? To be relevant now, you have to evolve over time. You have to have a pulse to actually what's happening in the world, not just sitting in an office or in an ivory tower, actually getting out there. When my team and I travel, I mean, we distribute it in 150 countries worldwide in math.</w:t>
+      </w:r>
+    </w:p>
+    <w:p>
+      <w:pPr>
+        <w:spacing w:after="140" w:line="300"/>
+      </w:pPr>
+      <w:r>
+        <w:rPr>
+          <w:sz w:val="21"/>
+          <w:szCs w:val="21"/>
+        </w:rPr>
+        <w:t xml:space="preserve">You know, we'll go to a country like Brazil and we'll spend a week there. We'll do retail meetings, et cetera, but we're also in the culture. Who's hot? Who's up and coming? We're meeting people, we're talking. And it's not just in beauty, it's in music, it's in fashion, it's in, you know, a lot of different elements because that's when you're getting the pulse of what's happening with that local. Um, consumer and then you're bringing it from a brand, the goal brand level too. So having that connectivity is key. And I think for us, a lot of companies, our biggest asset has always been our brands. You know, it's like the heartbeat of our company. But, you know, the other piece is that our, now our brands have evolved. We have 6 brands that we call it the billion dollar club, that they've reached over a $1000000000 in sales, and we have another one about to hit it with the ordinary.</w:t>
+      </w:r>
+    </w:p>
+    <w:p>
+      <w:pPr>
+        <w:spacing w:after="140" w:line="300"/>
+      </w:pPr>
+      <w:r>
+        <w:rPr>
+          <w:sz w:val="21"/>
+          <w:szCs w:val="21"/>
+        </w:rPr>
+        <w:t xml:space="preserve">But, you know, we could have a whole conversation all day about branding. But I think, you know, one of the things that is most important today is you could be an amazing global brand, but if you don't move with speed and you don't move with agility, like a startup, you're not gonna, with the customer, because the attention is bad is so tight at this point. Yeah, that's what I'm hearing. The brands that used to have the luxury or the, it was part of their, their whole ecos was taking time. Now things are, yeah, accelerated. Yeah. Yeah. I mean, I don't know. I also just add on, like, something is no longer. It's not just about an incredible, you know, marketing campaign or about product innovation. It's pricing, it's putting things in the right channel. you know, how you merchandising it on a shelf. I mean, it's tremendous.</w:t>
+      </w:r>
+    </w:p>
+    <w:p>
+      <w:pPr>
+        <w:spacing w:after="140" w:line="300"/>
+      </w:pPr>
+      <w:r>
+        <w:rPr>
+          <w:sz w:val="21"/>
+          <w:szCs w:val="21"/>
+        </w:rPr>
+        <w:t xml:space="preserve">It's tremendously detailed. And one great example of this is one of our brands, Killian Paris, which is a fragrance brand, which happens to be the fastest growing brand at the Estelar companies right now. It's a very ultra luxe fragrance. I mean, this is, you know, 400 to, or 350 to $450, which is not in everybody's price range. And so but the brand is so cool. Lisa talked about cool, we talk about that a lot. You can't really make something cool. It's, it's got to sort of be, be in the, in the bones of the brand. And we needed to reach a younger consumer and we needed to reach more, even though we have this vast growth. So Kilian created the cocktails collection, which is $150 price point. So it's there, it launched, it had an early lead on Sephora. And in 72 hours, it completely blew out at support.com.</w:t>
+      </w:r>
+    </w:p>
+    <w:p>
+      <w:pPr>
+        <w:spacing w:after="140" w:line="300"/>
+      </w:pPr>
+      <w:r>
+        <w:rPr>
+          <w:sz w:val="21"/>
+          <w:szCs w:val="21"/>
+        </w:rPr>
+        <w:t xml:space="preserve">And you're like, oh, wow, okay, well, I guess we nailed that one, because you're offering something that's already cool, really out there, but you're going after it. You know, in a different pricing to your, you know, targeting a different audience. Yeah, and fortune Z, right? We made it really for them. So it's another good thing. what's happening in fragrance culture right now, which is just absolutely phenomenal. Yeah, right. So just responding to the culture in that way, and also, I've seen some of the fragrances in that phrase range, and they're very much reflective of ingredient trends. Yeah, it just the formats that people like to wear fragrance. So it's a little, kind of goes back to what you were saying about that two-way conversation. You have to listen. Yeah. So, before we leave the stage, I really want to talk about your leadership styles. We both have had incredible careers in beauty.</w:t>
+      </w:r>
+    </w:p>
+    <w:p>
+      <w:pPr>
+        <w:spacing w:after="140" w:line="300"/>
+      </w:pPr>
+      <w:r>
+        <w:rPr>
+          <w:sz w:val="21"/>
+          <w:szCs w:val="21"/>
+        </w:rPr>
+        <w:t xml:space="preserve">I'm curious what leadership skills you reach for in your toolbox every day. Well, I think it's interesting, and Tara and I both come from similar backgrounds in the sense that we're both self made. We both, you know, had some really dynamic experiences. For me, I've always had this challenger spirit. Um, where you're pushing your team to really think differently, more bold, um, and really never take no for an answer. But I think when I left, big corporate for the 1st time, went into private property, and startup is when I kind of really learned what that meant in real time. So what does it mean that, you know, you have a team that does 6 jobs and everyone needs to do it really, really well because you don't have the flexibility to, you know, overhire, hire the wrong person, or, you know, every dollar that you're spending is scrutinized, because that's all it needs to work that much harder for you.</w:t>
+      </w:r>
+    </w:p>
+    <w:p>
+      <w:pPr>
+        <w:spacing w:after="140" w:line="300"/>
+      </w:pPr>
+      <w:r>
+        <w:rPr>
+          <w:sz w:val="21"/>
+          <w:szCs w:val="21"/>
+        </w:rPr>
+        <w:t xml:space="preserve">Um, so having that owner of mentality, um, was really important for me to learn, especially in, you know, startup and product equity, but then bringing that back to a big company. That's actually where the fund began. So, knowing how to navigate a big company, but challenging them, right? To think faster, bolder, quicker, breaking down walls, giving the teams freedom to make mistakes, and really not asking for permission. I think the great example at math was raw. we just do it. And our results show it. So, it's working, and it also infuses the culture and the company that's exciting for, you know, everyone to work at. They're hungry and their reward for it. So I would say that's the fun of being a challenger. So you feel like the cuffs are off. Yeah, I think, yeah, you. You know, that's the great thing about you. It's like, okay, let's just unleash and see what happens.</w:t>
+      </w:r>
+    </w:p>
+    <w:p>
+      <w:pPr>
+        <w:spacing w:after="140" w:line="300"/>
+      </w:pPr>
+      <w:r>
+        <w:rPr>
+          <w:sz w:val="21"/>
+          <w:szCs w:val="21"/>
+        </w:rPr>
+        <w:t xml:space="preserve">Exactly. Yeah, yeah. So for me, I'm a retailer, I'm a veteran retailer. My 1st job, when I was 15 years old, was in retail, and that was the case until 2020. Um, and when I jumped, you know, onto the other side, so so much of my leadership really is about, it's coming from that place. I mean, on a retailer, but even more significantly, I'm a merchant. So that's how I think about everything. And it's very, um, it's helpful with leading my team because they know, like, we're going to think about things a little bit differently. I'm not going to think about things as, you know, a manufacturer that has 26 brands in 150 countries and blah, blah, blah. which is all very impressive and lovely, but you gotta get closer to the consumer. So we're really always kind of, like, head down on that stuff.</w:t>
+      </w:r>
+    </w:p>
+    <w:p>
+      <w:pPr>
+        <w:spacing w:after="140" w:line="300"/>
+      </w:pPr>
+      <w:r>
+        <w:rPr>
+          <w:sz w:val="21"/>
+          <w:szCs w:val="21"/>
+        </w:rPr>
+        <w:t xml:space="preserve">I think also, the directness. I am brutally direct and wrapped in a southern accent, it does help sometimes, but it's just, you've gotta shoot people straight, and sometimes it is not cute. And, you know, you just have to be very direct. And I think that that's an important thing to teach people and to really like leave by example that you got to. Probably save some time. Oh, it does. We don't have time for the other stuff right now. If you're talking about, like, having it in a retail or being on the early side, like, you're also consumer focused. Like your consumers are 2 different kinds of consumers. The consumer that's buying the, you know, advanced night repair, but you're also thinking about your retailers or the customers. Yeah. Yeah, you can flex and think about all the people who are involved in work. Yeah, yeah.</w:t>
+      </w:r>
+    </w:p>
+    <w:p>
+      <w:pPr>
+        <w:spacing w:after="140" w:line="300"/>
+      </w:pPr>
+      <w:r>
+        <w:rPr>
+          <w:sz w:val="21"/>
+          <w:szCs w:val="21"/>
+        </w:rPr>
+        <w:t xml:space="preserve">Because at the end of the day, it is all about the consumer that's buying the advance, not repair, but you have to, you know, be able to connect and really integrate with all of your retail partners, on how can you optimize that? What's their strategy? What's ultra strategy? What's Sephora? Macy's strategy, and then what's ours? And the sweet spot really is when you can connect all those dots, which I think is, for me, I don't know any other way to do it. I think also, it's just not that complicated. You have a job like this, you know, these jobs, we can do this by ourselves, I mean, nobody can. If you think you can, that's a fool's errand. I mean you cannot. So it's a matter of, like, get just get a few smart people in the room. Let's like nail this thing, and decide exactly what needs to happen, and let's move.</w:t>
+      </w:r>
+    </w:p>
+    <w:p>
+      <w:pPr>
+        <w:spacing w:after="140" w:line="300"/>
+      </w:pPr>
+      <w:r>
+        <w:rPr>
+          <w:sz w:val="21"/>
+          <w:szCs w:val="21"/>
+        </w:rPr>
+        <w:t xml:space="preserve">And I always say, lots of phone to friend for me. Um, I do not hesitate. You have to use your network and it's, you know, when people are younger in their career, they don't know that that's okay. It feels like a weakness. Like, I can't do it for, like, no, no. No, no. Call the smart ones. Call the smart ones. Um, and and you just don't have to have all the answers yourself. Yeah. You just don't. That is great advice. So I think this conference is probably the best, you know, that's the best word of advice to lead people on. Network, phone a friend, you don't need to know all the answers, you know, being on each other. I think that's really served your company well, seeing your relationship with who of you and how, what you guys have built in such a short amount of time is really impressive and very inspiring.</w:t>
+      </w:r>
+    </w:p>
+    <w:p>
+      <w:pPr>
+        <w:spacing w:after="140" w:line="300"/>
+      </w:pPr>
+      <w:r>
+        <w:rPr>
+          <w:sz w:val="21"/>
+          <w:szCs w:val="21"/>
+        </w:rPr>
+        <w:t xml:space="preserve">Thank you. And you can both very much. Thank you very much, everyone, for your attention. All right. Thank you.</w:t>
+      </w:r>
+    </w:p>
     <w:sectPr>
       <w:footerReference w:type="default" r:id="rId7"/>
       <w:pgSz w:w="12240" w:h="15840" w:orient="portrait"/>
@@ -10141,7 +13300,7 @@
         <w:sz w:val="16"/>
         <w:szCs w:val="16"/>
       </w:rPr>
-      <w:t xml:space="preserve">Shoptalk Session Notes  |  Page </w:t>
+      <w:t xml:space="preserve">Shoptalk Fall 2026 (Nashville) Session Notes  |  Page </w:t>
     </w:r>
     <w:r>
       <w:rPr>

</xml_diff>